<commit_message>
Bibliografia con enlaces clicables
</commit_message>
<xml_diff>
--- a/SmartPowerRD_Investigacion_CristianCarrera_2024-1932.docx
+++ b/SmartPowerRD_Investigacion_CristianCarrera_2024-1932.docx
@@ -759,7 +759,7 @@
         </w:pBdr>
         <w:spacing w:before="360" w:after="180"/>
       </w:pPr>
-      <w:bookmarkStart w:id="0" w:name="_Toc236974924"/>
+      <w:bookmarkStart w:id="0" w:name="_Toc236976754"/>
       <w:r>
         <w:t>Índice de contenido</w:t>
       </w:r>
@@ -768,7 +768,7 @@
     <w:sdt>
       <w:sdtPr>
         <w:alias w:val="Tabla de contenido"/>
-        <w:id w:val="-1360506671"/>
+        <w:id w:val="1577941326"/>
       </w:sdtPr>
       <w:sdtEndPr/>
       <w:sdtContent>
@@ -797,7 +797,7 @@
           <w:r>
             <w:fldChar w:fldCharType="separate"/>
           </w:r>
-          <w:hyperlink w:anchor="_Toc236974924" w:history="1">
+          <w:hyperlink w:anchor="_Toc236976754" w:history="1">
             <w:r>
               <w:rPr>
                 <w:rStyle w:val="Hyperlink"/>
@@ -821,7 +821,7 @@
               <w:rPr>
                 <w:noProof/>
               </w:rPr>
-              <w:instrText xml:space="preserve"> PAGEREF _Toc236974924 \h </w:instrText>
+              <w:instrText xml:space="preserve"> PAGEREF _Toc236976754 \h </w:instrText>
             </w:r>
             <w:r>
               <w:rPr>
@@ -864,7 +864,7 @@
               <w14:ligatures w14:val="standardContextual"/>
             </w:rPr>
           </w:pPr>
-          <w:hyperlink w:anchor="_Toc236974925" w:history="1">
+          <w:hyperlink w:anchor="_Toc236976755" w:history="1">
             <w:r>
               <w:rPr>
                 <w:rStyle w:val="Hyperlink"/>
@@ -888,7 +888,7 @@
               <w:rPr>
                 <w:noProof/>
               </w:rPr>
-              <w:instrText xml:space="preserve"> PAGEREF _Toc236974925 \h </w:instrText>
+              <w:instrText xml:space="preserve"> PAGEREF _Toc236976755 \h </w:instrText>
             </w:r>
             <w:r>
               <w:rPr>
@@ -931,7 +931,7 @@
               <w14:ligatures w14:val="standardContextual"/>
             </w:rPr>
           </w:pPr>
-          <w:hyperlink w:anchor="_Toc236974926" w:history="1">
+          <w:hyperlink w:anchor="_Toc236976756" w:history="1">
             <w:r>
               <w:rPr>
                 <w:rStyle w:val="Hyperlink"/>
@@ -955,7 +955,7 @@
               <w:rPr>
                 <w:noProof/>
               </w:rPr>
-              <w:instrText xml:space="preserve"> PAGEREF _Toc236974926 \h </w:instrText>
+              <w:instrText xml:space="preserve"> PAGEREF _Toc236976756 \h </w:instrText>
             </w:r>
             <w:r>
               <w:rPr>
@@ -998,7 +998,7 @@
               <w14:ligatures w14:val="standardContextual"/>
             </w:rPr>
           </w:pPr>
-          <w:hyperlink w:anchor="_Toc236974927" w:history="1">
+          <w:hyperlink w:anchor="_Toc236976757" w:history="1">
             <w:r>
               <w:rPr>
                 <w:rStyle w:val="Hyperlink"/>
@@ -1022,7 +1022,7 @@
               <w:rPr>
                 <w:noProof/>
               </w:rPr>
-              <w:instrText xml:space="preserve"> PAGEREF _Toc236974927 \h </w:instrText>
+              <w:instrText xml:space="preserve"> PAGEREF _Toc236976757 \h </w:instrText>
             </w:r>
             <w:r>
               <w:rPr>
@@ -1065,7 +1065,7 @@
               <w14:ligatures w14:val="standardContextual"/>
             </w:rPr>
           </w:pPr>
-          <w:hyperlink w:anchor="_Toc236974928" w:history="1">
+          <w:hyperlink w:anchor="_Toc236976758" w:history="1">
             <w:r>
               <w:rPr>
                 <w:rStyle w:val="Hyperlink"/>
@@ -1089,7 +1089,7 @@
               <w:rPr>
                 <w:noProof/>
               </w:rPr>
-              <w:instrText xml:space="preserve"> PAGEREF _Toc236974928 \h </w:instrText>
+              <w:instrText xml:space="preserve"> PAGEREF _Toc236976758 \h </w:instrText>
             </w:r>
             <w:r>
               <w:rPr>
@@ -1132,7 +1132,7 @@
               <w14:ligatures w14:val="standardContextual"/>
             </w:rPr>
           </w:pPr>
-          <w:hyperlink w:anchor="_Toc236974929" w:history="1">
+          <w:hyperlink w:anchor="_Toc236976759" w:history="1">
             <w:r>
               <w:rPr>
                 <w:rStyle w:val="Hyperlink"/>
@@ -1156,7 +1156,7 @@
               <w:rPr>
                 <w:noProof/>
               </w:rPr>
-              <w:instrText xml:space="preserve"> PAGEREF _Toc236974929 \h </w:instrText>
+              <w:instrText xml:space="preserve"> PAGEREF _Toc236976759 \h </w:instrText>
             </w:r>
             <w:r>
               <w:rPr>
@@ -1199,7 +1199,7 @@
               <w14:ligatures w14:val="standardContextual"/>
             </w:rPr>
           </w:pPr>
-          <w:hyperlink w:anchor="_Toc236974930" w:history="1">
+          <w:hyperlink w:anchor="_Toc236976760" w:history="1">
             <w:r>
               <w:rPr>
                 <w:rStyle w:val="Hyperlink"/>
@@ -1223,7 +1223,7 @@
               <w:rPr>
                 <w:noProof/>
               </w:rPr>
-              <w:instrText xml:space="preserve"> PAGEREF _Toc236974930 \h </w:instrText>
+              <w:instrText xml:space="preserve"> PAGEREF _Toc236976760 \h </w:instrText>
             </w:r>
             <w:r>
               <w:rPr>
@@ -1266,7 +1266,7 @@
               <w14:ligatures w14:val="standardContextual"/>
             </w:rPr>
           </w:pPr>
-          <w:hyperlink w:anchor="_Toc236974931" w:history="1">
+          <w:hyperlink w:anchor="_Toc236976761" w:history="1">
             <w:r>
               <w:rPr>
                 <w:rStyle w:val="Hyperlink"/>
@@ -1290,7 +1290,7 @@
               <w:rPr>
                 <w:noProof/>
               </w:rPr>
-              <w:instrText xml:space="preserve"> PAGEREF _Toc236974931 \h </w:instrText>
+              <w:instrText xml:space="preserve"> PAGEREF _Toc236976761 \h </w:instrText>
             </w:r>
             <w:r>
               <w:rPr>
@@ -1333,7 +1333,7 @@
               <w14:ligatures w14:val="standardContextual"/>
             </w:rPr>
           </w:pPr>
-          <w:hyperlink w:anchor="_Toc236974932" w:history="1">
+          <w:hyperlink w:anchor="_Toc236976762" w:history="1">
             <w:r>
               <w:rPr>
                 <w:rStyle w:val="Hyperlink"/>
@@ -1357,7 +1357,7 @@
               <w:rPr>
                 <w:noProof/>
               </w:rPr>
-              <w:instrText xml:space="preserve"> PAGEREF _Toc236974932 \h </w:instrText>
+              <w:instrText xml:space="preserve"> PAGEREF _Toc236976762 \h </w:instrText>
             </w:r>
             <w:r>
               <w:rPr>
@@ -1400,7 +1400,7 @@
               <w14:ligatures w14:val="standardContextual"/>
             </w:rPr>
           </w:pPr>
-          <w:hyperlink w:anchor="_Toc236974933" w:history="1">
+          <w:hyperlink w:anchor="_Toc236976763" w:history="1">
             <w:r>
               <w:rPr>
                 <w:rStyle w:val="Hyperlink"/>
@@ -1424,7 +1424,7 @@
               <w:rPr>
                 <w:noProof/>
               </w:rPr>
-              <w:instrText xml:space="preserve"> PAGEREF _Toc236974933 \h </w:instrText>
+              <w:instrText xml:space="preserve"> PAGEREF _Toc236976763 \h </w:instrText>
             </w:r>
             <w:r>
               <w:rPr>
@@ -1467,7 +1467,7 @@
               <w14:ligatures w14:val="standardContextual"/>
             </w:rPr>
           </w:pPr>
-          <w:hyperlink w:anchor="_Toc236974934" w:history="1">
+          <w:hyperlink w:anchor="_Toc236976764" w:history="1">
             <w:r>
               <w:rPr>
                 <w:rStyle w:val="Hyperlink"/>
@@ -1491,7 +1491,7 @@
               <w:rPr>
                 <w:noProof/>
               </w:rPr>
-              <w:instrText xml:space="preserve"> PAGEREF _Toc236974934 \h </w:instrText>
+              <w:instrText xml:space="preserve"> PAGEREF _Toc236976764 \h </w:instrText>
             </w:r>
             <w:r>
               <w:rPr>
@@ -1534,7 +1534,7 @@
               <w14:ligatures w14:val="standardContextual"/>
             </w:rPr>
           </w:pPr>
-          <w:hyperlink w:anchor="_Toc236974935" w:history="1">
+          <w:hyperlink w:anchor="_Toc236976765" w:history="1">
             <w:r>
               <w:rPr>
                 <w:rStyle w:val="Hyperlink"/>
@@ -1558,7 +1558,7 @@
               <w:rPr>
                 <w:noProof/>
               </w:rPr>
-              <w:instrText xml:space="preserve"> PAGEREF _Toc236974935 \h </w:instrText>
+              <w:instrText xml:space="preserve"> PAGEREF _Toc236976765 \h </w:instrText>
             </w:r>
             <w:r>
               <w:rPr>
@@ -1601,7 +1601,7 @@
               <w14:ligatures w14:val="standardContextual"/>
             </w:rPr>
           </w:pPr>
-          <w:hyperlink w:anchor="_Toc236974936" w:history="1">
+          <w:hyperlink w:anchor="_Toc236976766" w:history="1">
             <w:r>
               <w:rPr>
                 <w:rStyle w:val="Hyperlink"/>
@@ -1625,7 +1625,7 @@
               <w:rPr>
                 <w:noProof/>
               </w:rPr>
-              <w:instrText xml:space="preserve"> PAGEREF _Toc236974936 \h </w:instrText>
+              <w:instrText xml:space="preserve"> PAGEREF _Toc236976766 \h </w:instrText>
             </w:r>
             <w:r>
               <w:rPr>
@@ -1668,7 +1668,7 @@
               <w14:ligatures w14:val="standardContextual"/>
             </w:rPr>
           </w:pPr>
-          <w:hyperlink w:anchor="_Toc236974937" w:history="1">
+          <w:hyperlink w:anchor="_Toc236976767" w:history="1">
             <w:r>
               <w:rPr>
                 <w:rStyle w:val="Hyperlink"/>
@@ -1692,7 +1692,7 @@
               <w:rPr>
                 <w:noProof/>
               </w:rPr>
-              <w:instrText xml:space="preserve"> PAGEREF _Toc236974937 \h </w:instrText>
+              <w:instrText xml:space="preserve"> PAGEREF _Toc236976767 \h </w:instrText>
             </w:r>
             <w:r>
               <w:rPr>
@@ -1735,7 +1735,7 @@
               <w14:ligatures w14:val="standardContextual"/>
             </w:rPr>
           </w:pPr>
-          <w:hyperlink w:anchor="_Toc236974938" w:history="1">
+          <w:hyperlink w:anchor="_Toc236976768" w:history="1">
             <w:r>
               <w:rPr>
                 <w:rStyle w:val="Hyperlink"/>
@@ -1759,7 +1759,7 @@
               <w:rPr>
                 <w:noProof/>
               </w:rPr>
-              <w:instrText xml:space="preserve"> PAGEREF _Toc236974938 \h </w:instrText>
+              <w:instrText xml:space="preserve"> PAGEREF _Toc236976768 \h </w:instrText>
             </w:r>
             <w:r>
               <w:rPr>
@@ -1802,7 +1802,7 @@
               <w14:ligatures w14:val="standardContextual"/>
             </w:rPr>
           </w:pPr>
-          <w:hyperlink w:anchor="_Toc236974939" w:history="1">
+          <w:hyperlink w:anchor="_Toc236976769" w:history="1">
             <w:r>
               <w:rPr>
                 <w:rStyle w:val="Hyperlink"/>
@@ -1826,7 +1826,7 @@
               <w:rPr>
                 <w:noProof/>
               </w:rPr>
-              <w:instrText xml:space="preserve"> PAGEREF _Toc236974939 \h </w:instrText>
+              <w:instrText xml:space="preserve"> PAGEREF _Toc236976769 \h </w:instrText>
             </w:r>
             <w:r>
               <w:rPr>
@@ -1869,7 +1869,7 @@
               <w14:ligatures w14:val="standardContextual"/>
             </w:rPr>
           </w:pPr>
-          <w:hyperlink w:anchor="_Toc236974940" w:history="1">
+          <w:hyperlink w:anchor="_Toc236976770" w:history="1">
             <w:r>
               <w:rPr>
                 <w:rStyle w:val="Hyperlink"/>
@@ -1893,7 +1893,7 @@
               <w:rPr>
                 <w:noProof/>
               </w:rPr>
-              <w:instrText xml:space="preserve"> PAGEREF _Toc236974940 \h </w:instrText>
+              <w:instrText xml:space="preserve"> PAGEREF _Toc236976770 \h </w:instrText>
             </w:r>
             <w:r>
               <w:rPr>
@@ -1936,7 +1936,7 @@
               <w14:ligatures w14:val="standardContextual"/>
             </w:rPr>
           </w:pPr>
-          <w:hyperlink w:anchor="_Toc236974941" w:history="1">
+          <w:hyperlink w:anchor="_Toc236976771" w:history="1">
             <w:r>
               <w:rPr>
                 <w:rStyle w:val="Hyperlink"/>
@@ -1960,7 +1960,7 @@
               <w:rPr>
                 <w:noProof/>
               </w:rPr>
-              <w:instrText xml:space="preserve"> PAGEREF _Toc236974941 \h </w:instrText>
+              <w:instrText xml:space="preserve"> PAGEREF _Toc236976771 \h </w:instrText>
             </w:r>
             <w:r>
               <w:rPr>
@@ -2003,7 +2003,7 @@
               <w14:ligatures w14:val="standardContextual"/>
             </w:rPr>
           </w:pPr>
-          <w:hyperlink w:anchor="_Toc236974942" w:history="1">
+          <w:hyperlink w:anchor="_Toc236976772" w:history="1">
             <w:r>
               <w:rPr>
                 <w:rStyle w:val="Hyperlink"/>
@@ -2027,7 +2027,7 @@
               <w:rPr>
                 <w:noProof/>
               </w:rPr>
-              <w:instrText xml:space="preserve"> PAGEREF _Toc236974942 \h </w:instrText>
+              <w:instrText xml:space="preserve"> PAGEREF _Toc236976772 \h </w:instrText>
             </w:r>
             <w:r>
               <w:rPr>
@@ -2070,7 +2070,7 @@
               <w14:ligatures w14:val="standardContextual"/>
             </w:rPr>
           </w:pPr>
-          <w:hyperlink w:anchor="_Toc236974943" w:history="1">
+          <w:hyperlink w:anchor="_Toc236976773" w:history="1">
             <w:r>
               <w:rPr>
                 <w:rStyle w:val="Hyperlink"/>
@@ -2094,7 +2094,7 @@
               <w:rPr>
                 <w:noProof/>
               </w:rPr>
-              <w:instrText xml:space="preserve"> PAGEREF _Toc236974943 \h </w:instrText>
+              <w:instrText xml:space="preserve"> PAGEREF _Toc236976773 \h </w:instrText>
             </w:r>
             <w:r>
               <w:rPr>
@@ -2137,7 +2137,7 @@
               <w14:ligatures w14:val="standardContextual"/>
             </w:rPr>
           </w:pPr>
-          <w:hyperlink w:anchor="_Toc236974944" w:history="1">
+          <w:hyperlink w:anchor="_Toc236976774" w:history="1">
             <w:r>
               <w:rPr>
                 <w:rStyle w:val="Hyperlink"/>
@@ -2161,7 +2161,7 @@
               <w:rPr>
                 <w:noProof/>
               </w:rPr>
-              <w:instrText xml:space="preserve"> PAGEREF _Toc236974944 \h </w:instrText>
+              <w:instrText xml:space="preserve"> PAGEREF _Toc236976774 \h </w:instrText>
             </w:r>
             <w:r>
               <w:rPr>
@@ -2204,7 +2204,7 @@
               <w14:ligatures w14:val="standardContextual"/>
             </w:rPr>
           </w:pPr>
-          <w:hyperlink w:anchor="_Toc236974945" w:history="1">
+          <w:hyperlink w:anchor="_Toc236976775" w:history="1">
             <w:r>
               <w:rPr>
                 <w:rStyle w:val="Hyperlink"/>
@@ -2228,7 +2228,7 @@
               <w:rPr>
                 <w:noProof/>
               </w:rPr>
-              <w:instrText xml:space="preserve"> PAGEREF _Toc236974945 \h </w:instrText>
+              <w:instrText xml:space="preserve"> PAGEREF _Toc236976775 \h </w:instrText>
             </w:r>
             <w:r>
               <w:rPr>
@@ -2271,7 +2271,7 @@
               <w14:ligatures w14:val="standardContextual"/>
             </w:rPr>
           </w:pPr>
-          <w:hyperlink w:anchor="_Toc236974946" w:history="1">
+          <w:hyperlink w:anchor="_Toc236976776" w:history="1">
             <w:r>
               <w:rPr>
                 <w:rStyle w:val="Hyperlink"/>
@@ -2295,7 +2295,7 @@
               <w:rPr>
                 <w:noProof/>
               </w:rPr>
-              <w:instrText xml:space="preserve"> PAGEREF _Toc236974946 \h </w:instrText>
+              <w:instrText xml:space="preserve"> PAGEREF _Toc236976776 \h </w:instrText>
             </w:r>
             <w:r>
               <w:rPr>
@@ -2338,7 +2338,7 @@
               <w14:ligatures w14:val="standardContextual"/>
             </w:rPr>
           </w:pPr>
-          <w:hyperlink w:anchor="_Toc236974947" w:history="1">
+          <w:hyperlink w:anchor="_Toc236976777" w:history="1">
             <w:r>
               <w:rPr>
                 <w:rStyle w:val="Hyperlink"/>
@@ -2362,7 +2362,7 @@
               <w:rPr>
                 <w:noProof/>
               </w:rPr>
-              <w:instrText xml:space="preserve"> PAGEREF _Toc236974947 \h </w:instrText>
+              <w:instrText xml:space="preserve"> PAGEREF _Toc236976777 \h </w:instrText>
             </w:r>
             <w:r>
               <w:rPr>
@@ -2405,7 +2405,7 @@
               <w14:ligatures w14:val="standardContextual"/>
             </w:rPr>
           </w:pPr>
-          <w:hyperlink w:anchor="_Toc236974948" w:history="1">
+          <w:hyperlink w:anchor="_Toc236976778" w:history="1">
             <w:r>
               <w:rPr>
                 <w:rStyle w:val="Hyperlink"/>
@@ -2429,7 +2429,7 @@
               <w:rPr>
                 <w:noProof/>
               </w:rPr>
-              <w:instrText xml:space="preserve"> PAGEREF _Toc236974948 \h </w:instrText>
+              <w:instrText xml:space="preserve"> PAGEREF _Toc236976778 \h </w:instrText>
             </w:r>
             <w:r>
               <w:rPr>
@@ -2472,7 +2472,7 @@
               <w14:ligatures w14:val="standardContextual"/>
             </w:rPr>
           </w:pPr>
-          <w:hyperlink w:anchor="_Toc236974949" w:history="1">
+          <w:hyperlink w:anchor="_Toc236976779" w:history="1">
             <w:r>
               <w:rPr>
                 <w:rStyle w:val="Hyperlink"/>
@@ -2496,7 +2496,7 @@
               <w:rPr>
                 <w:noProof/>
               </w:rPr>
-              <w:instrText xml:space="preserve"> PAGEREF _Toc236974949 \h </w:instrText>
+              <w:instrText xml:space="preserve"> PAGEREF _Toc236976779 \h </w:instrText>
             </w:r>
             <w:r>
               <w:rPr>
@@ -2539,7 +2539,7 @@
               <w14:ligatures w14:val="standardContextual"/>
             </w:rPr>
           </w:pPr>
-          <w:hyperlink w:anchor="_Toc236974950" w:history="1">
+          <w:hyperlink w:anchor="_Toc236976780" w:history="1">
             <w:r>
               <w:rPr>
                 <w:rStyle w:val="Hyperlink"/>
@@ -2563,7 +2563,7 @@
               <w:rPr>
                 <w:noProof/>
               </w:rPr>
-              <w:instrText xml:space="preserve"> PAGEREF _Toc236974950 \h </w:instrText>
+              <w:instrText xml:space="preserve"> PAGEREF _Toc236976780 \h </w:instrText>
             </w:r>
             <w:r>
               <w:rPr>
@@ -2606,7 +2606,7 @@
               <w14:ligatures w14:val="standardContextual"/>
             </w:rPr>
           </w:pPr>
-          <w:hyperlink w:anchor="_Toc236974951" w:history="1">
+          <w:hyperlink w:anchor="_Toc236976781" w:history="1">
             <w:r>
               <w:rPr>
                 <w:rStyle w:val="Hyperlink"/>
@@ -2630,7 +2630,7 @@
               <w:rPr>
                 <w:noProof/>
               </w:rPr>
-              <w:instrText xml:space="preserve"> PAGEREF _Toc236974951 \h </w:instrText>
+              <w:instrText xml:space="preserve"> PAGEREF _Toc236976781 \h </w:instrText>
             </w:r>
             <w:r>
               <w:rPr>
@@ -2673,7 +2673,7 @@
               <w14:ligatures w14:val="standardContextual"/>
             </w:rPr>
           </w:pPr>
-          <w:hyperlink w:anchor="_Toc236974952" w:history="1">
+          <w:hyperlink w:anchor="_Toc236976782" w:history="1">
             <w:r>
               <w:rPr>
                 <w:rStyle w:val="Hyperlink"/>
@@ -2697,7 +2697,7 @@
               <w:rPr>
                 <w:noProof/>
               </w:rPr>
-              <w:instrText xml:space="preserve"> PAGEREF _Toc236974952 \h </w:instrText>
+              <w:instrText xml:space="preserve"> PAGEREF _Toc236976782 \h </w:instrText>
             </w:r>
             <w:r>
               <w:rPr>
@@ -2740,7 +2740,7 @@
               <w14:ligatures w14:val="standardContextual"/>
             </w:rPr>
           </w:pPr>
-          <w:hyperlink w:anchor="_Toc236974953" w:history="1">
+          <w:hyperlink w:anchor="_Toc236976783" w:history="1">
             <w:r>
               <w:rPr>
                 <w:rStyle w:val="Hyperlink"/>
@@ -2764,7 +2764,7 @@
               <w:rPr>
                 <w:noProof/>
               </w:rPr>
-              <w:instrText xml:space="preserve"> PAGEREF _Toc236974953 \h </w:instrText>
+              <w:instrText xml:space="preserve"> PAGEREF _Toc236976783 \h </w:instrText>
             </w:r>
             <w:r>
               <w:rPr>
@@ -2807,7 +2807,7 @@
               <w14:ligatures w14:val="standardContextual"/>
             </w:rPr>
           </w:pPr>
-          <w:hyperlink w:anchor="_Toc236974954" w:history="1">
+          <w:hyperlink w:anchor="_Toc236976784" w:history="1">
             <w:r>
               <w:rPr>
                 <w:rStyle w:val="Hyperlink"/>
@@ -2831,7 +2831,7 @@
               <w:rPr>
                 <w:noProof/>
               </w:rPr>
-              <w:instrText xml:space="preserve"> PAGEREF _Toc236974954 \h </w:instrText>
+              <w:instrText xml:space="preserve"> PAGEREF _Toc236976784 \h </w:instrText>
             </w:r>
             <w:r>
               <w:rPr>
@@ -2874,7 +2874,7 @@
               <w14:ligatures w14:val="standardContextual"/>
             </w:rPr>
           </w:pPr>
-          <w:hyperlink w:anchor="_Toc236974955" w:history="1">
+          <w:hyperlink w:anchor="_Toc236976785" w:history="1">
             <w:r>
               <w:rPr>
                 <w:rStyle w:val="Hyperlink"/>
@@ -2898,7 +2898,7 @@
               <w:rPr>
                 <w:noProof/>
               </w:rPr>
-              <w:instrText xml:space="preserve"> PAGEREF _Toc236974955 \h </w:instrText>
+              <w:instrText xml:space="preserve"> PAGEREF _Toc236976785 \h </w:instrText>
             </w:r>
             <w:r>
               <w:rPr>
@@ -2941,7 +2941,7 @@
               <w14:ligatures w14:val="standardContextual"/>
             </w:rPr>
           </w:pPr>
-          <w:hyperlink w:anchor="_Toc236974956" w:history="1">
+          <w:hyperlink w:anchor="_Toc236976786" w:history="1">
             <w:r>
               <w:rPr>
                 <w:rStyle w:val="Hyperlink"/>
@@ -2965,7 +2965,7 @@
               <w:rPr>
                 <w:noProof/>
               </w:rPr>
-              <w:instrText xml:space="preserve"> PAGEREF _Toc236974956 \h </w:instrText>
+              <w:instrText xml:space="preserve"> PAGEREF _Toc236976786 \h </w:instrText>
             </w:r>
             <w:r>
               <w:rPr>
@@ -3008,7 +3008,7 @@
               <w14:ligatures w14:val="standardContextual"/>
             </w:rPr>
           </w:pPr>
-          <w:hyperlink w:anchor="_Toc236974957" w:history="1">
+          <w:hyperlink w:anchor="_Toc236976787" w:history="1">
             <w:r>
               <w:rPr>
                 <w:rStyle w:val="Hyperlink"/>
@@ -3032,7 +3032,7 @@
               <w:rPr>
                 <w:noProof/>
               </w:rPr>
-              <w:instrText xml:space="preserve"> PAGEREF _Toc236974957 \h </w:instrText>
+              <w:instrText xml:space="preserve"> PAGEREF _Toc236976787 \h </w:instrText>
             </w:r>
             <w:r>
               <w:rPr>
@@ -3075,7 +3075,7 @@
               <w14:ligatures w14:val="standardContextual"/>
             </w:rPr>
           </w:pPr>
-          <w:hyperlink w:anchor="_Toc236974958" w:history="1">
+          <w:hyperlink w:anchor="_Toc236976788" w:history="1">
             <w:r>
               <w:rPr>
                 <w:rStyle w:val="Hyperlink"/>
@@ -3099,7 +3099,7 @@
               <w:rPr>
                 <w:noProof/>
               </w:rPr>
-              <w:instrText xml:space="preserve"> PAGEREF _Toc236974958 \h </w:instrText>
+              <w:instrText xml:space="preserve"> PAGEREF _Toc236976788 \h </w:instrText>
             </w:r>
             <w:r>
               <w:rPr>
@@ -3142,7 +3142,7 @@
               <w14:ligatures w14:val="standardContextual"/>
             </w:rPr>
           </w:pPr>
-          <w:hyperlink w:anchor="_Toc236974959" w:history="1">
+          <w:hyperlink w:anchor="_Toc236976789" w:history="1">
             <w:r>
               <w:rPr>
                 <w:rStyle w:val="Hyperlink"/>
@@ -3166,7 +3166,7 @@
               <w:rPr>
                 <w:noProof/>
               </w:rPr>
-              <w:instrText xml:space="preserve"> PAGEREF _Toc236974959 \h </w:instrText>
+              <w:instrText xml:space="preserve"> PAGEREF _Toc236976789 \h </w:instrText>
             </w:r>
             <w:r>
               <w:rPr>
@@ -3209,7 +3209,7 @@
               <w14:ligatures w14:val="standardContextual"/>
             </w:rPr>
           </w:pPr>
-          <w:hyperlink w:anchor="_Toc236974960" w:history="1">
+          <w:hyperlink w:anchor="_Toc236976790" w:history="1">
             <w:r>
               <w:rPr>
                 <w:rStyle w:val="Hyperlink"/>
@@ -3233,7 +3233,7 @@
               <w:rPr>
                 <w:noProof/>
               </w:rPr>
-              <w:instrText xml:space="preserve"> PAGEREF _Toc236974960 \h </w:instrText>
+              <w:instrText xml:space="preserve"> PAGEREF _Toc236976790 \h </w:instrText>
             </w:r>
             <w:r>
               <w:rPr>
@@ -3276,7 +3276,7 @@
               <w14:ligatures w14:val="standardContextual"/>
             </w:rPr>
           </w:pPr>
-          <w:hyperlink w:anchor="_Toc236974961" w:history="1">
+          <w:hyperlink w:anchor="_Toc236976791" w:history="1">
             <w:r>
               <w:rPr>
                 <w:rStyle w:val="Hyperlink"/>
@@ -3300,7 +3300,7 @@
               <w:rPr>
                 <w:noProof/>
               </w:rPr>
-              <w:instrText xml:space="preserve"> PAGEREF _Toc236974961 \h </w:instrText>
+              <w:instrText xml:space="preserve"> PAGEREF _Toc236976791 \h </w:instrText>
             </w:r>
             <w:r>
               <w:rPr>
@@ -3343,7 +3343,7 @@
               <w14:ligatures w14:val="standardContextual"/>
             </w:rPr>
           </w:pPr>
-          <w:hyperlink w:anchor="_Toc236974962" w:history="1">
+          <w:hyperlink w:anchor="_Toc236976792" w:history="1">
             <w:r>
               <w:rPr>
                 <w:rStyle w:val="Hyperlink"/>
@@ -3367,7 +3367,7 @@
               <w:rPr>
                 <w:noProof/>
               </w:rPr>
-              <w:instrText xml:space="preserve"> PAGEREF _Toc236974962 \h </w:instrText>
+              <w:instrText xml:space="preserve"> PAGEREF _Toc236976792 \h </w:instrText>
             </w:r>
             <w:r>
               <w:rPr>
@@ -3410,7 +3410,7 @@
               <w14:ligatures w14:val="standardContextual"/>
             </w:rPr>
           </w:pPr>
-          <w:hyperlink w:anchor="_Toc236974963" w:history="1">
+          <w:hyperlink w:anchor="_Toc236976793" w:history="1">
             <w:r>
               <w:rPr>
                 <w:rStyle w:val="Hyperlink"/>
@@ -3434,7 +3434,7 @@
               <w:rPr>
                 <w:noProof/>
               </w:rPr>
-              <w:instrText xml:space="preserve"> PAGEREF _Toc236974963 \h </w:instrText>
+              <w:instrText xml:space="preserve"> PAGEREF _Toc236976793 \h </w:instrText>
             </w:r>
             <w:r>
               <w:rPr>
@@ -3477,7 +3477,7 @@
               <w14:ligatures w14:val="standardContextual"/>
             </w:rPr>
           </w:pPr>
-          <w:hyperlink w:anchor="_Toc236974964" w:history="1">
+          <w:hyperlink w:anchor="_Toc236976794" w:history="1">
             <w:r>
               <w:rPr>
                 <w:rStyle w:val="Hyperlink"/>
@@ -3501,7 +3501,7 @@
               <w:rPr>
                 <w:noProof/>
               </w:rPr>
-              <w:instrText xml:space="preserve"> PAGEREF _Toc236974964 \h </w:instrText>
+              <w:instrText xml:space="preserve"> PAGEREF _Toc236976794 \h </w:instrText>
             </w:r>
             <w:r>
               <w:rPr>
@@ -3544,7 +3544,7 @@
               <w14:ligatures w14:val="standardContextual"/>
             </w:rPr>
           </w:pPr>
-          <w:hyperlink w:anchor="_Toc236974965" w:history="1">
+          <w:hyperlink w:anchor="_Toc236976795" w:history="1">
             <w:r>
               <w:rPr>
                 <w:rStyle w:val="Hyperlink"/>
@@ -3568,7 +3568,7 @@
               <w:rPr>
                 <w:noProof/>
               </w:rPr>
-              <w:instrText xml:space="preserve"> PAGEREF _Toc236974965 \h </w:instrText>
+              <w:instrText xml:space="preserve"> PAGEREF _Toc236976795 \h </w:instrText>
             </w:r>
             <w:r>
               <w:rPr>
@@ -3611,7 +3611,7 @@
               <w14:ligatures w14:val="standardContextual"/>
             </w:rPr>
           </w:pPr>
-          <w:hyperlink w:anchor="_Toc236974966" w:history="1">
+          <w:hyperlink w:anchor="_Toc236976796" w:history="1">
             <w:r>
               <w:rPr>
                 <w:rStyle w:val="Hyperlink"/>
@@ -3635,7 +3635,7 @@
               <w:rPr>
                 <w:noProof/>
               </w:rPr>
-              <w:instrText xml:space="preserve"> PAGEREF _Toc236974966 \h </w:instrText>
+              <w:instrText xml:space="preserve"> PAGEREF _Toc236976796 \h </w:instrText>
             </w:r>
             <w:r>
               <w:rPr>
@@ -3678,7 +3678,7 @@
               <w14:ligatures w14:val="standardContextual"/>
             </w:rPr>
           </w:pPr>
-          <w:hyperlink w:anchor="_Toc236974967" w:history="1">
+          <w:hyperlink w:anchor="_Toc236976797" w:history="1">
             <w:r>
               <w:rPr>
                 <w:rStyle w:val="Hyperlink"/>
@@ -3702,7 +3702,7 @@
               <w:rPr>
                 <w:noProof/>
               </w:rPr>
-              <w:instrText xml:space="preserve"> PAGEREF _Toc236974967 \h </w:instrText>
+              <w:instrText xml:space="preserve"> PAGEREF _Toc236976797 \h </w:instrText>
             </w:r>
             <w:r>
               <w:rPr>
@@ -3745,7 +3745,7 @@
               <w14:ligatures w14:val="standardContextual"/>
             </w:rPr>
           </w:pPr>
-          <w:hyperlink w:anchor="_Toc236974968" w:history="1">
+          <w:hyperlink w:anchor="_Toc236976798" w:history="1">
             <w:r>
               <w:rPr>
                 <w:rStyle w:val="Hyperlink"/>
@@ -3769,7 +3769,7 @@
               <w:rPr>
                 <w:noProof/>
               </w:rPr>
-              <w:instrText xml:space="preserve"> PAGEREF _Toc236974968 \h </w:instrText>
+              <w:instrText xml:space="preserve"> PAGEREF _Toc236976798 \h </w:instrText>
             </w:r>
             <w:r>
               <w:rPr>
@@ -3812,7 +3812,7 @@
               <w14:ligatures w14:val="standardContextual"/>
             </w:rPr>
           </w:pPr>
-          <w:hyperlink w:anchor="_Toc236974969" w:history="1">
+          <w:hyperlink w:anchor="_Toc236976799" w:history="1">
             <w:r>
               <w:rPr>
                 <w:rStyle w:val="Hyperlink"/>
@@ -3836,7 +3836,7 @@
               <w:rPr>
                 <w:noProof/>
               </w:rPr>
-              <w:instrText xml:space="preserve"> PAGEREF _Toc236974969 \h </w:instrText>
+              <w:instrText xml:space="preserve"> PAGEREF _Toc236976799 \h </w:instrText>
             </w:r>
             <w:r>
               <w:rPr>
@@ -3879,7 +3879,7 @@
               <w14:ligatures w14:val="standardContextual"/>
             </w:rPr>
           </w:pPr>
-          <w:hyperlink w:anchor="_Toc236974970" w:history="1">
+          <w:hyperlink w:anchor="_Toc236976800" w:history="1">
             <w:r>
               <w:rPr>
                 <w:rStyle w:val="Hyperlink"/>
@@ -3903,7 +3903,7 @@
               <w:rPr>
                 <w:noProof/>
               </w:rPr>
-              <w:instrText xml:space="preserve"> PAGEREF _Toc236974970 \h </w:instrText>
+              <w:instrText xml:space="preserve"> PAGEREF _Toc236976800 \h </w:instrText>
             </w:r>
             <w:r>
               <w:rPr>
@@ -3946,7 +3946,7 @@
               <w14:ligatures w14:val="standardContextual"/>
             </w:rPr>
           </w:pPr>
-          <w:hyperlink w:anchor="_Toc236974971" w:history="1">
+          <w:hyperlink w:anchor="_Toc236976801" w:history="1">
             <w:r>
               <w:rPr>
                 <w:rStyle w:val="Hyperlink"/>
@@ -3970,7 +3970,7 @@
               <w:rPr>
                 <w:noProof/>
               </w:rPr>
-              <w:instrText xml:space="preserve"> PAGEREF _Toc236974971 \h </w:instrText>
+              <w:instrText xml:space="preserve"> PAGEREF _Toc236976801 \h </w:instrText>
             </w:r>
             <w:r>
               <w:rPr>
@@ -4013,7 +4013,7 @@
               <w14:ligatures w14:val="standardContextual"/>
             </w:rPr>
           </w:pPr>
-          <w:hyperlink w:anchor="_Toc236974972" w:history="1">
+          <w:hyperlink w:anchor="_Toc236976802" w:history="1">
             <w:r>
               <w:rPr>
                 <w:rStyle w:val="Hyperlink"/>
@@ -4037,7 +4037,7 @@
               <w:rPr>
                 <w:noProof/>
               </w:rPr>
-              <w:instrText xml:space="preserve"> PAGEREF _Toc236974972 \h </w:instrText>
+              <w:instrText xml:space="preserve"> PAGEREF _Toc236976802 \h </w:instrText>
             </w:r>
             <w:r>
               <w:rPr>
@@ -4080,7 +4080,7 @@
               <w14:ligatures w14:val="standardContextual"/>
             </w:rPr>
           </w:pPr>
-          <w:hyperlink w:anchor="_Toc236974973" w:history="1">
+          <w:hyperlink w:anchor="_Toc236976803" w:history="1">
             <w:r>
               <w:rPr>
                 <w:rStyle w:val="Hyperlink"/>
@@ -4104,7 +4104,7 @@
               <w:rPr>
                 <w:noProof/>
               </w:rPr>
-              <w:instrText xml:space="preserve"> PAGEREF _Toc236974973 \h </w:instrText>
+              <w:instrText xml:space="preserve"> PAGEREF _Toc236976803 \h </w:instrText>
             </w:r>
             <w:r>
               <w:rPr>
@@ -4147,7 +4147,7 @@
               <w14:ligatures w14:val="standardContextual"/>
             </w:rPr>
           </w:pPr>
-          <w:hyperlink w:anchor="_Toc236974974" w:history="1">
+          <w:hyperlink w:anchor="_Toc236976804" w:history="1">
             <w:r>
               <w:rPr>
                 <w:rStyle w:val="Hyperlink"/>
@@ -4171,7 +4171,7 @@
               <w:rPr>
                 <w:noProof/>
               </w:rPr>
-              <w:instrText xml:space="preserve"> PAGEREF _Toc236974974 \h </w:instrText>
+              <w:instrText xml:space="preserve"> PAGEREF _Toc236976804 \h </w:instrText>
             </w:r>
             <w:r>
               <w:rPr>
@@ -4214,7 +4214,7 @@
               <w14:ligatures w14:val="standardContextual"/>
             </w:rPr>
           </w:pPr>
-          <w:hyperlink w:anchor="_Toc236974975" w:history="1">
+          <w:hyperlink w:anchor="_Toc236976805" w:history="1">
             <w:r>
               <w:rPr>
                 <w:rStyle w:val="Hyperlink"/>
@@ -4238,7 +4238,7 @@
               <w:rPr>
                 <w:noProof/>
               </w:rPr>
-              <w:instrText xml:space="preserve"> PAGEREF _Toc236974975 \h </w:instrText>
+              <w:instrText xml:space="preserve"> PAGEREF _Toc236976805 \h </w:instrText>
             </w:r>
             <w:r>
               <w:rPr>
@@ -4281,7 +4281,7 @@
               <w14:ligatures w14:val="standardContextual"/>
             </w:rPr>
           </w:pPr>
-          <w:hyperlink w:anchor="_Toc236974976" w:history="1">
+          <w:hyperlink w:anchor="_Toc236976806" w:history="1">
             <w:r>
               <w:rPr>
                 <w:rStyle w:val="Hyperlink"/>
@@ -4305,7 +4305,7 @@
               <w:rPr>
                 <w:noProof/>
               </w:rPr>
-              <w:instrText xml:space="preserve"> PAGEREF _Toc236974976 \h </w:instrText>
+              <w:instrText xml:space="preserve"> PAGEREF _Toc236976806 \h </w:instrText>
             </w:r>
             <w:r>
               <w:rPr>
@@ -4348,7 +4348,7 @@
               <w14:ligatures w14:val="standardContextual"/>
             </w:rPr>
           </w:pPr>
-          <w:hyperlink w:anchor="_Toc236974977" w:history="1">
+          <w:hyperlink w:anchor="_Toc236976807" w:history="1">
             <w:r>
               <w:rPr>
                 <w:rStyle w:val="Hyperlink"/>
@@ -4372,7 +4372,7 @@
               <w:rPr>
                 <w:noProof/>
               </w:rPr>
-              <w:instrText xml:space="preserve"> PAGEREF _Toc236974977 \h </w:instrText>
+              <w:instrText xml:space="preserve"> PAGEREF _Toc236976807 \h </w:instrText>
             </w:r>
             <w:r>
               <w:rPr>
@@ -4415,7 +4415,7 @@
               <w14:ligatures w14:val="standardContextual"/>
             </w:rPr>
           </w:pPr>
-          <w:hyperlink w:anchor="_Toc236974978" w:history="1">
+          <w:hyperlink w:anchor="_Toc236976808" w:history="1">
             <w:r>
               <w:rPr>
                 <w:rStyle w:val="Hyperlink"/>
@@ -4439,7 +4439,7 @@
               <w:rPr>
                 <w:noProof/>
               </w:rPr>
-              <w:instrText xml:space="preserve"> PAGEREF _Toc236974978 \h </w:instrText>
+              <w:instrText xml:space="preserve"> PAGEREF _Toc236976808 \h </w:instrText>
             </w:r>
             <w:r>
               <w:rPr>
@@ -4482,7 +4482,7 @@
               <w14:ligatures w14:val="standardContextual"/>
             </w:rPr>
           </w:pPr>
-          <w:hyperlink w:anchor="_Toc236974979" w:history="1">
+          <w:hyperlink w:anchor="_Toc236976809" w:history="1">
             <w:r>
               <w:rPr>
                 <w:rStyle w:val="Hyperlink"/>
@@ -4506,7 +4506,7 @@
               <w:rPr>
                 <w:noProof/>
               </w:rPr>
-              <w:instrText xml:space="preserve"> PAGEREF _Toc236974979 \h </w:instrText>
+              <w:instrText xml:space="preserve"> PAGEREF _Toc236976809 \h </w:instrText>
             </w:r>
             <w:r>
               <w:rPr>
@@ -4549,7 +4549,7 @@
               <w14:ligatures w14:val="standardContextual"/>
             </w:rPr>
           </w:pPr>
-          <w:hyperlink w:anchor="_Toc236974980" w:history="1">
+          <w:hyperlink w:anchor="_Toc236976810" w:history="1">
             <w:r>
               <w:rPr>
                 <w:rStyle w:val="Hyperlink"/>
@@ -4573,7 +4573,7 @@
               <w:rPr>
                 <w:noProof/>
               </w:rPr>
-              <w:instrText xml:space="preserve"> PAGEREF _Toc236974980 \h </w:instrText>
+              <w:instrText xml:space="preserve"> PAGEREF _Toc236976810 \h </w:instrText>
             </w:r>
             <w:r>
               <w:rPr>
@@ -4620,7 +4620,7 @@
         </w:pBdr>
         <w:spacing w:before="360" w:after="180"/>
       </w:pPr>
-      <w:bookmarkStart w:id="1" w:name="_Toc236974925"/>
+      <w:bookmarkStart w:id="1" w:name="_Toc236976755"/>
       <w:r>
         <w:t>1. Introducción</w:t>
       </w:r>
@@ -4674,7 +4674,7 @@
         </w:pBdr>
         <w:spacing w:before="360" w:after="180"/>
       </w:pPr>
-      <w:bookmarkStart w:id="2" w:name="_Toc236974926"/>
+      <w:bookmarkStart w:id="2" w:name="_Toc236976756"/>
       <w:r>
         <w:t>2. Objetivos</w:t>
       </w:r>
@@ -4685,7 +4685,7 @@
         <w:pStyle w:val="Heading2"/>
         <w:spacing w:before="260" w:after="120"/>
       </w:pPr>
-      <w:bookmarkStart w:id="3" w:name="_Toc236974927"/>
+      <w:bookmarkStart w:id="3" w:name="_Toc236976757"/>
       <w:r>
         <w:t>2.1 Objetivo general</w:t>
       </w:r>
@@ -4704,7 +4704,7 @@
         <w:pStyle w:val="Heading2"/>
         <w:spacing w:before="260" w:after="120"/>
       </w:pPr>
-      <w:bookmarkStart w:id="4" w:name="_Toc236974928"/>
+      <w:bookmarkStart w:id="4" w:name="_Toc236976758"/>
       <w:r>
         <w:t>2.2 Objetivos específicos</w:t>
       </w:r>
@@ -4809,7 +4809,7 @@
         </w:pBdr>
         <w:spacing w:before="360" w:after="180"/>
       </w:pPr>
-      <w:bookmarkStart w:id="5" w:name="_Toc236974929"/>
+      <w:bookmarkStart w:id="5" w:name="_Toc236976759"/>
       <w:r>
         <w:t>3. Planteamiento del problema y justificación</w:t>
       </w:r>
@@ -4820,7 +4820,7 @@
         <w:pStyle w:val="Heading2"/>
         <w:spacing w:before="260" w:after="120"/>
       </w:pPr>
-      <w:bookmarkStart w:id="6" w:name="_Toc236974930"/>
+      <w:bookmarkStart w:id="6" w:name="_Toc236976760"/>
       <w:r>
         <w:t>3.1 El contexto dominicano</w:t>
       </w:r>
@@ -4899,7 +4899,7 @@
         <w:pStyle w:val="Heading2"/>
         <w:spacing w:before="260" w:after="120"/>
       </w:pPr>
-      <w:bookmarkStart w:id="7" w:name="_Toc236974931"/>
+      <w:bookmarkStart w:id="7" w:name="_Toc236976761"/>
       <w:r>
         <w:t>3.2 Por qué un microcontrolador y no una aplicación</w:t>
       </w:r>
@@ -4921,7 +4921,7 @@
         <w:pStyle w:val="Heading2"/>
         <w:spacing w:before="260" w:after="120"/>
       </w:pPr>
-      <w:bookmarkStart w:id="8" w:name="_Toc236974932"/>
+      <w:bookmarkStart w:id="8" w:name="_Toc236976762"/>
       <w:r>
         <w:t>3.3 Por qué el problema es de programación concurrente</w:t>
       </w:r>
@@ -5437,7 +5437,7 @@
         </w:pBdr>
         <w:spacing w:before="360" w:after="180"/>
       </w:pPr>
-      <w:bookmarkStart w:id="9" w:name="_Toc236974933"/>
+      <w:bookmarkStart w:id="9" w:name="_Toc236976763"/>
       <w:r>
         <w:t>4. Marco conceptual: programación en hilos y tareas</w:t>
       </w:r>
@@ -5456,7 +5456,7 @@
         <w:pStyle w:val="Heading2"/>
         <w:spacing w:before="260" w:after="120"/>
       </w:pPr>
-      <w:bookmarkStart w:id="10" w:name="_Toc236974934"/>
+      <w:bookmarkStart w:id="10" w:name="_Toc236976764"/>
       <w:r>
         <w:t>4.1 Proceso, hilo y tarea: tres cosas distintas</w:t>
       </w:r>
@@ -6016,7 +6016,7 @@
         <w:pStyle w:val="Heading2"/>
         <w:spacing w:before="260" w:after="120"/>
       </w:pPr>
-      <w:bookmarkStart w:id="11" w:name="_Toc236974935"/>
+      <w:bookmarkStart w:id="11" w:name="_Toc236976765"/>
       <w:r>
         <w:t>4.2 Concurrencia no es paralelismo</w:t>
       </w:r>
@@ -6092,7 +6092,7 @@
         <w:pStyle w:val="Heading2"/>
         <w:spacing w:before="260" w:after="120"/>
       </w:pPr>
-      <w:bookmarkStart w:id="12" w:name="_Toc236974936"/>
+      <w:bookmarkStart w:id="12" w:name="_Toc236976766"/>
       <w:r>
         <w:t>4.3 Programación distribuida</w:t>
       </w:r>
@@ -6158,7 +6158,7 @@
         <w:pStyle w:val="Heading2"/>
         <w:spacing w:before="260" w:after="120"/>
       </w:pPr>
-      <w:bookmarkStart w:id="13" w:name="_Toc236974937"/>
+      <w:bookmarkStart w:id="13" w:name="_Toc236976767"/>
       <w:r>
         <w:t>4.4 Mecanismos de sincronización</w:t>
       </w:r>
@@ -6731,7 +6731,7 @@
         <w:pStyle w:val="Heading2"/>
         <w:spacing w:before="260" w:after="120"/>
       </w:pPr>
-      <w:bookmarkStart w:id="14" w:name="_Toc236974938"/>
+      <w:bookmarkStart w:id="14" w:name="_Toc236976768"/>
       <w:r>
         <w:t>4.5 Los tres errores clásicos, y cómo se evitan aquí</w:t>
       </w:r>
@@ -6742,7 +6742,7 @@
         <w:pStyle w:val="Heading3"/>
         <w:spacing w:before="200" w:after="100"/>
       </w:pPr>
-      <w:bookmarkStart w:id="15" w:name="_Toc236974939"/>
+      <w:bookmarkStart w:id="15" w:name="_Toc236976769"/>
       <w:r>
         <w:t>Condición de carrera</w:t>
       </w:r>
@@ -6761,7 +6761,7 @@
         <w:pStyle w:val="Heading3"/>
         <w:spacing w:before="200" w:after="100"/>
       </w:pPr>
-      <w:bookmarkStart w:id="16" w:name="_Toc236974940"/>
+      <w:bookmarkStart w:id="16" w:name="_Toc236976770"/>
       <w:r>
         <w:t>Interbloqueo (deadlock)</w:t>
       </w:r>
@@ -6780,7 +6780,7 @@
         <w:pStyle w:val="Heading3"/>
         <w:spacing w:before="200" w:after="100"/>
       </w:pPr>
-      <w:bookmarkStart w:id="17" w:name="_Toc236974941"/>
+      <w:bookmarkStart w:id="17" w:name="_Toc236976771"/>
       <w:r>
         <w:t>Inversión de prioridad</w:t>
       </w:r>
@@ -6825,7 +6825,7 @@
         </w:pBdr>
         <w:spacing w:before="360" w:after="180"/>
       </w:pPr>
-      <w:bookmarkStart w:id="18" w:name="_Toc236974942"/>
+      <w:bookmarkStart w:id="18" w:name="_Toc236976772"/>
       <w:r>
         <w:t>5. Desarrollo del caso práctico: SmartPower RD</w:t>
       </w:r>
@@ -6836,7 +6836,7 @@
         <w:pStyle w:val="Heading2"/>
         <w:spacing w:before="260" w:after="120"/>
       </w:pPr>
-      <w:bookmarkStart w:id="19" w:name="_Toc236974943"/>
+      <w:bookmarkStart w:id="19" w:name="_Toc236976773"/>
       <w:r>
         <w:t>5.1 Descripción funcional</w:t>
       </w:r>
@@ -6907,7 +6907,7 @@
         <w:pStyle w:val="Heading2"/>
         <w:spacing w:before="260" w:after="120"/>
       </w:pPr>
-      <w:bookmarkStart w:id="20" w:name="_Toc236974944"/>
+      <w:bookmarkStart w:id="20" w:name="_Toc236976774"/>
       <w:r>
         <w:t>5.2 Arquitectura del sistema</w:t>
       </w:r>
@@ -7342,7 +7342,7 @@
         <w:pStyle w:val="Heading2"/>
         <w:spacing w:before="260" w:after="120"/>
       </w:pPr>
-      <w:bookmarkStart w:id="21" w:name="_Toc236974945"/>
+      <w:bookmarkStart w:id="21" w:name="_Toc236976775"/>
       <w:r>
         <w:t>5.3 Componentes de hardware y su función</w:t>
       </w:r>
@@ -7982,7 +7982,7 @@
         <w:pStyle w:val="Heading2"/>
         <w:spacing w:before="260" w:after="120"/>
       </w:pPr>
-      <w:bookmarkStart w:id="22" w:name="_Toc236974946"/>
+      <w:bookmarkStart w:id="22" w:name="_Toc236976776"/>
       <w:r>
         <w:t>5.4 Arquitectura de tareas: la decisión central del diseño</w:t>
       </w:r>
@@ -8857,7 +8857,7 @@
         <w:pStyle w:val="Heading2"/>
         <w:spacing w:before="260" w:after="120"/>
       </w:pPr>
-      <w:bookmarkStart w:id="23" w:name="_Toc236974947"/>
+      <w:bookmarkStart w:id="23" w:name="_Toc236976777"/>
       <w:r>
         <w:t>5.5 Flujo de datos y de sincronización</w:t>
       </w:r>
@@ -9215,7 +9215,7 @@
         <w:pStyle w:val="Heading2"/>
         <w:spacing w:before="260" w:after="120"/>
       </w:pPr>
-      <w:bookmarkStart w:id="24" w:name="_Toc236974948"/>
+      <w:bookmarkStart w:id="24" w:name="_Toc236976778"/>
       <w:r>
         <w:t>5.6 Fragmento representativo del código</w:t>
       </w:r>
@@ -9675,7 +9675,7 @@
         <w:pStyle w:val="Heading2"/>
         <w:spacing w:before="260" w:after="120"/>
       </w:pPr>
-      <w:bookmarkStart w:id="25" w:name="_Toc236974949"/>
+      <w:bookmarkStart w:id="25" w:name="_Toc236976779"/>
       <w:r>
         <w:t>5.7 Extensión con inteligencia artificial</w:t>
       </w:r>
@@ -9762,7 +9762,7 @@
         <w:pStyle w:val="Heading2"/>
         <w:spacing w:before="260" w:after="120"/>
       </w:pPr>
-      <w:bookmarkStart w:id="26" w:name="_Toc236974950"/>
+      <w:bookmarkStart w:id="26" w:name="_Toc236976780"/>
       <w:r>
         <w:t>5.8 Implementación en Arduino Cloud</w:t>
       </w:r>
@@ -9789,7 +9789,7 @@
         <w:pStyle w:val="Heading3"/>
         <w:spacing w:before="200" w:after="100"/>
       </w:pPr>
-      <w:bookmarkStart w:id="27" w:name="_Toc236974951"/>
+      <w:bookmarkStart w:id="27" w:name="_Toc236976781"/>
       <w:r>
         <w:t>El problema que plantea ArduinoCloud.update()</w:t>
       </w:r>
@@ -9816,7 +9816,7 @@
         <w:pStyle w:val="Heading3"/>
         <w:spacing w:before="200" w:after="100"/>
       </w:pPr>
-      <w:bookmarkStart w:id="28" w:name="_Toc236974952"/>
+      <w:bookmarkStart w:id="28" w:name="_Toc236976782"/>
       <w:r>
         <w:t>Seguridad entre hilos de las variables de nube</w:t>
       </w:r>
@@ -9838,7 +9838,7 @@
         <w:pStyle w:val="Heading3"/>
         <w:spacing w:before="200" w:after="100"/>
       </w:pPr>
-      <w:bookmarkStart w:id="29" w:name="_Toc236974953"/>
+      <w:bookmarkStart w:id="29" w:name="_Toc236976783"/>
       <w:r>
         <w:t>Variables de nube y tablero</w:t>
       </w:r>
@@ -11376,7 +11376,7 @@
         </w:pBdr>
         <w:spacing w:before="360" w:after="180"/>
       </w:pPr>
-      <w:bookmarkStart w:id="30" w:name="_Toc236974954"/>
+      <w:bookmarkStart w:id="30" w:name="_Toc236976784"/>
       <w:r>
         <w:t>6. Evidencias demostrables de programación concurrente</w:t>
       </w:r>
@@ -12200,7 +12200,7 @@
         <w:pStyle w:val="Heading2"/>
         <w:spacing w:before="260" w:after="120"/>
       </w:pPr>
-      <w:bookmarkStart w:id="31" w:name="_Toc236974955"/>
+      <w:bookmarkStart w:id="31" w:name="_Toc236976785"/>
       <w:r>
         <w:t>6.1 Ejemplo 1 — El problema: programación secuencial bloqueante</w:t>
       </w:r>
@@ -12227,7 +12227,7 @@
         <w:pStyle w:val="Heading2"/>
         <w:spacing w:before="260" w:after="120"/>
       </w:pPr>
-      <w:bookmarkStart w:id="32" w:name="_Toc236974956"/>
+      <w:bookmarkStart w:id="32" w:name="_Toc236976786"/>
       <w:r>
         <w:t>6.2 Ejemplo 2 — Multitarea cooperativa con millis()</w:t>
       </w:r>
@@ -12262,7 +12262,7 @@
         <w:pStyle w:val="Heading2"/>
         <w:spacing w:before="260" w:after="120"/>
       </w:pPr>
-      <w:bookmarkStart w:id="33" w:name="_Toc236974957"/>
+      <w:bookmarkStart w:id="33" w:name="_Toc236976787"/>
       <w:r>
         <w:t>6.3 Ejemplo 3 — Hilos reales, expulsión y dos núcleos</w:t>
       </w:r>
@@ -12292,7 +12292,7 @@
         <w:pStyle w:val="Heading2"/>
         <w:spacing w:before="260" w:after="120"/>
       </w:pPr>
-      <w:bookmarkStart w:id="34" w:name="_Toc236974958"/>
+      <w:bookmarkStart w:id="34" w:name="_Toc236976788"/>
       <w:r>
         <w:t>6.4 Ejemplo 4 — La condición de carrera y su cura</w:t>
       </w:r>
@@ -12327,7 +12327,7 @@
         <w:pStyle w:val="Heading2"/>
         <w:spacing w:before="260" w:after="120"/>
       </w:pPr>
-      <w:bookmarkStart w:id="35" w:name="_Toc236974959"/>
+      <w:bookmarkStart w:id="35" w:name="_Toc236976789"/>
       <w:r>
         <w:t>6.5 Ejemplo 5 — Programación distribuida con MQTT</w:t>
       </w:r>
@@ -12362,7 +12362,7 @@
         <w:pStyle w:val="Heading2"/>
         <w:spacing w:before="260" w:after="120"/>
       </w:pPr>
-      <w:bookmarkStart w:id="36" w:name="_Toc236974960"/>
+      <w:bookmarkStart w:id="36" w:name="_Toc236976790"/>
       <w:r>
         <w:t>6.6 Ejemplo 6 — Concurrencia y paralelismo, medidos con cronómetro</w:t>
       </w:r>
@@ -13115,7 +13115,7 @@
         </w:pBdr>
         <w:spacing w:before="360" w:after="180"/>
       </w:pPr>
-      <w:bookmarkStart w:id="37" w:name="_Toc236974961"/>
+      <w:bookmarkStart w:id="37" w:name="_Toc236976791"/>
       <w:r>
         <w:t>7. Presupuesto y cotización</w:t>
       </w:r>
@@ -13149,7 +13149,7 @@
         <w:pStyle w:val="Heading2"/>
         <w:spacing w:before="260" w:after="120"/>
       </w:pPr>
-      <w:bookmarkStart w:id="38" w:name="_Toc236974962"/>
+      <w:bookmarkStart w:id="38" w:name="_Toc236976792"/>
       <w:r>
         <w:t>7.1 Escenario A — Prototipo académico simulado</w:t>
       </w:r>
@@ -14080,7 +14080,7 @@
         <w:pStyle w:val="Heading2"/>
         <w:spacing w:before="260" w:after="120"/>
       </w:pPr>
-      <w:bookmarkStart w:id="39" w:name="_Toc236974963"/>
+      <w:bookmarkStart w:id="39" w:name="_Toc236976793"/>
       <w:r>
         <w:t>7.2 Escenario B — Implementación física en una vivienda</w:t>
       </w:r>
@@ -14091,7 +14091,7 @@
         <w:pStyle w:val="Heading3"/>
         <w:spacing w:before="200" w:after="100"/>
       </w:pPr>
-      <w:bookmarkStart w:id="40" w:name="_Toc236974964"/>
+      <w:bookmarkStart w:id="40" w:name="_Toc236976794"/>
       <w:r>
         <w:t>7.2.1 Materiales y componentes</w:t>
       </w:r>
@@ -15991,7 +15991,7 @@
         <w:pStyle w:val="Heading3"/>
         <w:spacing w:before="200" w:after="100"/>
       </w:pPr>
-      <w:bookmarkStart w:id="41" w:name="_Toc236974965"/>
+      <w:bookmarkStart w:id="41" w:name="_Toc236976795"/>
       <w:r>
         <w:t>7.2.2 Logística, impuestos y servicios</w:t>
       </w:r>
@@ -17247,7 +17247,7 @@
         <w:pStyle w:val="Heading3"/>
         <w:spacing w:before="200" w:after="100"/>
       </w:pPr>
-      <w:bookmarkStart w:id="42" w:name="_Toc236974966"/>
+      <w:bookmarkStart w:id="42" w:name="_Toc236976796"/>
       <w:r>
         <w:t>7.2.3 Costos recurrentes</w:t>
       </w:r>
@@ -17958,7 +17958,7 @@
         <w:pStyle w:val="Heading2"/>
         <w:spacing w:before="260" w:after="120"/>
       </w:pPr>
-      <w:bookmarkStart w:id="43" w:name="_Toc236974967"/>
+      <w:bookmarkStart w:id="43" w:name="_Toc236976797"/>
       <w:r>
         <w:t>7.3 Análisis de retorno de la inversión</w:t>
       </w:r>
@@ -18616,7 +18616,7 @@
         </w:pBdr>
         <w:spacing w:before="360" w:after="180"/>
       </w:pPr>
-      <w:bookmarkStart w:id="44" w:name="_Toc236974968"/>
+      <w:bookmarkStart w:id="44" w:name="_Toc236976798"/>
       <w:r>
         <w:t>8. Cronograma de implementación</w:t>
       </w:r>
@@ -19655,7 +19655,7 @@
         </w:pBdr>
         <w:spacing w:before="360" w:after="180"/>
       </w:pPr>
-      <w:bookmarkStart w:id="45" w:name="_Toc236974969"/>
+      <w:bookmarkStart w:id="45" w:name="_Toc236976799"/>
       <w:r>
         <w:t>9. Conclusión</w:t>
       </w:r>
@@ -19728,7 +19728,7 @@
         <w:pStyle w:val="Heading2"/>
         <w:spacing w:before="260" w:after="120"/>
       </w:pPr>
-      <w:bookmarkStart w:id="46" w:name="_Toc236974970"/>
+      <w:bookmarkStart w:id="46" w:name="_Toc236976800"/>
       <w:r>
         <w:t>9.1 Recomendaciones</w:t>
       </w:r>
@@ -19812,7 +19812,7 @@
         </w:pBdr>
         <w:spacing w:before="360" w:after="180"/>
       </w:pPr>
-      <w:bookmarkStart w:id="47" w:name="_Toc236974971"/>
+      <w:bookmarkStart w:id="47" w:name="_Toc236976801"/>
       <w:r>
         <w:t>10. Fuentes de investigación y bibliografía</w:t>
       </w:r>
@@ -19823,7 +19823,7 @@
         <w:pStyle w:val="Heading2"/>
         <w:spacing w:before="260" w:after="120"/>
       </w:pPr>
-      <w:bookmarkStart w:id="48" w:name="_Toc236974972"/>
+      <w:bookmarkStart w:id="48" w:name="_Toc236976802"/>
       <w:r>
         <w:t>10.1 Libros y artículos académicos</w:t>
       </w:r>
@@ -19899,7 +19899,7 @@
         <w:pStyle w:val="Heading2"/>
         <w:spacing w:before="260" w:after="120"/>
       </w:pPr>
-      <w:bookmarkStart w:id="49" w:name="_Toc236974973"/>
+      <w:bookmarkStart w:id="49" w:name="_Toc236976803"/>
       <w:r>
         <w:t>10.2 Documentación técnica y normas</w:t>
       </w:r>
@@ -19915,8 +19915,19 @@
           <w:sz w:val="21"/>
           <w:szCs w:val="21"/>
         </w:rPr>
-        <w:t>Arduino. (2026). Arduino Cloud Documentation. https://docs.arduino.cc/arduino-cloud/</w:t>
-      </w:r>
+        <w:t xml:space="preserve">Arduino. (2026). Arduino Cloud Documentation. </w:t>
+      </w:r>
+      <w:hyperlink r:id="rId7" w:history="1">
+        <w:r>
+          <w:rPr>
+            <w:color w:val="1155CC"/>
+            <w:sz w:val="21"/>
+            <w:szCs w:val="21"/>
+            <w:u w:val="single"/>
+          </w:rPr>
+          <w:t>https://docs.arduino.cc/arduino-cloud/</w:t>
+        </w:r>
+      </w:hyperlink>
     </w:p>
     <w:p>
       <w:pPr>
@@ -19928,8 +19939,19 @@
           <w:sz w:val="21"/>
           <w:szCs w:val="21"/>
         </w:rPr>
-        <w:t>Espressif Systems. (2026). ESP-IDF Programming Guide: FreeRTOS (IDF) API Reference. https://docs.espressif.com/projects/esp-idf/en/latest/esp32/api-reference/system/freertos.html</w:t>
-      </w:r>
+        <w:t xml:space="preserve">Espressif Systems. (2026). ESP-IDF Programming Guide: FreeRTOS (IDF) API Reference. </w:t>
+      </w:r>
+      <w:hyperlink r:id="rId8" w:history="1">
+        <w:r>
+          <w:rPr>
+            <w:color w:val="1155CC"/>
+            <w:sz w:val="21"/>
+            <w:szCs w:val="21"/>
+            <w:u w:val="single"/>
+          </w:rPr>
+          <w:t>https://docs.espressif.com/projects/esp-idf/en/latest/esp32/api-reference/system/freertos.html</w:t>
+        </w:r>
+      </w:hyperlink>
     </w:p>
     <w:p>
       <w:pPr>
@@ -19941,8 +19963,19 @@
           <w:sz w:val="21"/>
           <w:szCs w:val="21"/>
         </w:rPr>
-        <w:t>Espressif Systems. (2026). ESP32 Series Datasheet y Technical Reference Manual. https://www.espressif.com/en/support/documents/technical-documents</w:t>
-      </w:r>
+        <w:t xml:space="preserve">Espressif Systems. (2026). ESP32 Series Datasheet y Technical Reference Manual. </w:t>
+      </w:r>
+      <w:hyperlink r:id="rId9" w:history="1">
+        <w:r>
+          <w:rPr>
+            <w:color w:val="1155CC"/>
+            <w:sz w:val="21"/>
+            <w:szCs w:val="21"/>
+            <w:u w:val="single"/>
+          </w:rPr>
+          <w:t>https://www.espressif.com/en/support/documents/technical-documents</w:t>
+        </w:r>
+      </w:hyperlink>
     </w:p>
     <w:p>
       <w:pPr>
@@ -19954,8 +19987,19 @@
           <w:sz w:val="21"/>
           <w:szCs w:val="21"/>
         </w:rPr>
-        <w:t>OASIS. (2019). MQTT Version 5.0 — OASIS Standard. https://docs.oasis-open.org/mqtt/mqtt/v5.0/mqtt-v5.0.html</w:t>
-      </w:r>
+        <w:t xml:space="preserve">OASIS. (2019). MQTT Version 5.0 — OASIS Standard. </w:t>
+      </w:r>
+      <w:hyperlink r:id="rId10" w:history="1">
+        <w:r>
+          <w:rPr>
+            <w:color w:val="1155CC"/>
+            <w:sz w:val="21"/>
+            <w:szCs w:val="21"/>
+            <w:u w:val="single"/>
+          </w:rPr>
+          <w:t>https://docs.oasis-open.org/mqtt/mqtt/v5.0/mqtt-v5.0.html</w:t>
+        </w:r>
+      </w:hyperlink>
     </w:p>
     <w:p>
       <w:pPr>
@@ -19967,8 +20011,19 @@
           <w:sz w:val="21"/>
           <w:szCs w:val="21"/>
         </w:rPr>
-        <w:t>Python Software Foundation. (2026). Documentación de las bibliotecas threading, multiprocessing y asyncio, Python 3.11. https://docs.python.org/3/library/concurrency.html</w:t>
-      </w:r>
+        <w:t xml:space="preserve">Python Software Foundation. (2026). Documentación de las bibliotecas threading, multiprocessing y asyncio, Python 3.11. </w:t>
+      </w:r>
+      <w:hyperlink r:id="rId11" w:history="1">
+        <w:r>
+          <w:rPr>
+            <w:color w:val="1155CC"/>
+            <w:sz w:val="21"/>
+            <w:szCs w:val="21"/>
+            <w:u w:val="single"/>
+          </w:rPr>
+          <w:t>https://docs.python.org/3/library/concurrency.html</w:t>
+        </w:r>
+      </w:hyperlink>
     </w:p>
     <w:p>
       <w:pPr>
@@ -19980,15 +20035,26 @@
           <w:sz w:val="21"/>
           <w:szCs w:val="21"/>
         </w:rPr>
-        <w:t>Wokwi. (2026). Wokwi Documentation: ESP32 Simulator. https://docs.wokwi.com/</w:t>
-      </w:r>
+        <w:t xml:space="preserve">Wokwi. (2026). Wokwi Documentation: ESP32 Simulator. </w:t>
+      </w:r>
+      <w:hyperlink r:id="rId12" w:history="1">
+        <w:r>
+          <w:rPr>
+            <w:color w:val="1155CC"/>
+            <w:sz w:val="21"/>
+            <w:szCs w:val="21"/>
+            <w:u w:val="single"/>
+          </w:rPr>
+          <w:t>https://docs.wokwi.com/</w:t>
+        </w:r>
+      </w:hyperlink>
     </w:p>
     <w:p>
       <w:pPr>
         <w:pStyle w:val="Heading2"/>
         <w:spacing w:before="260" w:after="120"/>
       </w:pPr>
-      <w:bookmarkStart w:id="50" w:name="_Toc236974974"/>
+      <w:bookmarkStart w:id="50" w:name="_Toc236976804"/>
       <w:r>
         <w:t>10.3 Conferencias y recursos en línea</w:t>
       </w:r>
@@ -20004,8 +20070,19 @@
           <w:sz w:val="21"/>
           <w:szCs w:val="21"/>
         </w:rPr>
-        <w:t>Pike, R. (2012). Concurrency is not Parallelism. Heroku Waza Conference. https://go.dev/blog/waza-talk</w:t>
-      </w:r>
+        <w:t xml:space="preserve">Pike, R. (2012). Concurrency is not Parallelism. Heroku Waza Conference. </w:t>
+      </w:r>
+      <w:hyperlink r:id="rId13" w:history="1">
+        <w:r>
+          <w:rPr>
+            <w:color w:val="1155CC"/>
+            <w:sz w:val="21"/>
+            <w:szCs w:val="21"/>
+            <w:u w:val="single"/>
+          </w:rPr>
+          <w:t>https://go.dev/blog/waza-talk</w:t>
+        </w:r>
+      </w:hyperlink>
     </w:p>
     <w:p>
       <w:pPr>
@@ -20017,8 +20094,19 @@
           <w:sz w:val="21"/>
           <w:szCs w:val="21"/>
         </w:rPr>
-        <w:t>Red Hat. (2023). IoT: ¿qué es el Internet de las cosas y cómo funciona? https://www.redhat.com/es/topics/internet-of-things/what-is-iot</w:t>
-      </w:r>
+        <w:t xml:space="preserve">Red Hat. (2023). IoT: ¿qué es el Internet de las cosas y cómo funciona? </w:t>
+      </w:r>
+      <w:hyperlink r:id="rId14" w:history="1">
+        <w:r>
+          <w:rPr>
+            <w:color w:val="1155CC"/>
+            <w:sz w:val="21"/>
+            <w:szCs w:val="21"/>
+            <w:u w:val="single"/>
+          </w:rPr>
+          <w:t>https://www.redhat.com/es/topics/internet-of-things/what-is-iot</w:t>
+        </w:r>
+      </w:hyperlink>
     </w:p>
     <w:p>
       <w:pPr>
@@ -20038,7 +20126,7 @@
         <w:pStyle w:val="Heading2"/>
         <w:spacing w:before="260" w:after="120"/>
       </w:pPr>
-      <w:bookmarkStart w:id="51" w:name="_Toc236974975"/>
+      <w:bookmarkStart w:id="51" w:name="_Toc236976805"/>
       <w:r>
         <w:t>10.4 Fuentes de datos económicos</w:t>
       </w:r>
@@ -20054,8 +20142,19 @@
           <w:sz w:val="21"/>
           <w:szCs w:val="21"/>
         </w:rPr>
-        <w:t>Banco Central de la República Dominicana. (2026). Tasa de cambio del dólar estadounidense, 5 de agosto de 2026: RD$58.0760 (compra) / RD$58.4424 (venta). https://www.bancentral.gov.do/</w:t>
-      </w:r>
+        <w:t xml:space="preserve">Banco Central de la República Dominicana. (2026). Tasa de cambio del dólar estadounidense, 5 de agosto de 2026: RD$58.0760 (compra) / RD$58.4424 (venta). </w:t>
+      </w:r>
+      <w:hyperlink r:id="rId15" w:history="1">
+        <w:r>
+          <w:rPr>
+            <w:color w:val="1155CC"/>
+            <w:sz w:val="21"/>
+            <w:szCs w:val="21"/>
+            <w:u w:val="single"/>
+          </w:rPr>
+          <w:t>https://www.bancentral.gov.do/</w:t>
+        </w:r>
+      </w:hyperlink>
     </w:p>
     <w:p>
       <w:r>
@@ -20070,7 +20169,7 @@
         </w:pBdr>
         <w:spacing w:before="360" w:after="180"/>
       </w:pPr>
-      <w:bookmarkStart w:id="52" w:name="_Toc236974976"/>
+      <w:bookmarkStart w:id="52" w:name="_Toc236976806"/>
       <w:r>
         <w:t>Anexo A. Enlaces de acceso al código y a los videos</w:t>
       </w:r>
@@ -20089,7 +20188,7 @@
         <w:pStyle w:val="Heading2"/>
         <w:spacing w:before="260" w:after="120"/>
       </w:pPr>
-      <w:bookmarkStart w:id="53" w:name="_Toc236974977"/>
+      <w:bookmarkStart w:id="53" w:name="_Toc236976807"/>
       <w:r>
         <w:t>A.1 Código fuente</w:t>
       </w:r>
@@ -20108,7 +20207,7 @@
         <w:spacing w:before="160" w:after="160"/>
         <w:jc w:val="center"/>
       </w:pPr>
-      <w:hyperlink r:id="rId7" w:history="1">
+      <w:hyperlink r:id="rId16" w:history="1">
         <w:r>
           <w:rPr>
             <w:b/>
@@ -20559,7 +20658,7 @@
         <w:pStyle w:val="Heading2"/>
         <w:spacing w:before="260" w:after="120"/>
       </w:pPr>
-      <w:bookmarkStart w:id="54" w:name="_Toc236974978"/>
+      <w:bookmarkStart w:id="54" w:name="_Toc236976808"/>
       <w:r>
         <w:t>A.2 Material audiovisual de referencia</w:t>
       </w:r>
@@ -20809,7 +20908,7 @@
             </w:r>
           </w:p>
           <w:p>
-            <w:hyperlink r:id="rId8" w:history="1">
+            <w:hyperlink r:id="rId17" w:history="1">
               <w:r>
                 <w:rPr>
                   <w:color w:val="1155CC"/>
@@ -20910,7 +21009,7 @@
             </w:r>
           </w:p>
           <w:p>
-            <w:hyperlink r:id="rId9" w:history="1">
+            <w:hyperlink r:id="rId18" w:history="1">
               <w:r>
                 <w:rPr>
                   <w:color w:val="1155CC"/>
@@ -21009,7 +21108,7 @@
             </w:r>
           </w:p>
           <w:p>
-            <w:hyperlink r:id="rId10" w:history="1">
+            <w:hyperlink r:id="rId19" w:history="1">
               <w:r>
                 <w:rPr>
                   <w:color w:val="1155CC"/>
@@ -21110,7 +21209,7 @@
             </w:r>
           </w:p>
           <w:p>
-            <w:hyperlink r:id="rId11" w:history="1">
+            <w:hyperlink r:id="rId20" w:history="1">
               <w:r>
                 <w:rPr>
                   <w:color w:val="1155CC"/>
@@ -21209,7 +21308,7 @@
             </w:r>
           </w:p>
           <w:p>
-            <w:hyperlink r:id="rId12" w:history="1">
+            <w:hyperlink r:id="rId21" w:history="1">
               <w:r>
                 <w:rPr>
                   <w:color w:val="1155CC"/>
@@ -21310,7 +21409,7 @@
             </w:r>
           </w:p>
           <w:p>
-            <w:hyperlink r:id="rId13" w:history="1">
+            <w:hyperlink r:id="rId22" w:history="1">
               <w:r>
                 <w:rPr>
                   <w:color w:val="1155CC"/>
@@ -21409,7 +21508,7 @@
             </w:r>
           </w:p>
           <w:p>
-            <w:hyperlink r:id="rId14" w:history="1">
+            <w:hyperlink r:id="rId23" w:history="1">
               <w:r>
                 <w:rPr>
                   <w:color w:val="1155CC"/>
@@ -21510,7 +21609,7 @@
             </w:r>
           </w:p>
           <w:p>
-            <w:hyperlink r:id="rId15" w:history="1">
+            <w:hyperlink r:id="rId24" w:history="1">
               <w:r>
                 <w:rPr>
                   <w:color w:val="1155CC"/>
@@ -21609,7 +21708,7 @@
             </w:r>
           </w:p>
           <w:p>
-            <w:hyperlink r:id="rId16" w:history="1">
+            <w:hyperlink r:id="rId25" w:history="1">
               <w:r>
                 <w:rPr>
                   <w:color w:val="1155CC"/>
@@ -21710,7 +21809,7 @@
             </w:r>
           </w:p>
           <w:p>
-            <w:hyperlink r:id="rId17" w:history="1">
+            <w:hyperlink r:id="rId26" w:history="1">
               <w:r>
                 <w:rPr>
                   <w:color w:val="1155CC"/>
@@ -21809,7 +21908,7 @@
             </w:r>
           </w:p>
           <w:p>
-            <w:hyperlink r:id="rId18" w:history="1">
+            <w:hyperlink r:id="rId27" w:history="1">
               <w:r>
                 <w:rPr>
                   <w:color w:val="1155CC"/>
@@ -21910,7 +22009,7 @@
             </w:r>
           </w:p>
           <w:p>
-            <w:hyperlink r:id="rId19" w:history="1">
+            <w:hyperlink r:id="rId28" w:history="1">
               <w:r>
                 <w:rPr>
                   <w:color w:val="1155CC"/>
@@ -22009,7 +22108,7 @@
             </w:r>
           </w:p>
           <w:p>
-            <w:hyperlink r:id="rId20" w:history="1">
+            <w:hyperlink r:id="rId29" w:history="1">
               <w:r>
                 <w:rPr>
                   <w:color w:val="1155CC"/>
@@ -22110,7 +22209,7 @@
             </w:r>
           </w:p>
           <w:p>
-            <w:hyperlink r:id="rId21" w:history="1">
+            <w:hyperlink r:id="rId30" w:history="1">
               <w:r>
                 <w:rPr>
                   <w:color w:val="1155CC"/>
@@ -22209,7 +22308,7 @@
             </w:r>
           </w:p>
           <w:p>
-            <w:hyperlink r:id="rId22" w:history="1">
+            <w:hyperlink r:id="rId31" w:history="1">
               <w:r>
                 <w:rPr>
                   <w:color w:val="1155CC"/>
@@ -22310,7 +22409,7 @@
             </w:r>
           </w:p>
           <w:p>
-            <w:hyperlink r:id="rId23" w:history="1">
+            <w:hyperlink r:id="rId32" w:history="1">
               <w:r>
                 <w:rPr>
                   <w:color w:val="1155CC"/>
@@ -22409,7 +22508,7 @@
             </w:r>
           </w:p>
           <w:p>
-            <w:hyperlink r:id="rId24" w:history="1">
+            <w:hyperlink r:id="rId33" w:history="1">
               <w:r>
                 <w:rPr>
                   <w:color w:val="1155CC"/>
@@ -22510,7 +22609,7 @@
             </w:r>
           </w:p>
           <w:p>
-            <w:hyperlink r:id="rId25" w:history="1">
+            <w:hyperlink r:id="rId34" w:history="1">
               <w:r>
                 <w:rPr>
                   <w:color w:val="1155CC"/>
@@ -22609,7 +22708,7 @@
             </w:r>
           </w:p>
           <w:p>
-            <w:hyperlink r:id="rId26" w:history="1">
+            <w:hyperlink r:id="rId35" w:history="1">
               <w:r>
                 <w:rPr>
                   <w:color w:val="1155CC"/>
@@ -22710,7 +22809,7 @@
             </w:r>
           </w:p>
           <w:p>
-            <w:hyperlink r:id="rId27" w:history="1">
+            <w:hyperlink r:id="rId36" w:history="1">
               <w:r>
                 <w:rPr>
                   <w:color w:val="1155CC"/>
@@ -22809,7 +22908,7 @@
             </w:r>
           </w:p>
           <w:p>
-            <w:hyperlink r:id="rId28" w:history="1">
+            <w:hyperlink r:id="rId37" w:history="1">
               <w:r>
                 <w:rPr>
                   <w:color w:val="1155CC"/>
@@ -22910,7 +23009,7 @@
             </w:r>
           </w:p>
           <w:p>
-            <w:hyperlink r:id="rId29" w:history="1">
+            <w:hyperlink r:id="rId38" w:history="1">
               <w:r>
                 <w:rPr>
                   <w:color w:val="1155CC"/>
@@ -23009,7 +23108,7 @@
             </w:r>
           </w:p>
           <w:p>
-            <w:hyperlink r:id="rId30" w:history="1">
+            <w:hyperlink r:id="rId39" w:history="1">
               <w:r>
                 <w:rPr>
                   <w:color w:val="1155CC"/>
@@ -23044,7 +23143,7 @@
         <w:pStyle w:val="Heading2"/>
         <w:spacing w:before="260" w:after="120"/>
       </w:pPr>
-      <w:bookmarkStart w:id="55" w:name="_Toc236974979"/>
+      <w:bookmarkStart w:id="55" w:name="_Toc236976809"/>
       <w:r>
         <w:t>A.3 Qué se entrega</w:t>
       </w:r>
@@ -23111,7 +23210,7 @@
         <w:pStyle w:val="Heading2"/>
         <w:spacing w:before="260" w:after="120"/>
       </w:pPr>
-      <w:bookmarkStart w:id="56" w:name="_Toc236974980"/>
+      <w:bookmarkStart w:id="56" w:name="_Toc236976810"/>
       <w:r>
         <w:t>Cómo reproducir cada demostración</w:t>
       </w:r>
@@ -23196,7 +23295,7 @@
       </w:r>
     </w:p>
     <w:sectPr>
-      <w:footerReference w:type="default" r:id="rId31"/>
+      <w:footerReference w:type="default" r:id="rId40"/>
       <w:pgSz w:w="12240" w:h="15840"/>
       <w:pgMar w:top="1440" w:right="1440" w:bottom="1440" w:left="1440" w:header="708" w:footer="708" w:gutter="0"/>
       <w:cols w:space="720"/>
@@ -23310,10 +23409,96 @@
 <file path=word/numbering.xml><?xml version="1.0" encoding="utf-8"?>
 <w:numbering xmlns:wpc="http://schemas.microsoft.com/office/word/2010/wordprocessingCanvas" xmlns:cx="http://schemas.microsoft.com/office/drawing/2014/chartex" xmlns:cx1="http://schemas.microsoft.com/office/drawing/2015/9/8/chartex" xmlns:cx2="http://schemas.microsoft.com/office/drawing/2015/10/21/chartex" xmlns:cx3="http://schemas.microsoft.com/office/drawing/2016/5/9/chartex" xmlns:cx4="http://schemas.microsoft.com/office/drawing/2016/5/10/chartex" xmlns:cx5="http://schemas.microsoft.com/office/drawing/2016/5/11/chartex" xmlns:cx6="http://schemas.microsoft.com/office/drawing/2016/5/12/chartex" xmlns:cx7="http://schemas.microsoft.com/office/drawing/2016/5/13/chartex" xmlns:cx8="http://schemas.microsoft.com/office/drawing/2016/5/14/chartex" xmlns:mc="http://schemas.openxmlformats.org/markup-compatibility/2006" xmlns:aink="http://schemas.microsoft.com/office/drawing/2016/ink" xmlns:am3d="http://schemas.microsoft.com/office/drawing/2017/model3d" xmlns:o="urn:schemas-microsoft-com:office:office" xmlns:oel="http://schemas.microsoft.com/office/2019/extlst" xmlns:r="http://schemas.openxmlformats.org/officeDocument/2006/relationships" xmlns:m="http://schemas.openxmlformats.org/officeDocument/2006/math" xmlns:v="urn:schemas-microsoft-com:vml" xmlns:wp14="http://schemas.microsoft.com/office/word/2010/wordprocessingDrawing" xmlns:wp="http://schemas.openxmlformats.org/drawingml/2006/wordprocessingDrawing" xmlns:w10="urn:schemas-microsoft-com:office:word" xmlns:w="http://schemas.openxmlformats.org/wordprocessingml/2006/main" xmlns:w14="http://schemas.microsoft.com/office/word/2010/wordml" xmlns:w15="http://schemas.microsoft.com/office/word/2012/wordml" xmlns:w16cei="http://schemas.microsoft.com/office/word/2026/wordml/cei" xmlns:w16cex="http://schemas.microsoft.com/office/word/2018/wordml/cex" xmlns:w16cid="http://schemas.microsoft.com/office/word/2016/wordml/cid" xmlns:w16="http://schemas.microsoft.com/office/word/2018/wordml" xmlns:w16du="http://schemas.microsoft.com/office/word/2023/wordml/word16du" xmlns:w16sdtdh="http://schemas.microsoft.com/office/word/2020/wordml/sdtdatahash" xmlns:w16sdtfl="http://schemas.microsoft.com/office/word/2024/wordml/sdtformatlock" xmlns:w16se="http://schemas.microsoft.com/office/word/2015/wordml/symex" xmlns:wpg="http://schemas.microsoft.com/office/word/2010/wordprocessingGroup" xmlns:wpi="http://schemas.microsoft.com/office/word/2010/wordprocessingInk" xmlns:wne="http://schemas.microsoft.com/office/word/2006/wordml" xmlns:wps="http://schemas.microsoft.com/office/word/2010/wordprocessingShape" mc:Ignorable="w14 w15 w16se w16cid w16 w16cex w16sdtdh w16sdtfl w16du wp14">
   <w:abstractNum w:abstractNumId="0" w15:restartNumberingAfterBreak="0">
-    <w:nsid w:val="39275C1A"/>
+    <w:nsid w:val="03C95446"/>
     <w:multiLevelType w:val="hybridMultilevel"/>
-    <w:tmpl w:val="4D7E3330"/>
-    <w:lvl w:ilvl="0" w:tplc="3EFE2144">
+    <w:tmpl w:val="D1926C72"/>
+    <w:lvl w:ilvl="0" w:tplc="A850A86A">
+      <w:start w:val="1"/>
+      <w:numFmt w:val="bullet"/>
+      <w:lvlText w:val="●"/>
+      <w:lvlJc w:val="left"/>
+      <w:pPr>
+        <w:ind w:left="720" w:hanging="360"/>
+      </w:pPr>
+    </w:lvl>
+    <w:lvl w:ilvl="1" w:tplc="97A88096">
+      <w:start w:val="1"/>
+      <w:numFmt w:val="bullet"/>
+      <w:lvlText w:val="○"/>
+      <w:lvlJc w:val="left"/>
+      <w:pPr>
+        <w:ind w:left="1440" w:hanging="360"/>
+      </w:pPr>
+    </w:lvl>
+    <w:lvl w:ilvl="2" w:tplc="9280C28A">
+      <w:start w:val="1"/>
+      <w:numFmt w:val="bullet"/>
+      <w:lvlText w:val="■"/>
+      <w:lvlJc w:val="left"/>
+      <w:pPr>
+        <w:ind w:left="2160" w:hanging="360"/>
+      </w:pPr>
+    </w:lvl>
+    <w:lvl w:ilvl="3" w:tplc="B87868C4">
+      <w:start w:val="1"/>
+      <w:numFmt w:val="bullet"/>
+      <w:lvlText w:val="●"/>
+      <w:lvlJc w:val="left"/>
+      <w:pPr>
+        <w:ind w:left="2880" w:hanging="360"/>
+      </w:pPr>
+    </w:lvl>
+    <w:lvl w:ilvl="4" w:tplc="8B9450F0">
+      <w:start w:val="1"/>
+      <w:numFmt w:val="bullet"/>
+      <w:lvlText w:val="○"/>
+      <w:lvlJc w:val="left"/>
+      <w:pPr>
+        <w:ind w:left="3600" w:hanging="360"/>
+      </w:pPr>
+    </w:lvl>
+    <w:lvl w:ilvl="5" w:tplc="98B02E9A">
+      <w:start w:val="1"/>
+      <w:numFmt w:val="bullet"/>
+      <w:lvlText w:val="■"/>
+      <w:lvlJc w:val="left"/>
+      <w:pPr>
+        <w:ind w:left="4320" w:hanging="360"/>
+      </w:pPr>
+    </w:lvl>
+    <w:lvl w:ilvl="6" w:tplc="44D05042">
+      <w:start w:val="1"/>
+      <w:numFmt w:val="bullet"/>
+      <w:lvlText w:val="●"/>
+      <w:lvlJc w:val="left"/>
+      <w:pPr>
+        <w:ind w:left="5040" w:hanging="360"/>
+      </w:pPr>
+    </w:lvl>
+    <w:lvl w:ilvl="7" w:tplc="60761F14">
+      <w:start w:val="1"/>
+      <w:numFmt w:val="bullet"/>
+      <w:lvlText w:val="●"/>
+      <w:lvlJc w:val="left"/>
+      <w:pPr>
+        <w:ind w:left="5760" w:hanging="360"/>
+      </w:pPr>
+    </w:lvl>
+    <w:lvl w:ilvl="8" w:tplc="8FF2B614">
+      <w:start w:val="1"/>
+      <w:numFmt w:val="bullet"/>
+      <w:lvlText w:val="●"/>
+      <w:lvlJc w:val="left"/>
+      <w:pPr>
+        <w:ind w:left="6480" w:hanging="360"/>
+      </w:pPr>
+    </w:lvl>
+  </w:abstractNum>
+  <w:abstractNum w:abstractNumId="1" w15:restartNumberingAfterBreak="0">
+    <w:nsid w:val="610E1284"/>
+    <w:multiLevelType w:val="hybridMultilevel"/>
+    <w:tmpl w:val="2F38EC0A"/>
+    <w:lvl w:ilvl="0" w:tplc="C9DCA2B6">
       <w:start w:val="1"/>
       <w:numFmt w:val="bullet"/>
       <w:lvlText w:val="●"/>
@@ -23327,7 +23512,7 @@
         <w:szCs w:val="16"/>
       </w:rPr>
     </w:lvl>
-    <w:lvl w:ilvl="1" w:tplc="82C07918">
+    <w:lvl w:ilvl="1" w:tplc="A2D6732E">
       <w:start w:val="1"/>
       <w:numFmt w:val="bullet"/>
       <w:lvlText w:val="○"/>
@@ -23336,136 +23521,50 @@
         <w:ind w:left="920" w:hanging="260"/>
       </w:pPr>
     </w:lvl>
-    <w:lvl w:ilvl="2" w:tplc="1E8E7B16">
+    <w:lvl w:ilvl="2" w:tplc="0DB2EB6C">
       <w:numFmt w:val="decimal"/>
       <w:lvlText w:val=""/>
       <w:lvlJc w:val="left"/>
     </w:lvl>
-    <w:lvl w:ilvl="3" w:tplc="745C662A">
+    <w:lvl w:ilvl="3" w:tplc="268C313A">
       <w:numFmt w:val="decimal"/>
       <w:lvlText w:val=""/>
       <w:lvlJc w:val="left"/>
     </w:lvl>
-    <w:lvl w:ilvl="4" w:tplc="B91841E0">
+    <w:lvl w:ilvl="4" w:tplc="0A22206A">
       <w:numFmt w:val="decimal"/>
       <w:lvlText w:val=""/>
       <w:lvlJc w:val="left"/>
     </w:lvl>
-    <w:lvl w:ilvl="5" w:tplc="AD588D26">
+    <w:lvl w:ilvl="5" w:tplc="07D0220C">
       <w:numFmt w:val="decimal"/>
       <w:lvlText w:val=""/>
       <w:lvlJc w:val="left"/>
     </w:lvl>
-    <w:lvl w:ilvl="6" w:tplc="80A6F548">
+    <w:lvl w:ilvl="6" w:tplc="8E0CF9FC">
       <w:numFmt w:val="decimal"/>
       <w:lvlText w:val=""/>
       <w:lvlJc w:val="left"/>
     </w:lvl>
-    <w:lvl w:ilvl="7" w:tplc="9378E276">
+    <w:lvl w:ilvl="7" w:tplc="ED5A3832">
       <w:numFmt w:val="decimal"/>
       <w:lvlText w:val=""/>
       <w:lvlJc w:val="left"/>
     </w:lvl>
-    <w:lvl w:ilvl="8" w:tplc="5B227F58">
+    <w:lvl w:ilvl="8" w:tplc="4E0807CA">
       <w:numFmt w:val="decimal"/>
       <w:lvlText w:val=""/>
       <w:lvlJc w:val="left"/>
     </w:lvl>
   </w:abstractNum>
-  <w:abstractNum w:abstractNumId="1" w15:restartNumberingAfterBreak="0">
-    <w:nsid w:val="74995762"/>
-    <w:multiLevelType w:val="hybridMultilevel"/>
-    <w:tmpl w:val="6ABE859E"/>
-    <w:lvl w:ilvl="0" w:tplc="9BB4C3AC">
-      <w:start w:val="1"/>
-      <w:numFmt w:val="bullet"/>
-      <w:lvlText w:val="●"/>
-      <w:lvlJc w:val="left"/>
-      <w:pPr>
-        <w:ind w:left="720" w:hanging="360"/>
-      </w:pPr>
-    </w:lvl>
-    <w:lvl w:ilvl="1" w:tplc="4938817E">
-      <w:start w:val="1"/>
-      <w:numFmt w:val="bullet"/>
-      <w:lvlText w:val="○"/>
-      <w:lvlJc w:val="left"/>
-      <w:pPr>
-        <w:ind w:left="1440" w:hanging="360"/>
-      </w:pPr>
-    </w:lvl>
-    <w:lvl w:ilvl="2" w:tplc="2C2AC0B2">
-      <w:start w:val="1"/>
-      <w:numFmt w:val="bullet"/>
-      <w:lvlText w:val="■"/>
-      <w:lvlJc w:val="left"/>
-      <w:pPr>
-        <w:ind w:left="2160" w:hanging="360"/>
-      </w:pPr>
-    </w:lvl>
-    <w:lvl w:ilvl="3" w:tplc="1DD4D020">
-      <w:start w:val="1"/>
-      <w:numFmt w:val="bullet"/>
-      <w:lvlText w:val="●"/>
-      <w:lvlJc w:val="left"/>
-      <w:pPr>
-        <w:ind w:left="2880" w:hanging="360"/>
-      </w:pPr>
-    </w:lvl>
-    <w:lvl w:ilvl="4" w:tplc="E9ECB8FA">
-      <w:start w:val="1"/>
-      <w:numFmt w:val="bullet"/>
-      <w:lvlText w:val="○"/>
-      <w:lvlJc w:val="left"/>
-      <w:pPr>
-        <w:ind w:left="3600" w:hanging="360"/>
-      </w:pPr>
-    </w:lvl>
-    <w:lvl w:ilvl="5" w:tplc="C5ACF78C">
-      <w:start w:val="1"/>
-      <w:numFmt w:val="bullet"/>
-      <w:lvlText w:val="■"/>
-      <w:lvlJc w:val="left"/>
-      <w:pPr>
-        <w:ind w:left="4320" w:hanging="360"/>
-      </w:pPr>
-    </w:lvl>
-    <w:lvl w:ilvl="6" w:tplc="6CD6DD26">
-      <w:start w:val="1"/>
-      <w:numFmt w:val="bullet"/>
-      <w:lvlText w:val="●"/>
-      <w:lvlJc w:val="left"/>
-      <w:pPr>
-        <w:ind w:left="5040" w:hanging="360"/>
-      </w:pPr>
-    </w:lvl>
-    <w:lvl w:ilvl="7" w:tplc="BDB43F86">
-      <w:start w:val="1"/>
-      <w:numFmt w:val="bullet"/>
-      <w:lvlText w:val="●"/>
-      <w:lvlJc w:val="left"/>
-      <w:pPr>
-        <w:ind w:left="5760" w:hanging="360"/>
-      </w:pPr>
-    </w:lvl>
-    <w:lvl w:ilvl="8" w:tplc="69CEA072">
-      <w:start w:val="1"/>
-      <w:numFmt w:val="bullet"/>
-      <w:lvlText w:val="●"/>
-      <w:lvlJc w:val="left"/>
-      <w:pPr>
-        <w:ind w:left="6480" w:hanging="360"/>
-      </w:pPr>
-    </w:lvl>
-  </w:abstractNum>
-  <w:num w:numId="1" w16cid:durableId="1047221543">
-    <w:abstractNumId w:val="1"/>
+  <w:num w:numId="1" w16cid:durableId="336078840">
+    <w:abstractNumId w:val="0"/>
     <w:lvlOverride w:ilvl="0">
       <w:startOverride w:val="1"/>
     </w:lvlOverride>
   </w:num>
-  <w:num w:numId="2" w16cid:durableId="713119164">
-    <w:abstractNumId w:val="0"/>
+  <w:num w:numId="2" w16cid:durableId="446853319">
+    <w:abstractNumId w:val="1"/>
     <w:lvlOverride w:ilvl="0">
       <w:startOverride w:val="1"/>
     </w:lvlOverride>
@@ -24081,7 +24180,7 @@
     <w:autoRedefine/>
     <w:uiPriority w:val="39"/>
     <w:unhideWhenUsed/>
-    <w:rsid w:val="000E71B5"/>
+    <w:rsid w:val="00B131FD"/>
     <w:pPr>
       <w:spacing w:after="100"/>
     </w:pPr>
@@ -24093,7 +24192,7 @@
     <w:autoRedefine/>
     <w:uiPriority w:val="39"/>
     <w:unhideWhenUsed/>
-    <w:rsid w:val="000E71B5"/>
+    <w:rsid w:val="00B131FD"/>
     <w:pPr>
       <w:spacing w:after="100"/>
       <w:ind w:left="220"/>
@@ -24106,7 +24205,7 @@
     <w:autoRedefine/>
     <w:uiPriority w:val="39"/>
     <w:unhideWhenUsed/>
-    <w:rsid w:val="000E71B5"/>
+    <w:rsid w:val="00B131FD"/>
     <w:pPr>
       <w:spacing w:after="100"/>
       <w:ind w:left="440"/>

</xml_diff>

<commit_message>
v2.0: fase partida 120/240 V, respaldo de bateria del monitor y deslastre de carga
</commit_message>
<xml_diff>
--- a/SmartPowerRD_Investigacion_CristianCarrera_2024-1932.docx
+++ b/SmartPowerRD_Investigacion_CristianCarrera_2024-1932.docx
@@ -4,8 +4,52 @@
   <w:body>
     <w:p>
       <w:pPr>
-        <w:spacing w:after="200"/>
-      </w:pPr>
+        <w:spacing w:before="200" w:after="260"/>
+        <w:jc w:val="center"/>
+      </w:pPr>
+      <w:r>
+        <w:rPr>
+          <w:noProof/>
+        </w:rPr>
+        <w:drawing>
+          <wp:inline distT="0" distB="0" distL="0" distR="0" wp14:anchorId="72D18C94" wp14:editId="6C0B071E">
+            <wp:extent cx="1809750" cy="1047750"/>
+            <wp:effectExtent l="0" t="0" r="0" b="0"/>
+            <wp:docPr id="1" name="Picture 1"/>
+            <wp:cNvGraphicFramePr>
+              <a:graphicFrameLocks xmlns:a="http://schemas.openxmlformats.org/drawingml/2006/main" noChangeAspect="1"/>
+            </wp:cNvGraphicFramePr>
+            <a:graphic xmlns:a="http://schemas.openxmlformats.org/drawingml/2006/main">
+              <a:graphicData uri="http://schemas.openxmlformats.org/drawingml/2006/picture">
+                <pic:pic xmlns:pic="http://schemas.openxmlformats.org/drawingml/2006/picture">
+                  <pic:nvPicPr>
+                    <pic:cNvPr id="0" name=""/>
+                    <pic:cNvPicPr>
+                      <a:picLocks noChangeAspect="1" noChangeArrowheads="1"/>
+                    </pic:cNvPicPr>
+                  </pic:nvPicPr>
+                  <pic:blipFill>
+                    <a:blip r:embed="rId7"/>
+                    <a:srcRect/>
+                    <a:stretch>
+                      <a:fillRect/>
+                    </a:stretch>
+                  </pic:blipFill>
+                  <pic:spPr bwMode="auto">
+                    <a:xfrm>
+                      <a:off x="0" y="0"/>
+                      <a:ext cx="1809750" cy="1047750"/>
+                    </a:xfrm>
+                    <a:prstGeom prst="rect">
+                      <a:avLst/>
+                    </a:prstGeom>
+                  </pic:spPr>
+                </pic:pic>
+              </a:graphicData>
+            </a:graphic>
+          </wp:inline>
+        </w:drawing>
+      </w:r>
     </w:p>
     <w:p>
       <w:pPr>
@@ -759,7 +803,7 @@
         </w:pBdr>
         <w:spacing w:before="360" w:after="180"/>
       </w:pPr>
-      <w:bookmarkStart w:id="0" w:name="_Toc236976754"/>
+      <w:bookmarkStart w:id="0" w:name="_Toc237016795"/>
       <w:r>
         <w:t>Índice de contenido</w:t>
       </w:r>
@@ -768,7 +812,7 @@
     <w:sdt>
       <w:sdtPr>
         <w:alias w:val="Tabla de contenido"/>
-        <w:id w:val="1577941326"/>
+        <w:id w:val="-1266380396"/>
       </w:sdtPr>
       <w:sdtEndPr/>
       <w:sdtContent>
@@ -797,7 +841,7 @@
           <w:r>
             <w:fldChar w:fldCharType="separate"/>
           </w:r>
-          <w:hyperlink w:anchor="_Toc236976754" w:history="1">
+          <w:hyperlink w:anchor="_Toc237016795" w:history="1">
             <w:r>
               <w:rPr>
                 <w:rStyle w:val="Hyperlink"/>
@@ -821,7 +865,7 @@
               <w:rPr>
                 <w:noProof/>
               </w:rPr>
-              <w:instrText xml:space="preserve"> PAGEREF _Toc236976754 \h </w:instrText>
+              <w:instrText xml:space="preserve"> PAGEREF _Toc237016795 \h </w:instrText>
             </w:r>
             <w:r>
               <w:rPr>
@@ -838,7 +882,7 @@
               <w:rPr>
                 <w:noProof/>
               </w:rPr>
-              <w:t>2</w:t>
+              <w:t>3</w:t>
             </w:r>
             <w:r>
               <w:rPr>
@@ -864,7 +908,7 @@
               <w14:ligatures w14:val="standardContextual"/>
             </w:rPr>
           </w:pPr>
-          <w:hyperlink w:anchor="_Toc236976755" w:history="1">
+          <w:hyperlink w:anchor="_Toc237016796" w:history="1">
             <w:r>
               <w:rPr>
                 <w:rStyle w:val="Hyperlink"/>
@@ -888,7 +932,7 @@
               <w:rPr>
                 <w:noProof/>
               </w:rPr>
-              <w:instrText xml:space="preserve"> PAGEREF _Toc236976755 \h </w:instrText>
+              <w:instrText xml:space="preserve"> PAGEREF _Toc237016796 \h </w:instrText>
             </w:r>
             <w:r>
               <w:rPr>
@@ -905,7 +949,7 @@
               <w:rPr>
                 <w:noProof/>
               </w:rPr>
-              <w:t>4</w:t>
+              <w:t>5</w:t>
             </w:r>
             <w:r>
               <w:rPr>
@@ -931,7 +975,7 @@
               <w14:ligatures w14:val="standardContextual"/>
             </w:rPr>
           </w:pPr>
-          <w:hyperlink w:anchor="_Toc236976756" w:history="1">
+          <w:hyperlink w:anchor="_Toc237016797" w:history="1">
             <w:r>
               <w:rPr>
                 <w:rStyle w:val="Hyperlink"/>
@@ -955,7 +999,7 @@
               <w:rPr>
                 <w:noProof/>
               </w:rPr>
-              <w:instrText xml:space="preserve"> PAGEREF _Toc236976756 \h </w:instrText>
+              <w:instrText xml:space="preserve"> PAGEREF _Toc237016797 \h </w:instrText>
             </w:r>
             <w:r>
               <w:rPr>
@@ -972,7 +1016,7 @@
               <w:rPr>
                 <w:noProof/>
               </w:rPr>
-              <w:t>4</w:t>
+              <w:t>5</w:t>
             </w:r>
             <w:r>
               <w:rPr>
@@ -998,7 +1042,7 @@
               <w14:ligatures w14:val="standardContextual"/>
             </w:rPr>
           </w:pPr>
-          <w:hyperlink w:anchor="_Toc236976757" w:history="1">
+          <w:hyperlink w:anchor="_Toc237016798" w:history="1">
             <w:r>
               <w:rPr>
                 <w:rStyle w:val="Hyperlink"/>
@@ -1022,7 +1066,7 @@
               <w:rPr>
                 <w:noProof/>
               </w:rPr>
-              <w:instrText xml:space="preserve"> PAGEREF _Toc236976757 \h </w:instrText>
+              <w:instrText xml:space="preserve"> PAGEREF _Toc237016798 \h </w:instrText>
             </w:r>
             <w:r>
               <w:rPr>
@@ -1039,7 +1083,7 @@
               <w:rPr>
                 <w:noProof/>
               </w:rPr>
-              <w:t>4</w:t>
+              <w:t>5</w:t>
             </w:r>
             <w:r>
               <w:rPr>
@@ -1065,7 +1109,7 @@
               <w14:ligatures w14:val="standardContextual"/>
             </w:rPr>
           </w:pPr>
-          <w:hyperlink w:anchor="_Toc236976758" w:history="1">
+          <w:hyperlink w:anchor="_Toc237016799" w:history="1">
             <w:r>
               <w:rPr>
                 <w:rStyle w:val="Hyperlink"/>
@@ -1089,7 +1133,7 @@
               <w:rPr>
                 <w:noProof/>
               </w:rPr>
-              <w:instrText xml:space="preserve"> PAGEREF _Toc236976758 \h </w:instrText>
+              <w:instrText xml:space="preserve"> PAGEREF _Toc237016799 \h </w:instrText>
             </w:r>
             <w:r>
               <w:rPr>
@@ -1106,7 +1150,7 @@
               <w:rPr>
                 <w:noProof/>
               </w:rPr>
-              <w:t>4</w:t>
+              <w:t>5</w:t>
             </w:r>
             <w:r>
               <w:rPr>
@@ -1132,7 +1176,7 @@
               <w14:ligatures w14:val="standardContextual"/>
             </w:rPr>
           </w:pPr>
-          <w:hyperlink w:anchor="_Toc236976759" w:history="1">
+          <w:hyperlink w:anchor="_Toc237016800" w:history="1">
             <w:r>
               <w:rPr>
                 <w:rStyle w:val="Hyperlink"/>
@@ -1156,7 +1200,7 @@
               <w:rPr>
                 <w:noProof/>
               </w:rPr>
-              <w:instrText xml:space="preserve"> PAGEREF _Toc236976759 \h </w:instrText>
+              <w:instrText xml:space="preserve"> PAGEREF _Toc237016800 \h </w:instrText>
             </w:r>
             <w:r>
               <w:rPr>
@@ -1173,7 +1217,7 @@
               <w:rPr>
                 <w:noProof/>
               </w:rPr>
-              <w:t>5</w:t>
+              <w:t>6</w:t>
             </w:r>
             <w:r>
               <w:rPr>
@@ -1199,7 +1243,7 @@
               <w14:ligatures w14:val="standardContextual"/>
             </w:rPr>
           </w:pPr>
-          <w:hyperlink w:anchor="_Toc236976760" w:history="1">
+          <w:hyperlink w:anchor="_Toc237016801" w:history="1">
             <w:r>
               <w:rPr>
                 <w:rStyle w:val="Hyperlink"/>
@@ -1223,7 +1267,7 @@
               <w:rPr>
                 <w:noProof/>
               </w:rPr>
-              <w:instrText xml:space="preserve"> PAGEREF _Toc236976760 \h </w:instrText>
+              <w:instrText xml:space="preserve"> PAGEREF _Toc237016801 \h </w:instrText>
             </w:r>
             <w:r>
               <w:rPr>
@@ -1240,7 +1284,7 @@
               <w:rPr>
                 <w:noProof/>
               </w:rPr>
-              <w:t>5</w:t>
+              <w:t>6</w:t>
             </w:r>
             <w:r>
               <w:rPr>
@@ -1266,7 +1310,7 @@
               <w14:ligatures w14:val="standardContextual"/>
             </w:rPr>
           </w:pPr>
-          <w:hyperlink w:anchor="_Toc236976761" w:history="1">
+          <w:hyperlink w:anchor="_Toc237016802" w:history="1">
             <w:r>
               <w:rPr>
                 <w:rStyle w:val="Hyperlink"/>
@@ -1290,7 +1334,7 @@
               <w:rPr>
                 <w:noProof/>
               </w:rPr>
-              <w:instrText xml:space="preserve"> PAGEREF _Toc236976761 \h </w:instrText>
+              <w:instrText xml:space="preserve"> PAGEREF _Toc237016802 \h </w:instrText>
             </w:r>
             <w:r>
               <w:rPr>
@@ -1307,7 +1351,7 @@
               <w:rPr>
                 <w:noProof/>
               </w:rPr>
-              <w:t>5</w:t>
+              <w:t>6</w:t>
             </w:r>
             <w:r>
               <w:rPr>
@@ -1333,7 +1377,7 @@
               <w14:ligatures w14:val="standardContextual"/>
             </w:rPr>
           </w:pPr>
-          <w:hyperlink w:anchor="_Toc236976762" w:history="1">
+          <w:hyperlink w:anchor="_Toc237016803" w:history="1">
             <w:r>
               <w:rPr>
                 <w:rStyle w:val="Hyperlink"/>
@@ -1357,7 +1401,7 @@
               <w:rPr>
                 <w:noProof/>
               </w:rPr>
-              <w:instrText xml:space="preserve"> PAGEREF _Toc236976762 \h </w:instrText>
+              <w:instrText xml:space="preserve"> PAGEREF _Toc237016803 \h </w:instrText>
             </w:r>
             <w:r>
               <w:rPr>
@@ -1374,7 +1418,7 @@
               <w:rPr>
                 <w:noProof/>
               </w:rPr>
-              <w:t>5</w:t>
+              <w:t>6</w:t>
             </w:r>
             <w:r>
               <w:rPr>
@@ -1400,7 +1444,7 @@
               <w14:ligatures w14:val="standardContextual"/>
             </w:rPr>
           </w:pPr>
-          <w:hyperlink w:anchor="_Toc236976763" w:history="1">
+          <w:hyperlink w:anchor="_Toc237016804" w:history="1">
             <w:r>
               <w:rPr>
                 <w:rStyle w:val="Hyperlink"/>
@@ -1424,7 +1468,7 @@
               <w:rPr>
                 <w:noProof/>
               </w:rPr>
-              <w:instrText xml:space="preserve"> PAGEREF _Toc236976763 \h </w:instrText>
+              <w:instrText xml:space="preserve"> PAGEREF _Toc237016804 \h </w:instrText>
             </w:r>
             <w:r>
               <w:rPr>
@@ -1441,7 +1485,7 @@
               <w:rPr>
                 <w:noProof/>
               </w:rPr>
-              <w:t>7</w:t>
+              <w:t>8</w:t>
             </w:r>
             <w:r>
               <w:rPr>
@@ -1467,7 +1511,7 @@
               <w14:ligatures w14:val="standardContextual"/>
             </w:rPr>
           </w:pPr>
-          <w:hyperlink w:anchor="_Toc236976764" w:history="1">
+          <w:hyperlink w:anchor="_Toc237016805" w:history="1">
             <w:r>
               <w:rPr>
                 <w:rStyle w:val="Hyperlink"/>
@@ -1491,7 +1535,7 @@
               <w:rPr>
                 <w:noProof/>
               </w:rPr>
-              <w:instrText xml:space="preserve"> PAGEREF _Toc236976764 \h </w:instrText>
+              <w:instrText xml:space="preserve"> PAGEREF _Toc237016805 \h </w:instrText>
             </w:r>
             <w:r>
               <w:rPr>
@@ -1508,7 +1552,7 @@
               <w:rPr>
                 <w:noProof/>
               </w:rPr>
-              <w:t>7</w:t>
+              <w:t>8</w:t>
             </w:r>
             <w:r>
               <w:rPr>
@@ -1534,7 +1578,7 @@
               <w14:ligatures w14:val="standardContextual"/>
             </w:rPr>
           </w:pPr>
-          <w:hyperlink w:anchor="_Toc236976765" w:history="1">
+          <w:hyperlink w:anchor="_Toc237016806" w:history="1">
             <w:r>
               <w:rPr>
                 <w:rStyle w:val="Hyperlink"/>
@@ -1558,7 +1602,7 @@
               <w:rPr>
                 <w:noProof/>
               </w:rPr>
-              <w:instrText xml:space="preserve"> PAGEREF _Toc236976765 \h </w:instrText>
+              <w:instrText xml:space="preserve"> PAGEREF _Toc237016806 \h </w:instrText>
             </w:r>
             <w:r>
               <w:rPr>
@@ -1575,7 +1619,7 @@
               <w:rPr>
                 <w:noProof/>
               </w:rPr>
-              <w:t>7</w:t>
+              <w:t>8</w:t>
             </w:r>
             <w:r>
               <w:rPr>
@@ -1601,7 +1645,7 @@
               <w14:ligatures w14:val="standardContextual"/>
             </w:rPr>
           </w:pPr>
-          <w:hyperlink w:anchor="_Toc236976766" w:history="1">
+          <w:hyperlink w:anchor="_Toc237016807" w:history="1">
             <w:r>
               <w:rPr>
                 <w:rStyle w:val="Hyperlink"/>
@@ -1625,7 +1669,7 @@
               <w:rPr>
                 <w:noProof/>
               </w:rPr>
-              <w:instrText xml:space="preserve"> PAGEREF _Toc236976766 \h </w:instrText>
+              <w:instrText xml:space="preserve"> PAGEREF _Toc237016807 \h </w:instrText>
             </w:r>
             <w:r>
               <w:rPr>
@@ -1642,7 +1686,7 @@
               <w:rPr>
                 <w:noProof/>
               </w:rPr>
-              <w:t>8</w:t>
+              <w:t>9</w:t>
             </w:r>
             <w:r>
               <w:rPr>
@@ -1668,7 +1712,7 @@
               <w14:ligatures w14:val="standardContextual"/>
             </w:rPr>
           </w:pPr>
-          <w:hyperlink w:anchor="_Toc236976767" w:history="1">
+          <w:hyperlink w:anchor="_Toc237016808" w:history="1">
             <w:r>
               <w:rPr>
                 <w:rStyle w:val="Hyperlink"/>
@@ -1692,7 +1736,7 @@
               <w:rPr>
                 <w:noProof/>
               </w:rPr>
-              <w:instrText xml:space="preserve"> PAGEREF _Toc236976767 \h </w:instrText>
+              <w:instrText xml:space="preserve"> PAGEREF _Toc237016808 \h </w:instrText>
             </w:r>
             <w:r>
               <w:rPr>
@@ -1709,7 +1753,7 @@
               <w:rPr>
                 <w:noProof/>
               </w:rPr>
-              <w:t>8</w:t>
+              <w:t>9</w:t>
             </w:r>
             <w:r>
               <w:rPr>
@@ -1735,7 +1779,7 @@
               <w14:ligatures w14:val="standardContextual"/>
             </w:rPr>
           </w:pPr>
-          <w:hyperlink w:anchor="_Toc236976768" w:history="1">
+          <w:hyperlink w:anchor="_Toc237016809" w:history="1">
             <w:r>
               <w:rPr>
                 <w:rStyle w:val="Hyperlink"/>
@@ -1759,7 +1803,7 @@
               <w:rPr>
                 <w:noProof/>
               </w:rPr>
-              <w:instrText xml:space="preserve"> PAGEREF _Toc236976768 \h </w:instrText>
+              <w:instrText xml:space="preserve"> PAGEREF _Toc237016809 \h </w:instrText>
             </w:r>
             <w:r>
               <w:rPr>
@@ -1776,7 +1820,7 @@
               <w:rPr>
                 <w:noProof/>
               </w:rPr>
-              <w:t>9</w:t>
+              <w:t>10</w:t>
             </w:r>
             <w:r>
               <w:rPr>
@@ -1802,7 +1846,7 @@
               <w14:ligatures w14:val="standardContextual"/>
             </w:rPr>
           </w:pPr>
-          <w:hyperlink w:anchor="_Toc236976769" w:history="1">
+          <w:hyperlink w:anchor="_Toc237016810" w:history="1">
             <w:r>
               <w:rPr>
                 <w:rStyle w:val="Hyperlink"/>
@@ -1826,7 +1870,7 @@
               <w:rPr>
                 <w:noProof/>
               </w:rPr>
-              <w:instrText xml:space="preserve"> PAGEREF _Toc236976769 \h </w:instrText>
+              <w:instrText xml:space="preserve"> PAGEREF _Toc237016810 \h </w:instrText>
             </w:r>
             <w:r>
               <w:rPr>
@@ -1843,7 +1887,7 @@
               <w:rPr>
                 <w:noProof/>
               </w:rPr>
-              <w:t>9</w:t>
+              <w:t>10</w:t>
             </w:r>
             <w:r>
               <w:rPr>
@@ -1869,7 +1913,7 @@
               <w14:ligatures w14:val="standardContextual"/>
             </w:rPr>
           </w:pPr>
-          <w:hyperlink w:anchor="_Toc236976770" w:history="1">
+          <w:hyperlink w:anchor="_Toc237016811" w:history="1">
             <w:r>
               <w:rPr>
                 <w:rStyle w:val="Hyperlink"/>
@@ -1893,7 +1937,7 @@
               <w:rPr>
                 <w:noProof/>
               </w:rPr>
-              <w:instrText xml:space="preserve"> PAGEREF _Toc236976770 \h </w:instrText>
+              <w:instrText xml:space="preserve"> PAGEREF _Toc237016811 \h </w:instrText>
             </w:r>
             <w:r>
               <w:rPr>
@@ -1910,7 +1954,7 @@
               <w:rPr>
                 <w:noProof/>
               </w:rPr>
-              <w:t>9</w:t>
+              <w:t>10</w:t>
             </w:r>
             <w:r>
               <w:rPr>
@@ -1936,7 +1980,7 @@
               <w14:ligatures w14:val="standardContextual"/>
             </w:rPr>
           </w:pPr>
-          <w:hyperlink w:anchor="_Toc236976771" w:history="1">
+          <w:hyperlink w:anchor="_Toc237016812" w:history="1">
             <w:r>
               <w:rPr>
                 <w:rStyle w:val="Hyperlink"/>
@@ -1960,7 +2004,7 @@
               <w:rPr>
                 <w:noProof/>
               </w:rPr>
-              <w:instrText xml:space="preserve"> PAGEREF _Toc236976771 \h </w:instrText>
+              <w:instrText xml:space="preserve"> PAGEREF _Toc237016812 \h </w:instrText>
             </w:r>
             <w:r>
               <w:rPr>
@@ -1977,7 +2021,7 @@
               <w:rPr>
                 <w:noProof/>
               </w:rPr>
-              <w:t>9</w:t>
+              <w:t>10</w:t>
             </w:r>
             <w:r>
               <w:rPr>
@@ -2003,7 +2047,7 @@
               <w14:ligatures w14:val="standardContextual"/>
             </w:rPr>
           </w:pPr>
-          <w:hyperlink w:anchor="_Toc236976772" w:history="1">
+          <w:hyperlink w:anchor="_Toc237016813" w:history="1">
             <w:r>
               <w:rPr>
                 <w:rStyle w:val="Hyperlink"/>
@@ -2027,7 +2071,7 @@
               <w:rPr>
                 <w:noProof/>
               </w:rPr>
-              <w:instrText xml:space="preserve"> PAGEREF _Toc236976772 \h </w:instrText>
+              <w:instrText xml:space="preserve"> PAGEREF _Toc237016813 \h </w:instrText>
             </w:r>
             <w:r>
               <w:rPr>
@@ -2044,7 +2088,7 @@
               <w:rPr>
                 <w:noProof/>
               </w:rPr>
-              <w:t>11</w:t>
+              <w:t>12</w:t>
             </w:r>
             <w:r>
               <w:rPr>
@@ -2070,7 +2114,7 @@
               <w14:ligatures w14:val="standardContextual"/>
             </w:rPr>
           </w:pPr>
-          <w:hyperlink w:anchor="_Toc236976773" w:history="1">
+          <w:hyperlink w:anchor="_Toc237016814" w:history="1">
             <w:r>
               <w:rPr>
                 <w:rStyle w:val="Hyperlink"/>
@@ -2094,7 +2138,7 @@
               <w:rPr>
                 <w:noProof/>
               </w:rPr>
-              <w:instrText xml:space="preserve"> PAGEREF _Toc236976773 \h </w:instrText>
+              <w:instrText xml:space="preserve"> PAGEREF _Toc237016814 \h </w:instrText>
             </w:r>
             <w:r>
               <w:rPr>
@@ -2111,7 +2155,7 @@
               <w:rPr>
                 <w:noProof/>
               </w:rPr>
-              <w:t>11</w:t>
+              <w:t>12</w:t>
             </w:r>
             <w:r>
               <w:rPr>
@@ -2137,7 +2181,7 @@
               <w14:ligatures w14:val="standardContextual"/>
             </w:rPr>
           </w:pPr>
-          <w:hyperlink w:anchor="_Toc236976774" w:history="1">
+          <w:hyperlink w:anchor="_Toc237016815" w:history="1">
             <w:r>
               <w:rPr>
                 <w:rStyle w:val="Hyperlink"/>
@@ -2161,7 +2205,7 @@
               <w:rPr>
                 <w:noProof/>
               </w:rPr>
-              <w:instrText xml:space="preserve"> PAGEREF _Toc236976774 \h </w:instrText>
+              <w:instrText xml:space="preserve"> PAGEREF _Toc237016815 \h </w:instrText>
             </w:r>
             <w:r>
               <w:rPr>
@@ -2178,7 +2222,7 @@
               <w:rPr>
                 <w:noProof/>
               </w:rPr>
-              <w:t>11</w:t>
+              <w:t>12</w:t>
             </w:r>
             <w:r>
               <w:rPr>
@@ -2204,7 +2248,7 @@
               <w14:ligatures w14:val="standardContextual"/>
             </w:rPr>
           </w:pPr>
-          <w:hyperlink w:anchor="_Toc236976775" w:history="1">
+          <w:hyperlink w:anchor="_Toc237016816" w:history="1">
             <w:r>
               <w:rPr>
                 <w:rStyle w:val="Hyperlink"/>
@@ -2228,7 +2272,7 @@
               <w:rPr>
                 <w:noProof/>
               </w:rPr>
-              <w:instrText xml:space="preserve"> PAGEREF _Toc236976775 \h </w:instrText>
+              <w:instrText xml:space="preserve"> PAGEREF _Toc237016816 \h </w:instrText>
             </w:r>
             <w:r>
               <w:rPr>
@@ -2245,7 +2289,7 @@
               <w:rPr>
                 <w:noProof/>
               </w:rPr>
-              <w:t>11</w:t>
+              <w:t>12</w:t>
             </w:r>
             <w:r>
               <w:rPr>
@@ -2271,7 +2315,7 @@
               <w14:ligatures w14:val="standardContextual"/>
             </w:rPr>
           </w:pPr>
-          <w:hyperlink w:anchor="_Toc236976776" w:history="1">
+          <w:hyperlink w:anchor="_Toc237016817" w:history="1">
             <w:r>
               <w:rPr>
                 <w:rStyle w:val="Hyperlink"/>
@@ -2295,7 +2339,7 @@
               <w:rPr>
                 <w:noProof/>
               </w:rPr>
-              <w:instrText xml:space="preserve"> PAGEREF _Toc236976776 \h </w:instrText>
+              <w:instrText xml:space="preserve"> PAGEREF _Toc237016817 \h </w:instrText>
             </w:r>
             <w:r>
               <w:rPr>
@@ -2312,7 +2356,7 @@
               <w:rPr>
                 <w:noProof/>
               </w:rPr>
-              <w:t>12</w:t>
+              <w:t>13</w:t>
             </w:r>
             <w:r>
               <w:rPr>
@@ -2338,7 +2382,7 @@
               <w14:ligatures w14:val="standardContextual"/>
             </w:rPr>
           </w:pPr>
-          <w:hyperlink w:anchor="_Toc236976777" w:history="1">
+          <w:hyperlink w:anchor="_Toc237016818" w:history="1">
             <w:r>
               <w:rPr>
                 <w:rStyle w:val="Hyperlink"/>
@@ -2362,7 +2406,7 @@
               <w:rPr>
                 <w:noProof/>
               </w:rPr>
-              <w:instrText xml:space="preserve"> PAGEREF _Toc236976777 \h </w:instrText>
+              <w:instrText xml:space="preserve"> PAGEREF _Toc237016818 \h </w:instrText>
             </w:r>
             <w:r>
               <w:rPr>
@@ -2379,7 +2423,7 @@
               <w:rPr>
                 <w:noProof/>
               </w:rPr>
-              <w:t>12</w:t>
+              <w:t>13</w:t>
             </w:r>
             <w:r>
               <w:rPr>
@@ -2405,7 +2449,7 @@
               <w14:ligatures w14:val="standardContextual"/>
             </w:rPr>
           </w:pPr>
-          <w:hyperlink w:anchor="_Toc236976778" w:history="1">
+          <w:hyperlink w:anchor="_Toc237016819" w:history="1">
             <w:r>
               <w:rPr>
                 <w:rStyle w:val="Hyperlink"/>
@@ -2429,7 +2473,7 @@
               <w:rPr>
                 <w:noProof/>
               </w:rPr>
-              <w:instrText xml:space="preserve"> PAGEREF _Toc236976778 \h </w:instrText>
+              <w:instrText xml:space="preserve"> PAGEREF _Toc237016819 \h </w:instrText>
             </w:r>
             <w:r>
               <w:rPr>
@@ -2446,7 +2490,7 @@
               <w:rPr>
                 <w:noProof/>
               </w:rPr>
-              <w:t>13</w:t>
+              <w:t>14</w:t>
             </w:r>
             <w:r>
               <w:rPr>
@@ -2472,7 +2516,7 @@
               <w14:ligatures w14:val="standardContextual"/>
             </w:rPr>
           </w:pPr>
-          <w:hyperlink w:anchor="_Toc236976779" w:history="1">
+          <w:hyperlink w:anchor="_Toc237016820" w:history="1">
             <w:r>
               <w:rPr>
                 <w:rStyle w:val="Hyperlink"/>
@@ -2496,7 +2540,7 @@
               <w:rPr>
                 <w:noProof/>
               </w:rPr>
-              <w:instrText xml:space="preserve"> PAGEREF _Toc236976779 \h </w:instrText>
+              <w:instrText xml:space="preserve"> PAGEREF _Toc237016820 \h </w:instrText>
             </w:r>
             <w:r>
               <w:rPr>
@@ -2513,7 +2557,7 @@
               <w:rPr>
                 <w:noProof/>
               </w:rPr>
-              <w:t>14</w:t>
+              <w:t>15</w:t>
             </w:r>
             <w:r>
               <w:rPr>
@@ -2539,7 +2583,7 @@
               <w14:ligatures w14:val="standardContextual"/>
             </w:rPr>
           </w:pPr>
-          <w:hyperlink w:anchor="_Toc236976780" w:history="1">
+          <w:hyperlink w:anchor="_Toc237016821" w:history="1">
             <w:r>
               <w:rPr>
                 <w:rStyle w:val="Hyperlink"/>
@@ -2563,7 +2607,7 @@
               <w:rPr>
                 <w:noProof/>
               </w:rPr>
-              <w:instrText xml:space="preserve"> PAGEREF _Toc236976780 \h </w:instrText>
+              <w:instrText xml:space="preserve"> PAGEREF _Toc237016821 \h </w:instrText>
             </w:r>
             <w:r>
               <w:rPr>
@@ -2580,7 +2624,7 @@
               <w:rPr>
                 <w:noProof/>
               </w:rPr>
-              <w:t>14</w:t>
+              <w:t>15</w:t>
             </w:r>
             <w:r>
               <w:rPr>
@@ -2606,7 +2650,7 @@
               <w14:ligatures w14:val="standardContextual"/>
             </w:rPr>
           </w:pPr>
-          <w:hyperlink w:anchor="_Toc236976781" w:history="1">
+          <w:hyperlink w:anchor="_Toc237016822" w:history="1">
             <w:r>
               <w:rPr>
                 <w:rStyle w:val="Hyperlink"/>
@@ -2630,7 +2674,7 @@
               <w:rPr>
                 <w:noProof/>
               </w:rPr>
-              <w:instrText xml:space="preserve"> PAGEREF _Toc236976781 \h </w:instrText>
+              <w:instrText xml:space="preserve"> PAGEREF _Toc237016822 \h </w:instrText>
             </w:r>
             <w:r>
               <w:rPr>
@@ -2647,7 +2691,7 @@
               <w:rPr>
                 <w:noProof/>
               </w:rPr>
-              <w:t>14</w:t>
+              <w:t>15</w:t>
             </w:r>
             <w:r>
               <w:rPr>
@@ -2673,7 +2717,7 @@
               <w14:ligatures w14:val="standardContextual"/>
             </w:rPr>
           </w:pPr>
-          <w:hyperlink w:anchor="_Toc236976782" w:history="1">
+          <w:hyperlink w:anchor="_Toc237016823" w:history="1">
             <w:r>
               <w:rPr>
                 <w:rStyle w:val="Hyperlink"/>
@@ -2697,7 +2741,7 @@
               <w:rPr>
                 <w:noProof/>
               </w:rPr>
-              <w:instrText xml:space="preserve"> PAGEREF _Toc236976782 \h </w:instrText>
+              <w:instrText xml:space="preserve"> PAGEREF _Toc237016823 \h </w:instrText>
             </w:r>
             <w:r>
               <w:rPr>
@@ -2714,7 +2758,7 @@
               <w:rPr>
                 <w:noProof/>
               </w:rPr>
-              <w:t>15</w:t>
+              <w:t>16</w:t>
             </w:r>
             <w:r>
               <w:rPr>
@@ -2740,7 +2784,7 @@
               <w14:ligatures w14:val="standardContextual"/>
             </w:rPr>
           </w:pPr>
-          <w:hyperlink w:anchor="_Toc236976783" w:history="1">
+          <w:hyperlink w:anchor="_Toc237016824" w:history="1">
             <w:r>
               <w:rPr>
                 <w:rStyle w:val="Hyperlink"/>
@@ -2764,7 +2808,7 @@
               <w:rPr>
                 <w:noProof/>
               </w:rPr>
-              <w:instrText xml:space="preserve"> PAGEREF _Toc236976783 \h </w:instrText>
+              <w:instrText xml:space="preserve"> PAGEREF _Toc237016824 \h </w:instrText>
             </w:r>
             <w:r>
               <w:rPr>
@@ -2781,7 +2825,7 @@
               <w:rPr>
                 <w:noProof/>
               </w:rPr>
-              <w:t>15</w:t>
+              <w:t>16</w:t>
             </w:r>
             <w:r>
               <w:rPr>
@@ -2807,13 +2851,13 @@
               <w14:ligatures w14:val="standardContextual"/>
             </w:rPr>
           </w:pPr>
-          <w:hyperlink w:anchor="_Toc236976784" w:history="1">
+          <w:hyperlink w:anchor="_Toc237016825" w:history="1">
             <w:r>
               <w:rPr>
                 <w:rStyle w:val="Hyperlink"/>
                 <w:noProof/>
               </w:rPr>
-              <w:t>6. Evidencias demostrables de programación concurrente</w:t>
+              <w:t>6. Revisión del diseño a partir de la retroalimentación</w:t>
             </w:r>
             <w:r>
               <w:rPr>
@@ -2831,7 +2875,7 @@
               <w:rPr>
                 <w:noProof/>
               </w:rPr>
-              <w:instrText xml:space="preserve"> PAGEREF _Toc236976784 \h </w:instrText>
+              <w:instrText xml:space="preserve"> PAGEREF _Toc237016825 \h </w:instrText>
             </w:r>
             <w:r>
               <w:rPr>
@@ -2848,7 +2892,7 @@
               <w:rPr>
                 <w:noProof/>
               </w:rPr>
-              <w:t>16</w:t>
+              <w:t>17</w:t>
             </w:r>
             <w:r>
               <w:rPr>
@@ -2874,13 +2918,13 @@
               <w14:ligatures w14:val="standardContextual"/>
             </w:rPr>
           </w:pPr>
-          <w:hyperlink w:anchor="_Toc236976785" w:history="1">
+          <w:hyperlink w:anchor="_Toc237016826" w:history="1">
             <w:r>
               <w:rPr>
                 <w:rStyle w:val="Hyperlink"/>
                 <w:noProof/>
               </w:rPr>
-              <w:t>6.1 Ejemplo 1 — El problema: programación secuencial bloqueante</w:t>
+              <w:t>6.1 ¿Una fase o dos fases?</w:t>
             </w:r>
             <w:r>
               <w:rPr>
@@ -2898,7 +2942,7 @@
               <w:rPr>
                 <w:noProof/>
               </w:rPr>
-              <w:instrText xml:space="preserve"> PAGEREF _Toc236976785 \h </w:instrText>
+              <w:instrText xml:space="preserve"> PAGEREF _Toc237016826 \h </w:instrText>
             </w:r>
             <w:r>
               <w:rPr>
@@ -2915,7 +2959,141 @@
               <w:rPr>
                 <w:noProof/>
               </w:rPr>
-              <w:t>16</w:t>
+              <w:t>17</w:t>
+            </w:r>
+            <w:r>
+              <w:rPr>
+                <w:noProof/>
+              </w:rPr>
+              <w:fldChar w:fldCharType="end"/>
+            </w:r>
+          </w:hyperlink>
+        </w:p>
+        <w:p>
+          <w:pPr>
+            <w:pStyle w:val="TOC3"/>
+            <w:tabs>
+              <w:tab w:val="right" w:leader="dot" w:pos="9350"/>
+            </w:tabs>
+            <w:rPr>
+              <w:rFonts w:asciiTheme="minorHAnsi" w:eastAsiaTheme="minorEastAsia" w:hAnsiTheme="minorHAnsi" w:cstheme="minorBidi"/>
+              <w:noProof/>
+              <w:color w:val="auto"/>
+              <w:kern w:val="2"/>
+              <w:sz w:val="24"/>
+              <w:szCs w:val="24"/>
+              <w14:ligatures w14:val="standardContextual"/>
+            </w:rPr>
+          </w:pPr>
+          <w:hyperlink w:anchor="_Toc237016827" w:history="1">
+            <w:r>
+              <w:rPr>
+                <w:rStyle w:val="Hyperlink"/>
+                <w:noProof/>
+              </w:rPr>
+              <w:t>Fase perdida</w:t>
+            </w:r>
+            <w:r>
+              <w:rPr>
+                <w:noProof/>
+              </w:rPr>
+              <w:tab/>
+            </w:r>
+            <w:r>
+              <w:rPr>
+                <w:noProof/>
+              </w:rPr>
+              <w:fldChar w:fldCharType="begin"/>
+            </w:r>
+            <w:r>
+              <w:rPr>
+                <w:noProof/>
+              </w:rPr>
+              <w:instrText xml:space="preserve"> PAGEREF _Toc237016827 \h </w:instrText>
+            </w:r>
+            <w:r>
+              <w:rPr>
+                <w:noProof/>
+              </w:rPr>
+            </w:r>
+            <w:r>
+              <w:rPr>
+                <w:noProof/>
+              </w:rPr>
+              <w:fldChar w:fldCharType="separate"/>
+            </w:r>
+            <w:r>
+              <w:rPr>
+                <w:noProof/>
+              </w:rPr>
+              <w:t>17</w:t>
+            </w:r>
+            <w:r>
+              <w:rPr>
+                <w:noProof/>
+              </w:rPr>
+              <w:fldChar w:fldCharType="end"/>
+            </w:r>
+          </w:hyperlink>
+        </w:p>
+        <w:p>
+          <w:pPr>
+            <w:pStyle w:val="TOC3"/>
+            <w:tabs>
+              <w:tab w:val="right" w:leader="dot" w:pos="9350"/>
+            </w:tabs>
+            <w:rPr>
+              <w:rFonts w:asciiTheme="minorHAnsi" w:eastAsiaTheme="minorEastAsia" w:hAnsiTheme="minorHAnsi" w:cstheme="minorBidi"/>
+              <w:noProof/>
+              <w:color w:val="auto"/>
+              <w:kern w:val="2"/>
+              <w:sz w:val="24"/>
+              <w:szCs w:val="24"/>
+              <w14:ligatures w14:val="standardContextual"/>
+            </w:rPr>
+          </w:pPr>
+          <w:hyperlink w:anchor="_Toc237016828" w:history="1">
+            <w:r>
+              <w:rPr>
+                <w:rStyle w:val="Hyperlink"/>
+                <w:noProof/>
+              </w:rPr>
+              <w:t>Neutro perdido</w:t>
+            </w:r>
+            <w:r>
+              <w:rPr>
+                <w:noProof/>
+              </w:rPr>
+              <w:tab/>
+            </w:r>
+            <w:r>
+              <w:rPr>
+                <w:noProof/>
+              </w:rPr>
+              <w:fldChar w:fldCharType="begin"/>
+            </w:r>
+            <w:r>
+              <w:rPr>
+                <w:noProof/>
+              </w:rPr>
+              <w:instrText xml:space="preserve"> PAGEREF _Toc237016828 \h </w:instrText>
+            </w:r>
+            <w:r>
+              <w:rPr>
+                <w:noProof/>
+              </w:rPr>
+            </w:r>
+            <w:r>
+              <w:rPr>
+                <w:noProof/>
+              </w:rPr>
+              <w:fldChar w:fldCharType="separate"/>
+            </w:r>
+            <w:r>
+              <w:rPr>
+                <w:noProof/>
+              </w:rPr>
+              <w:t>17</w:t>
             </w:r>
             <w:r>
               <w:rPr>
@@ -2941,13 +3119,13 @@
               <w14:ligatures w14:val="standardContextual"/>
             </w:rPr>
           </w:pPr>
-          <w:hyperlink w:anchor="_Toc236976786" w:history="1">
+          <w:hyperlink w:anchor="_Toc237016829" w:history="1">
             <w:r>
               <w:rPr>
                 <w:rStyle w:val="Hyperlink"/>
                 <w:noProof/>
               </w:rPr>
-              <w:t>6.2 Ejemplo 2 — Multitarea cooperativa con millis()</w:t>
+              <w:t>6.2 ¿Se protege el inversor o se protegen los electrodomésticos?</w:t>
             </w:r>
             <w:r>
               <w:rPr>
@@ -2965,7 +3143,7 @@
               <w:rPr>
                 <w:noProof/>
               </w:rPr>
-              <w:instrText xml:space="preserve"> PAGEREF _Toc236976786 \h </w:instrText>
+              <w:instrText xml:space="preserve"> PAGEREF _Toc237016829 \h </w:instrText>
             </w:r>
             <w:r>
               <w:rPr>
@@ -2982,7 +3160,7 @@
               <w:rPr>
                 <w:noProof/>
               </w:rPr>
-              <w:t>16</w:t>
+              <w:t>18</w:t>
             </w:r>
             <w:r>
               <w:rPr>
@@ -3008,13 +3186,13 @@
               <w14:ligatures w14:val="standardContextual"/>
             </w:rPr>
           </w:pPr>
-          <w:hyperlink w:anchor="_Toc236976787" w:history="1">
+          <w:hyperlink w:anchor="_Toc237016830" w:history="1">
             <w:r>
               <w:rPr>
                 <w:rStyle w:val="Hyperlink"/>
                 <w:noProof/>
               </w:rPr>
-              <w:t>6.3 Ejemplo 3 — Hilos reales, expulsión y dos núcleos</w:t>
+              <w:t>6.3 La alimentación del propio monitor</w:t>
             </w:r>
             <w:r>
               <w:rPr>
@@ -3032,7 +3210,7 @@
               <w:rPr>
                 <w:noProof/>
               </w:rPr>
-              <w:instrText xml:space="preserve"> PAGEREF _Toc236976787 \h </w:instrText>
+              <w:instrText xml:space="preserve"> PAGEREF _Toc237016830 \h </w:instrText>
             </w:r>
             <w:r>
               <w:rPr>
@@ -3049,7 +3227,74 @@
               <w:rPr>
                 <w:noProof/>
               </w:rPr>
-              <w:t>17</w:t>
+              <w:t>18</w:t>
+            </w:r>
+            <w:r>
+              <w:rPr>
+                <w:noProof/>
+              </w:rPr>
+              <w:fldChar w:fldCharType="end"/>
+            </w:r>
+          </w:hyperlink>
+        </w:p>
+        <w:p>
+          <w:pPr>
+            <w:pStyle w:val="TOC1"/>
+            <w:tabs>
+              <w:tab w:val="right" w:leader="dot" w:pos="9350"/>
+            </w:tabs>
+            <w:rPr>
+              <w:rFonts w:asciiTheme="minorHAnsi" w:eastAsiaTheme="minorEastAsia" w:hAnsiTheme="minorHAnsi" w:cstheme="minorBidi"/>
+              <w:noProof/>
+              <w:color w:val="auto"/>
+              <w:kern w:val="2"/>
+              <w:sz w:val="24"/>
+              <w:szCs w:val="24"/>
+              <w14:ligatures w14:val="standardContextual"/>
+            </w:rPr>
+          </w:pPr>
+          <w:hyperlink w:anchor="_Toc237016831" w:history="1">
+            <w:r>
+              <w:rPr>
+                <w:rStyle w:val="Hyperlink"/>
+                <w:noProof/>
+              </w:rPr>
+              <w:t>7. Evidencias demostrables de programación concurrente</w:t>
+            </w:r>
+            <w:r>
+              <w:rPr>
+                <w:noProof/>
+              </w:rPr>
+              <w:tab/>
+            </w:r>
+            <w:r>
+              <w:rPr>
+                <w:noProof/>
+              </w:rPr>
+              <w:fldChar w:fldCharType="begin"/>
+            </w:r>
+            <w:r>
+              <w:rPr>
+                <w:noProof/>
+              </w:rPr>
+              <w:instrText xml:space="preserve"> PAGEREF _Toc237016831 \h </w:instrText>
+            </w:r>
+            <w:r>
+              <w:rPr>
+                <w:noProof/>
+              </w:rPr>
+            </w:r>
+            <w:r>
+              <w:rPr>
+                <w:noProof/>
+              </w:rPr>
+              <w:fldChar w:fldCharType="separate"/>
+            </w:r>
+            <w:r>
+              <w:rPr>
+                <w:noProof/>
+              </w:rPr>
+              <w:t>20</w:t>
             </w:r>
             <w:r>
               <w:rPr>
@@ -3075,13 +3320,13 @@
               <w14:ligatures w14:val="standardContextual"/>
             </w:rPr>
           </w:pPr>
-          <w:hyperlink w:anchor="_Toc236976788" w:history="1">
+          <w:hyperlink w:anchor="_Toc237016832" w:history="1">
             <w:r>
               <w:rPr>
                 <w:rStyle w:val="Hyperlink"/>
                 <w:noProof/>
               </w:rPr>
-              <w:t>6.4 Ejemplo 4 — La condición de carrera y su cura</w:t>
+              <w:t>7.1 Ejemplo 1 — El problema: programación secuencial bloqueante</w:t>
             </w:r>
             <w:r>
               <w:rPr>
@@ -3099,7 +3344,7 @@
               <w:rPr>
                 <w:noProof/>
               </w:rPr>
-              <w:instrText xml:space="preserve"> PAGEREF _Toc236976788 \h </w:instrText>
+              <w:instrText xml:space="preserve"> PAGEREF _Toc237016832 \h </w:instrText>
             </w:r>
             <w:r>
               <w:rPr>
@@ -3116,7 +3361,7 @@
               <w:rPr>
                 <w:noProof/>
               </w:rPr>
-              <w:t>17</w:t>
+              <w:t>20</w:t>
             </w:r>
             <w:r>
               <w:rPr>
@@ -3142,13 +3387,13 @@
               <w14:ligatures w14:val="standardContextual"/>
             </w:rPr>
           </w:pPr>
-          <w:hyperlink w:anchor="_Toc236976789" w:history="1">
+          <w:hyperlink w:anchor="_Toc237016833" w:history="1">
             <w:r>
               <w:rPr>
                 <w:rStyle w:val="Hyperlink"/>
                 <w:noProof/>
               </w:rPr>
-              <w:t>6.5 Ejemplo 5 — Programación distribuida con MQTT</w:t>
+              <w:t>7.2 Ejemplo 2 — Multitarea cooperativa con millis()</w:t>
             </w:r>
             <w:r>
               <w:rPr>
@@ -3166,7 +3411,7 @@
               <w:rPr>
                 <w:noProof/>
               </w:rPr>
-              <w:instrText xml:space="preserve"> PAGEREF _Toc236976789 \h </w:instrText>
+              <w:instrText xml:space="preserve"> PAGEREF _Toc237016833 \h </w:instrText>
             </w:r>
             <w:r>
               <w:rPr>
@@ -3183,7 +3428,7 @@
               <w:rPr>
                 <w:noProof/>
               </w:rPr>
-              <w:t>17</w:t>
+              <w:t>20</w:t>
             </w:r>
             <w:r>
               <w:rPr>
@@ -3209,13 +3454,13 @@
               <w14:ligatures w14:val="standardContextual"/>
             </w:rPr>
           </w:pPr>
-          <w:hyperlink w:anchor="_Toc236976790" w:history="1">
+          <w:hyperlink w:anchor="_Toc237016834" w:history="1">
             <w:r>
               <w:rPr>
                 <w:rStyle w:val="Hyperlink"/>
                 <w:noProof/>
               </w:rPr>
-              <w:t>6.6 Ejemplo 6 — Concurrencia y paralelismo, medidos con cronómetro</w:t>
+              <w:t>7.3 Ejemplo 3 — Hilos reales, expulsión y dos núcleos</w:t>
             </w:r>
             <w:r>
               <w:rPr>
@@ -3233,7 +3478,7 @@
               <w:rPr>
                 <w:noProof/>
               </w:rPr>
-              <w:instrText xml:space="preserve"> PAGEREF _Toc236976790 \h </w:instrText>
+              <w:instrText xml:space="preserve"> PAGEREF _Toc237016834 \h </w:instrText>
             </w:r>
             <w:r>
               <w:rPr>
@@ -3250,7 +3495,208 @@
               <w:rPr>
                 <w:noProof/>
               </w:rPr>
-              <w:t>18</w:t>
+              <w:t>21</w:t>
+            </w:r>
+            <w:r>
+              <w:rPr>
+                <w:noProof/>
+              </w:rPr>
+              <w:fldChar w:fldCharType="end"/>
+            </w:r>
+          </w:hyperlink>
+        </w:p>
+        <w:p>
+          <w:pPr>
+            <w:pStyle w:val="TOC2"/>
+            <w:tabs>
+              <w:tab w:val="right" w:leader="dot" w:pos="9350"/>
+            </w:tabs>
+            <w:rPr>
+              <w:rFonts w:asciiTheme="minorHAnsi" w:eastAsiaTheme="minorEastAsia" w:hAnsiTheme="minorHAnsi" w:cstheme="minorBidi"/>
+              <w:noProof/>
+              <w:color w:val="auto"/>
+              <w:kern w:val="2"/>
+              <w:sz w:val="24"/>
+              <w:szCs w:val="24"/>
+              <w14:ligatures w14:val="standardContextual"/>
+            </w:rPr>
+          </w:pPr>
+          <w:hyperlink w:anchor="_Toc237016835" w:history="1">
+            <w:r>
+              <w:rPr>
+                <w:rStyle w:val="Hyperlink"/>
+                <w:noProof/>
+              </w:rPr>
+              <w:t>7.4 Ejemplo 4 — La condición de carrera y su cura</w:t>
+            </w:r>
+            <w:r>
+              <w:rPr>
+                <w:noProof/>
+              </w:rPr>
+              <w:tab/>
+            </w:r>
+            <w:r>
+              <w:rPr>
+                <w:noProof/>
+              </w:rPr>
+              <w:fldChar w:fldCharType="begin"/>
+            </w:r>
+            <w:r>
+              <w:rPr>
+                <w:noProof/>
+              </w:rPr>
+              <w:instrText xml:space="preserve"> PAGEREF _Toc237016835 \h </w:instrText>
+            </w:r>
+            <w:r>
+              <w:rPr>
+                <w:noProof/>
+              </w:rPr>
+            </w:r>
+            <w:r>
+              <w:rPr>
+                <w:noProof/>
+              </w:rPr>
+              <w:fldChar w:fldCharType="separate"/>
+            </w:r>
+            <w:r>
+              <w:rPr>
+                <w:noProof/>
+              </w:rPr>
+              <w:t>21</w:t>
+            </w:r>
+            <w:r>
+              <w:rPr>
+                <w:noProof/>
+              </w:rPr>
+              <w:fldChar w:fldCharType="end"/>
+            </w:r>
+          </w:hyperlink>
+        </w:p>
+        <w:p>
+          <w:pPr>
+            <w:pStyle w:val="TOC2"/>
+            <w:tabs>
+              <w:tab w:val="right" w:leader="dot" w:pos="9350"/>
+            </w:tabs>
+            <w:rPr>
+              <w:rFonts w:asciiTheme="minorHAnsi" w:eastAsiaTheme="minorEastAsia" w:hAnsiTheme="minorHAnsi" w:cstheme="minorBidi"/>
+              <w:noProof/>
+              <w:color w:val="auto"/>
+              <w:kern w:val="2"/>
+              <w:sz w:val="24"/>
+              <w:szCs w:val="24"/>
+              <w14:ligatures w14:val="standardContextual"/>
+            </w:rPr>
+          </w:pPr>
+          <w:hyperlink w:anchor="_Toc237016836" w:history="1">
+            <w:r>
+              <w:rPr>
+                <w:rStyle w:val="Hyperlink"/>
+                <w:noProof/>
+              </w:rPr>
+              <w:t>7.5 Ejemplo 5 — Programación distribuida con MQTT</w:t>
+            </w:r>
+            <w:r>
+              <w:rPr>
+                <w:noProof/>
+              </w:rPr>
+              <w:tab/>
+            </w:r>
+            <w:r>
+              <w:rPr>
+                <w:noProof/>
+              </w:rPr>
+              <w:fldChar w:fldCharType="begin"/>
+            </w:r>
+            <w:r>
+              <w:rPr>
+                <w:noProof/>
+              </w:rPr>
+              <w:instrText xml:space="preserve"> PAGEREF _Toc237016836 \h </w:instrText>
+            </w:r>
+            <w:r>
+              <w:rPr>
+                <w:noProof/>
+              </w:rPr>
+            </w:r>
+            <w:r>
+              <w:rPr>
+                <w:noProof/>
+              </w:rPr>
+              <w:fldChar w:fldCharType="separate"/>
+            </w:r>
+            <w:r>
+              <w:rPr>
+                <w:noProof/>
+              </w:rPr>
+              <w:t>21</w:t>
+            </w:r>
+            <w:r>
+              <w:rPr>
+                <w:noProof/>
+              </w:rPr>
+              <w:fldChar w:fldCharType="end"/>
+            </w:r>
+          </w:hyperlink>
+        </w:p>
+        <w:p>
+          <w:pPr>
+            <w:pStyle w:val="TOC2"/>
+            <w:tabs>
+              <w:tab w:val="right" w:leader="dot" w:pos="9350"/>
+            </w:tabs>
+            <w:rPr>
+              <w:rFonts w:asciiTheme="minorHAnsi" w:eastAsiaTheme="minorEastAsia" w:hAnsiTheme="minorHAnsi" w:cstheme="minorBidi"/>
+              <w:noProof/>
+              <w:color w:val="auto"/>
+              <w:kern w:val="2"/>
+              <w:sz w:val="24"/>
+              <w:szCs w:val="24"/>
+              <w14:ligatures w14:val="standardContextual"/>
+            </w:rPr>
+          </w:pPr>
+          <w:hyperlink w:anchor="_Toc237016837" w:history="1">
+            <w:r>
+              <w:rPr>
+                <w:rStyle w:val="Hyperlink"/>
+                <w:noProof/>
+              </w:rPr>
+              <w:t>7.6 Ejemplo 6 — Concurrencia y paralelismo, medidos con cronómetro</w:t>
+            </w:r>
+            <w:r>
+              <w:rPr>
+                <w:noProof/>
+              </w:rPr>
+              <w:tab/>
+            </w:r>
+            <w:r>
+              <w:rPr>
+                <w:noProof/>
+              </w:rPr>
+              <w:fldChar w:fldCharType="begin"/>
+            </w:r>
+            <w:r>
+              <w:rPr>
+                <w:noProof/>
+              </w:rPr>
+              <w:instrText xml:space="preserve"> PAGEREF _Toc237016837 \h </w:instrText>
+            </w:r>
+            <w:r>
+              <w:rPr>
+                <w:noProof/>
+              </w:rPr>
+            </w:r>
+            <w:r>
+              <w:rPr>
+                <w:noProof/>
+              </w:rPr>
+              <w:fldChar w:fldCharType="separate"/>
+            </w:r>
+            <w:r>
+              <w:rPr>
+                <w:noProof/>
+              </w:rPr>
+              <w:t>22</w:t>
             </w:r>
             <w:r>
               <w:rPr>
@@ -3276,13 +3722,13 @@
               <w14:ligatures w14:val="standardContextual"/>
             </w:rPr>
           </w:pPr>
-          <w:hyperlink w:anchor="_Toc236976791" w:history="1">
+          <w:hyperlink w:anchor="_Toc237016838" w:history="1">
             <w:r>
               <w:rPr>
                 <w:rStyle w:val="Hyperlink"/>
                 <w:noProof/>
               </w:rPr>
-              <w:t>7. Presupuesto y cotización</w:t>
+              <w:t>8. Presupuesto y cotización</w:t>
             </w:r>
             <w:r>
               <w:rPr>
@@ -3300,7 +3746,7 @@
               <w:rPr>
                 <w:noProof/>
               </w:rPr>
-              <w:instrText xml:space="preserve"> PAGEREF _Toc236976791 \h </w:instrText>
+              <w:instrText xml:space="preserve"> PAGEREF _Toc237016838 \h </w:instrText>
             </w:r>
             <w:r>
               <w:rPr>
@@ -3317,7 +3763,7 @@
               <w:rPr>
                 <w:noProof/>
               </w:rPr>
-              <w:t>19</w:t>
+              <w:t>23</w:t>
             </w:r>
             <w:r>
               <w:rPr>
@@ -3343,13 +3789,13 @@
               <w14:ligatures w14:val="standardContextual"/>
             </w:rPr>
           </w:pPr>
-          <w:hyperlink w:anchor="_Toc236976792" w:history="1">
+          <w:hyperlink w:anchor="_Toc237016839" w:history="1">
             <w:r>
               <w:rPr>
                 <w:rStyle w:val="Hyperlink"/>
                 <w:noProof/>
               </w:rPr>
-              <w:t>7.1 Escenario A — Prototipo académico simulado</w:t>
+              <w:t>8.1 Escenario A — Prototipo académico simulado</w:t>
             </w:r>
             <w:r>
               <w:rPr>
@@ -3367,7 +3813,7 @@
               <w:rPr>
                 <w:noProof/>
               </w:rPr>
-              <w:instrText xml:space="preserve"> PAGEREF _Toc236976792 \h </w:instrText>
+              <w:instrText xml:space="preserve"> PAGEREF _Toc237016839 \h </w:instrText>
             </w:r>
             <w:r>
               <w:rPr>
@@ -3384,7 +3830,7 @@
               <w:rPr>
                 <w:noProof/>
               </w:rPr>
-              <w:t>19</w:t>
+              <w:t>23</w:t>
             </w:r>
             <w:r>
               <w:rPr>
@@ -3410,13 +3856,13 @@
               <w14:ligatures w14:val="standardContextual"/>
             </w:rPr>
           </w:pPr>
-          <w:hyperlink w:anchor="_Toc236976793" w:history="1">
+          <w:hyperlink w:anchor="_Toc237016840" w:history="1">
             <w:r>
               <w:rPr>
                 <w:rStyle w:val="Hyperlink"/>
                 <w:noProof/>
               </w:rPr>
-              <w:t>7.2 Escenario B — Implementación física en una vivienda</w:t>
+              <w:t>8.2 Escenario B — Implementación física en una vivienda</w:t>
             </w:r>
             <w:r>
               <w:rPr>
@@ -3434,7 +3880,7 @@
               <w:rPr>
                 <w:noProof/>
               </w:rPr>
-              <w:instrText xml:space="preserve"> PAGEREF _Toc236976793 \h </w:instrText>
+              <w:instrText xml:space="preserve"> PAGEREF _Toc237016840 \h </w:instrText>
             </w:r>
             <w:r>
               <w:rPr>
@@ -3451,7 +3897,7 @@
               <w:rPr>
                 <w:noProof/>
               </w:rPr>
-              <w:t>19</w:t>
+              <w:t>23</w:t>
             </w:r>
             <w:r>
               <w:rPr>
@@ -3477,13 +3923,13 @@
               <w14:ligatures w14:val="standardContextual"/>
             </w:rPr>
           </w:pPr>
-          <w:hyperlink w:anchor="_Toc236976794" w:history="1">
+          <w:hyperlink w:anchor="_Toc237016841" w:history="1">
             <w:r>
               <w:rPr>
                 <w:rStyle w:val="Hyperlink"/>
                 <w:noProof/>
               </w:rPr>
-              <w:t>7.2.1 Materiales y componentes</w:t>
+              <w:t>8.2.1 Materiales y componentes</w:t>
             </w:r>
             <w:r>
               <w:rPr>
@@ -3501,7 +3947,7 @@
               <w:rPr>
                 <w:noProof/>
               </w:rPr>
-              <w:instrText xml:space="preserve"> PAGEREF _Toc236976794 \h </w:instrText>
+              <w:instrText xml:space="preserve"> PAGEREF _Toc237016841 \h </w:instrText>
             </w:r>
             <w:r>
               <w:rPr>
@@ -3518,7 +3964,7 @@
               <w:rPr>
                 <w:noProof/>
               </w:rPr>
-              <w:t>19</w:t>
+              <w:t>23</w:t>
             </w:r>
             <w:r>
               <w:rPr>
@@ -3544,13 +3990,13 @@
               <w14:ligatures w14:val="standardContextual"/>
             </w:rPr>
           </w:pPr>
-          <w:hyperlink w:anchor="_Toc236976795" w:history="1">
+          <w:hyperlink w:anchor="_Toc237016842" w:history="1">
             <w:r>
               <w:rPr>
                 <w:rStyle w:val="Hyperlink"/>
                 <w:noProof/>
               </w:rPr>
-              <w:t>7.2.2 Logística, impuestos y servicios</w:t>
+              <w:t>8.2.2 Logística, impuestos y servicios</w:t>
             </w:r>
             <w:r>
               <w:rPr>
@@ -3568,7 +4014,7 @@
               <w:rPr>
                 <w:noProof/>
               </w:rPr>
-              <w:instrText xml:space="preserve"> PAGEREF _Toc236976795 \h </w:instrText>
+              <w:instrText xml:space="preserve"> PAGEREF _Toc237016842 \h </w:instrText>
             </w:r>
             <w:r>
               <w:rPr>
@@ -3585,7 +4031,7 @@
               <w:rPr>
                 <w:noProof/>
               </w:rPr>
-              <w:t>20</w:t>
+              <w:t>24</w:t>
             </w:r>
             <w:r>
               <w:rPr>
@@ -3611,13 +4057,13 @@
               <w14:ligatures w14:val="standardContextual"/>
             </w:rPr>
           </w:pPr>
-          <w:hyperlink w:anchor="_Toc236976796" w:history="1">
+          <w:hyperlink w:anchor="_Toc237016843" w:history="1">
             <w:r>
               <w:rPr>
                 <w:rStyle w:val="Hyperlink"/>
                 <w:noProof/>
               </w:rPr>
-              <w:t>7.2.3 Costos recurrentes</w:t>
+              <w:t>8.2.3 Costos recurrentes</w:t>
             </w:r>
             <w:r>
               <w:rPr>
@@ -3635,7 +4081,7 @@
               <w:rPr>
                 <w:noProof/>
               </w:rPr>
-              <w:instrText xml:space="preserve"> PAGEREF _Toc236976796 \h </w:instrText>
+              <w:instrText xml:space="preserve"> PAGEREF _Toc237016843 \h </w:instrText>
             </w:r>
             <w:r>
               <w:rPr>
@@ -3652,7 +4098,7 @@
               <w:rPr>
                 <w:noProof/>
               </w:rPr>
-              <w:t>20</w:t>
+              <w:t>24</w:t>
             </w:r>
             <w:r>
               <w:rPr>
@@ -3678,13 +4124,13 @@
               <w14:ligatures w14:val="standardContextual"/>
             </w:rPr>
           </w:pPr>
-          <w:hyperlink w:anchor="_Toc236976797" w:history="1">
+          <w:hyperlink w:anchor="_Toc237016844" w:history="1">
             <w:r>
               <w:rPr>
                 <w:rStyle w:val="Hyperlink"/>
                 <w:noProof/>
               </w:rPr>
-              <w:t>7.3 Análisis de retorno de la inversión</w:t>
+              <w:t>8.3 Análisis de retorno de la inversión</w:t>
             </w:r>
             <w:r>
               <w:rPr>
@@ -3702,7 +4148,7 @@
               <w:rPr>
                 <w:noProof/>
               </w:rPr>
-              <w:instrText xml:space="preserve"> PAGEREF _Toc236976797 \h </w:instrText>
+              <w:instrText xml:space="preserve"> PAGEREF _Toc237016844 \h </w:instrText>
             </w:r>
             <w:r>
               <w:rPr>
@@ -3719,7 +4165,7 @@
               <w:rPr>
                 <w:noProof/>
               </w:rPr>
-              <w:t>20</w:t>
+              <w:t>25</w:t>
             </w:r>
             <w:r>
               <w:rPr>
@@ -3745,13 +4191,13 @@
               <w14:ligatures w14:val="standardContextual"/>
             </w:rPr>
           </w:pPr>
-          <w:hyperlink w:anchor="_Toc236976798" w:history="1">
+          <w:hyperlink w:anchor="_Toc237016845" w:history="1">
             <w:r>
               <w:rPr>
                 <w:rStyle w:val="Hyperlink"/>
                 <w:noProof/>
               </w:rPr>
-              <w:t>8. Cronograma de implementación</w:t>
+              <w:t>9. Cronograma de implementación</w:t>
             </w:r>
             <w:r>
               <w:rPr>
@@ -3769,7 +4215,7 @@
               <w:rPr>
                 <w:noProof/>
               </w:rPr>
-              <w:instrText xml:space="preserve"> PAGEREF _Toc236976798 \h </w:instrText>
+              <w:instrText xml:space="preserve"> PAGEREF _Toc237016845 \h </w:instrText>
             </w:r>
             <w:r>
               <w:rPr>
@@ -3786,7 +4232,7 @@
               <w:rPr>
                 <w:noProof/>
               </w:rPr>
-              <w:t>22</w:t>
+              <w:t>26</w:t>
             </w:r>
             <w:r>
               <w:rPr>
@@ -3812,13 +4258,13 @@
               <w14:ligatures w14:val="standardContextual"/>
             </w:rPr>
           </w:pPr>
-          <w:hyperlink w:anchor="_Toc236976799" w:history="1">
+          <w:hyperlink w:anchor="_Toc237016846" w:history="1">
             <w:r>
               <w:rPr>
                 <w:rStyle w:val="Hyperlink"/>
                 <w:noProof/>
               </w:rPr>
-              <w:t>9. Conclusión</w:t>
+              <w:t>10. Conclusión</w:t>
             </w:r>
             <w:r>
               <w:rPr>
@@ -3836,7 +4282,7 @@
               <w:rPr>
                 <w:noProof/>
               </w:rPr>
-              <w:instrText xml:space="preserve"> PAGEREF _Toc236976799 \h </w:instrText>
+              <w:instrText xml:space="preserve"> PAGEREF _Toc237016846 \h </w:instrText>
             </w:r>
             <w:r>
               <w:rPr>
@@ -3853,7 +4299,7 @@
               <w:rPr>
                 <w:noProof/>
               </w:rPr>
-              <w:t>22</w:t>
+              <w:t>26</w:t>
             </w:r>
             <w:r>
               <w:rPr>
@@ -3879,13 +4325,13 @@
               <w14:ligatures w14:val="standardContextual"/>
             </w:rPr>
           </w:pPr>
-          <w:hyperlink w:anchor="_Toc236976800" w:history="1">
+          <w:hyperlink w:anchor="_Toc237016847" w:history="1">
             <w:r>
               <w:rPr>
                 <w:rStyle w:val="Hyperlink"/>
                 <w:noProof/>
               </w:rPr>
-              <w:t>9.1 Recomendaciones</w:t>
+              <w:t>10.1 Recomendaciones</w:t>
             </w:r>
             <w:r>
               <w:rPr>
@@ -3903,7 +4349,7 @@
               <w:rPr>
                 <w:noProof/>
               </w:rPr>
-              <w:instrText xml:space="preserve"> PAGEREF _Toc236976800 \h </w:instrText>
+              <w:instrText xml:space="preserve"> PAGEREF _Toc237016847 \h </w:instrText>
             </w:r>
             <w:r>
               <w:rPr>
@@ -3920,7 +4366,7 @@
               <w:rPr>
                 <w:noProof/>
               </w:rPr>
-              <w:t>23</w:t>
+              <w:t>27</w:t>
             </w:r>
             <w:r>
               <w:rPr>
@@ -3946,13 +4392,13 @@
               <w14:ligatures w14:val="standardContextual"/>
             </w:rPr>
           </w:pPr>
-          <w:hyperlink w:anchor="_Toc236976801" w:history="1">
+          <w:hyperlink w:anchor="_Toc237016848" w:history="1">
             <w:r>
               <w:rPr>
                 <w:rStyle w:val="Hyperlink"/>
                 <w:noProof/>
               </w:rPr>
-              <w:t>10. Fuentes de investigación y bibliografía</w:t>
+              <w:t>11. Fuentes de investigación y bibliografía</w:t>
             </w:r>
             <w:r>
               <w:rPr>
@@ -3970,7 +4416,7 @@
               <w:rPr>
                 <w:noProof/>
               </w:rPr>
-              <w:instrText xml:space="preserve"> PAGEREF _Toc236976801 \h </w:instrText>
+              <w:instrText xml:space="preserve"> PAGEREF _Toc237016848 \h </w:instrText>
             </w:r>
             <w:r>
               <w:rPr>
@@ -3987,7 +4433,7 @@
               <w:rPr>
                 <w:noProof/>
               </w:rPr>
-              <w:t>24</w:t>
+              <w:t>28</w:t>
             </w:r>
             <w:r>
               <w:rPr>
@@ -4013,13 +4459,13 @@
               <w14:ligatures w14:val="standardContextual"/>
             </w:rPr>
           </w:pPr>
-          <w:hyperlink w:anchor="_Toc236976802" w:history="1">
+          <w:hyperlink w:anchor="_Toc237016849" w:history="1">
             <w:r>
               <w:rPr>
                 <w:rStyle w:val="Hyperlink"/>
                 <w:noProof/>
               </w:rPr>
-              <w:t>10.1 Libros y artículos académicos</w:t>
+              <w:t>11.1 Libros y artículos académicos</w:t>
             </w:r>
             <w:r>
               <w:rPr>
@@ -4037,7 +4483,7 @@
               <w:rPr>
                 <w:noProof/>
               </w:rPr>
-              <w:instrText xml:space="preserve"> PAGEREF _Toc236976802 \h </w:instrText>
+              <w:instrText xml:space="preserve"> PAGEREF _Toc237016849 \h </w:instrText>
             </w:r>
             <w:r>
               <w:rPr>
@@ -4054,7 +4500,7 @@
               <w:rPr>
                 <w:noProof/>
               </w:rPr>
-              <w:t>24</w:t>
+              <w:t>28</w:t>
             </w:r>
             <w:r>
               <w:rPr>
@@ -4080,13 +4526,13 @@
               <w14:ligatures w14:val="standardContextual"/>
             </w:rPr>
           </w:pPr>
-          <w:hyperlink w:anchor="_Toc236976803" w:history="1">
+          <w:hyperlink w:anchor="_Toc237016850" w:history="1">
             <w:r>
               <w:rPr>
                 <w:rStyle w:val="Hyperlink"/>
                 <w:noProof/>
               </w:rPr>
-              <w:t>10.2 Documentación técnica y normas</w:t>
+              <w:t>11.2 Documentación técnica y normas</w:t>
             </w:r>
             <w:r>
               <w:rPr>
@@ -4104,7 +4550,7 @@
               <w:rPr>
                 <w:noProof/>
               </w:rPr>
-              <w:instrText xml:space="preserve"> PAGEREF _Toc236976803 \h </w:instrText>
+              <w:instrText xml:space="preserve"> PAGEREF _Toc237016850 \h </w:instrText>
             </w:r>
             <w:r>
               <w:rPr>
@@ -4121,7 +4567,7 @@
               <w:rPr>
                 <w:noProof/>
               </w:rPr>
-              <w:t>24</w:t>
+              <w:t>28</w:t>
             </w:r>
             <w:r>
               <w:rPr>
@@ -4147,13 +4593,13 @@
               <w14:ligatures w14:val="standardContextual"/>
             </w:rPr>
           </w:pPr>
-          <w:hyperlink w:anchor="_Toc236976804" w:history="1">
+          <w:hyperlink w:anchor="_Toc237016851" w:history="1">
             <w:r>
               <w:rPr>
                 <w:rStyle w:val="Hyperlink"/>
                 <w:noProof/>
               </w:rPr>
-              <w:t>10.3 Conferencias y recursos en línea</w:t>
+              <w:t>11.3 Conferencias y recursos en línea</w:t>
             </w:r>
             <w:r>
               <w:rPr>
@@ -4171,7 +4617,7 @@
               <w:rPr>
                 <w:noProof/>
               </w:rPr>
-              <w:instrText xml:space="preserve"> PAGEREF _Toc236976804 \h </w:instrText>
+              <w:instrText xml:space="preserve"> PAGEREF _Toc237016851 \h </w:instrText>
             </w:r>
             <w:r>
               <w:rPr>
@@ -4188,7 +4634,7 @@
               <w:rPr>
                 <w:noProof/>
               </w:rPr>
-              <w:t>24</w:t>
+              <w:t>28</w:t>
             </w:r>
             <w:r>
               <w:rPr>
@@ -4214,13 +4660,13 @@
               <w14:ligatures w14:val="standardContextual"/>
             </w:rPr>
           </w:pPr>
-          <w:hyperlink w:anchor="_Toc236976805" w:history="1">
+          <w:hyperlink w:anchor="_Toc237016852" w:history="1">
             <w:r>
               <w:rPr>
                 <w:rStyle w:val="Hyperlink"/>
                 <w:noProof/>
               </w:rPr>
-              <w:t>10.4 Fuentes de datos económicos</w:t>
+              <w:t>11.4 Fuentes de datos económicos</w:t>
             </w:r>
             <w:r>
               <w:rPr>
@@ -4238,7 +4684,7 @@
               <w:rPr>
                 <w:noProof/>
               </w:rPr>
-              <w:instrText xml:space="preserve"> PAGEREF _Toc236976805 \h </w:instrText>
+              <w:instrText xml:space="preserve"> PAGEREF _Toc237016852 \h </w:instrText>
             </w:r>
             <w:r>
               <w:rPr>
@@ -4255,7 +4701,7 @@
               <w:rPr>
                 <w:noProof/>
               </w:rPr>
-              <w:t>24</w:t>
+              <w:t>28</w:t>
             </w:r>
             <w:r>
               <w:rPr>
@@ -4281,7 +4727,7 @@
               <w14:ligatures w14:val="standardContextual"/>
             </w:rPr>
           </w:pPr>
-          <w:hyperlink w:anchor="_Toc236976806" w:history="1">
+          <w:hyperlink w:anchor="_Toc237016853" w:history="1">
             <w:r>
               <w:rPr>
                 <w:rStyle w:val="Hyperlink"/>
@@ -4305,7 +4751,7 @@
               <w:rPr>
                 <w:noProof/>
               </w:rPr>
-              <w:instrText xml:space="preserve"> PAGEREF _Toc236976806 \h </w:instrText>
+              <w:instrText xml:space="preserve"> PAGEREF _Toc237016853 \h </w:instrText>
             </w:r>
             <w:r>
               <w:rPr>
@@ -4322,7 +4768,7 @@
               <w:rPr>
                 <w:noProof/>
               </w:rPr>
-              <w:t>25</w:t>
+              <w:t>29</w:t>
             </w:r>
             <w:r>
               <w:rPr>
@@ -4348,7 +4794,7 @@
               <w14:ligatures w14:val="standardContextual"/>
             </w:rPr>
           </w:pPr>
-          <w:hyperlink w:anchor="_Toc236976807" w:history="1">
+          <w:hyperlink w:anchor="_Toc237016854" w:history="1">
             <w:r>
               <w:rPr>
                 <w:rStyle w:val="Hyperlink"/>
@@ -4372,7 +4818,7 @@
               <w:rPr>
                 <w:noProof/>
               </w:rPr>
-              <w:instrText xml:space="preserve"> PAGEREF _Toc236976807 \h </w:instrText>
+              <w:instrText xml:space="preserve"> PAGEREF _Toc237016854 \h </w:instrText>
             </w:r>
             <w:r>
               <w:rPr>
@@ -4389,7 +4835,7 @@
               <w:rPr>
                 <w:noProof/>
               </w:rPr>
-              <w:t>25</w:t>
+              <w:t>29</w:t>
             </w:r>
             <w:r>
               <w:rPr>
@@ -4415,7 +4861,7 @@
               <w14:ligatures w14:val="standardContextual"/>
             </w:rPr>
           </w:pPr>
-          <w:hyperlink w:anchor="_Toc236976808" w:history="1">
+          <w:hyperlink w:anchor="_Toc237016855" w:history="1">
             <w:r>
               <w:rPr>
                 <w:rStyle w:val="Hyperlink"/>
@@ -4439,7 +4885,7 @@
               <w:rPr>
                 <w:noProof/>
               </w:rPr>
-              <w:instrText xml:space="preserve"> PAGEREF _Toc236976808 \h </w:instrText>
+              <w:instrText xml:space="preserve"> PAGEREF _Toc237016855 \h </w:instrText>
             </w:r>
             <w:r>
               <w:rPr>
@@ -4456,7 +4902,7 @@
               <w:rPr>
                 <w:noProof/>
               </w:rPr>
-              <w:t>25</w:t>
+              <w:t>29</w:t>
             </w:r>
             <w:r>
               <w:rPr>
@@ -4482,7 +4928,7 @@
               <w14:ligatures w14:val="standardContextual"/>
             </w:rPr>
           </w:pPr>
-          <w:hyperlink w:anchor="_Toc236976809" w:history="1">
+          <w:hyperlink w:anchor="_Toc237016856" w:history="1">
             <w:r>
               <w:rPr>
                 <w:rStyle w:val="Hyperlink"/>
@@ -4506,7 +4952,7 @@
               <w:rPr>
                 <w:noProof/>
               </w:rPr>
-              <w:instrText xml:space="preserve"> PAGEREF _Toc236976809 \h </w:instrText>
+              <w:instrText xml:space="preserve"> PAGEREF _Toc237016856 \h </w:instrText>
             </w:r>
             <w:r>
               <w:rPr>
@@ -4523,7 +4969,7 @@
               <w:rPr>
                 <w:noProof/>
               </w:rPr>
-              <w:t>27</w:t>
+              <w:t>31</w:t>
             </w:r>
             <w:r>
               <w:rPr>
@@ -4549,7 +4995,7 @@
               <w14:ligatures w14:val="standardContextual"/>
             </w:rPr>
           </w:pPr>
-          <w:hyperlink w:anchor="_Toc236976810" w:history="1">
+          <w:hyperlink w:anchor="_Toc237016857" w:history="1">
             <w:r>
               <w:rPr>
                 <w:rStyle w:val="Hyperlink"/>
@@ -4573,7 +5019,7 @@
               <w:rPr>
                 <w:noProof/>
               </w:rPr>
-              <w:instrText xml:space="preserve"> PAGEREF _Toc236976810 \h </w:instrText>
+              <w:instrText xml:space="preserve"> PAGEREF _Toc237016857 \h </w:instrText>
             </w:r>
             <w:r>
               <w:rPr>
@@ -4590,7 +5036,7 @@
               <w:rPr>
                 <w:noProof/>
               </w:rPr>
-              <w:t>27</w:t>
+              <w:t>31</w:t>
             </w:r>
             <w:r>
               <w:rPr>
@@ -4620,7 +5066,7 @@
         </w:pBdr>
         <w:spacing w:before="360" w:after="180"/>
       </w:pPr>
-      <w:bookmarkStart w:id="1" w:name="_Toc236976755"/>
+      <w:bookmarkStart w:id="1" w:name="_Toc237016796"/>
       <w:r>
         <w:t>1. Introducción</w:t>
       </w:r>
@@ -4674,7 +5120,7 @@
         </w:pBdr>
         <w:spacing w:before="360" w:after="180"/>
       </w:pPr>
-      <w:bookmarkStart w:id="2" w:name="_Toc236976756"/>
+      <w:bookmarkStart w:id="2" w:name="_Toc237016797"/>
       <w:r>
         <w:t>2. Objetivos</w:t>
       </w:r>
@@ -4685,7 +5131,7 @@
         <w:pStyle w:val="Heading2"/>
         <w:spacing w:before="260" w:after="120"/>
       </w:pPr>
-      <w:bookmarkStart w:id="3" w:name="_Toc236976757"/>
+      <w:bookmarkStart w:id="3" w:name="_Toc237016798"/>
       <w:r>
         <w:t>2.1 Objetivo general</w:t>
       </w:r>
@@ -4704,7 +5150,7 @@
         <w:pStyle w:val="Heading2"/>
         <w:spacing w:before="260" w:after="120"/>
       </w:pPr>
-      <w:bookmarkStart w:id="4" w:name="_Toc236976758"/>
+      <w:bookmarkStart w:id="4" w:name="_Toc237016799"/>
       <w:r>
         <w:t>2.2 Objetivos específicos</w:t>
       </w:r>
@@ -4809,7 +5255,7 @@
         </w:pBdr>
         <w:spacing w:before="360" w:after="180"/>
       </w:pPr>
-      <w:bookmarkStart w:id="5" w:name="_Toc236976759"/>
+      <w:bookmarkStart w:id="5" w:name="_Toc237016800"/>
       <w:r>
         <w:t>3. Planteamiento del problema y justificación</w:t>
       </w:r>
@@ -4820,7 +5266,7 @@
         <w:pStyle w:val="Heading2"/>
         <w:spacing w:before="260" w:after="120"/>
       </w:pPr>
-      <w:bookmarkStart w:id="6" w:name="_Toc236976760"/>
+      <w:bookmarkStart w:id="6" w:name="_Toc237016801"/>
       <w:r>
         <w:t>3.1 El contexto dominicano</w:t>
       </w:r>
@@ -4899,7 +5345,7 @@
         <w:pStyle w:val="Heading2"/>
         <w:spacing w:before="260" w:after="120"/>
       </w:pPr>
-      <w:bookmarkStart w:id="7" w:name="_Toc236976761"/>
+      <w:bookmarkStart w:id="7" w:name="_Toc237016802"/>
       <w:r>
         <w:t>3.2 Por qué un microcontrolador y no una aplicación</w:t>
       </w:r>
@@ -4921,7 +5367,7 @@
         <w:pStyle w:val="Heading2"/>
         <w:spacing w:before="260" w:after="120"/>
       </w:pPr>
-      <w:bookmarkStart w:id="8" w:name="_Toc236976762"/>
+      <w:bookmarkStart w:id="8" w:name="_Toc237016803"/>
       <w:r>
         <w:t>3.3 Por qué el problema es de programación concurrente</w:t>
       </w:r>
@@ -5437,7 +5883,7 @@
         </w:pBdr>
         <w:spacing w:before="360" w:after="180"/>
       </w:pPr>
-      <w:bookmarkStart w:id="9" w:name="_Toc236976763"/>
+      <w:bookmarkStart w:id="9" w:name="_Toc237016804"/>
       <w:r>
         <w:t>4. Marco conceptual: programación en hilos y tareas</w:t>
       </w:r>
@@ -5456,7 +5902,7 @@
         <w:pStyle w:val="Heading2"/>
         <w:spacing w:before="260" w:after="120"/>
       </w:pPr>
-      <w:bookmarkStart w:id="10" w:name="_Toc236976764"/>
+      <w:bookmarkStart w:id="10" w:name="_Toc237016805"/>
       <w:r>
         <w:t>4.1 Proceso, hilo y tarea: tres cosas distintas</w:t>
       </w:r>
@@ -6016,7 +6462,7 @@
         <w:pStyle w:val="Heading2"/>
         <w:spacing w:before="260" w:after="120"/>
       </w:pPr>
-      <w:bookmarkStart w:id="11" w:name="_Toc236976765"/>
+      <w:bookmarkStart w:id="11" w:name="_Toc237016806"/>
       <w:r>
         <w:t>4.2 Concurrencia no es paralelismo</w:t>
       </w:r>
@@ -6092,7 +6538,7 @@
         <w:pStyle w:val="Heading2"/>
         <w:spacing w:before="260" w:after="120"/>
       </w:pPr>
-      <w:bookmarkStart w:id="12" w:name="_Toc236976766"/>
+      <w:bookmarkStart w:id="12" w:name="_Toc237016807"/>
       <w:r>
         <w:t>4.3 Programación distribuida</w:t>
       </w:r>
@@ -6158,7 +6604,7 @@
         <w:pStyle w:val="Heading2"/>
         <w:spacing w:before="260" w:after="120"/>
       </w:pPr>
-      <w:bookmarkStart w:id="13" w:name="_Toc236976767"/>
+      <w:bookmarkStart w:id="13" w:name="_Toc237016808"/>
       <w:r>
         <w:t>4.4 Mecanismos de sincronización</w:t>
       </w:r>
@@ -6731,7 +7177,7 @@
         <w:pStyle w:val="Heading2"/>
         <w:spacing w:before="260" w:after="120"/>
       </w:pPr>
-      <w:bookmarkStart w:id="14" w:name="_Toc236976768"/>
+      <w:bookmarkStart w:id="14" w:name="_Toc237016809"/>
       <w:r>
         <w:t>4.5 Los tres errores clásicos, y cómo se evitan aquí</w:t>
       </w:r>
@@ -6742,7 +7188,7 @@
         <w:pStyle w:val="Heading3"/>
         <w:spacing w:before="200" w:after="100"/>
       </w:pPr>
-      <w:bookmarkStart w:id="15" w:name="_Toc236976769"/>
+      <w:bookmarkStart w:id="15" w:name="_Toc237016810"/>
       <w:r>
         <w:t>Condición de carrera</w:t>
       </w:r>
@@ -6761,7 +7207,7 @@
         <w:pStyle w:val="Heading3"/>
         <w:spacing w:before="200" w:after="100"/>
       </w:pPr>
-      <w:bookmarkStart w:id="16" w:name="_Toc236976770"/>
+      <w:bookmarkStart w:id="16" w:name="_Toc237016811"/>
       <w:r>
         <w:t>Interbloqueo (deadlock)</w:t>
       </w:r>
@@ -6780,7 +7226,7 @@
         <w:pStyle w:val="Heading3"/>
         <w:spacing w:before="200" w:after="100"/>
       </w:pPr>
-      <w:bookmarkStart w:id="17" w:name="_Toc236976771"/>
+      <w:bookmarkStart w:id="17" w:name="_Toc237016812"/>
       <w:r>
         <w:t>Inversión de prioridad</w:t>
       </w:r>
@@ -6825,7 +7271,7 @@
         </w:pBdr>
         <w:spacing w:before="360" w:after="180"/>
       </w:pPr>
-      <w:bookmarkStart w:id="18" w:name="_Toc236976772"/>
+      <w:bookmarkStart w:id="18" w:name="_Toc237016813"/>
       <w:r>
         <w:t>5. Desarrollo del caso práctico: SmartPower RD</w:t>
       </w:r>
@@ -6836,7 +7282,7 @@
         <w:pStyle w:val="Heading2"/>
         <w:spacing w:before="260" w:after="120"/>
       </w:pPr>
-      <w:bookmarkStart w:id="19" w:name="_Toc236976773"/>
+      <w:bookmarkStart w:id="19" w:name="_Toc237016814"/>
       <w:r>
         <w:t>5.1 Descripción funcional</w:t>
       </w:r>
@@ -6907,7 +7353,7 @@
         <w:pStyle w:val="Heading2"/>
         <w:spacing w:before="260" w:after="120"/>
       </w:pPr>
-      <w:bookmarkStart w:id="20" w:name="_Toc236976774"/>
+      <w:bookmarkStart w:id="20" w:name="_Toc237016815"/>
       <w:r>
         <w:t>5.2 Arquitectura del sistema</w:t>
       </w:r>
@@ -7342,7 +7788,7 @@
         <w:pStyle w:val="Heading2"/>
         <w:spacing w:before="260" w:after="120"/>
       </w:pPr>
-      <w:bookmarkStart w:id="21" w:name="_Toc236976775"/>
+      <w:bookmarkStart w:id="21" w:name="_Toc237016816"/>
       <w:r>
         <w:t>5.3 Componentes de hardware y su función</w:t>
       </w:r>
@@ -7982,7 +8428,7 @@
         <w:pStyle w:val="Heading2"/>
         <w:spacing w:before="260" w:after="120"/>
       </w:pPr>
-      <w:bookmarkStart w:id="22" w:name="_Toc236976776"/>
+      <w:bookmarkStart w:id="22" w:name="_Toc237016817"/>
       <w:r>
         <w:t>5.4 Arquitectura de tareas: la decisión central del diseño</w:t>
       </w:r>
@@ -8857,7 +9303,7 @@
         <w:pStyle w:val="Heading2"/>
         <w:spacing w:before="260" w:after="120"/>
       </w:pPr>
-      <w:bookmarkStart w:id="23" w:name="_Toc236976777"/>
+      <w:bookmarkStart w:id="23" w:name="_Toc237016818"/>
       <w:r>
         <w:t>5.5 Flujo de datos y de sincronización</w:t>
       </w:r>
@@ -9215,7 +9661,7 @@
         <w:pStyle w:val="Heading2"/>
         <w:spacing w:before="260" w:after="120"/>
       </w:pPr>
-      <w:bookmarkStart w:id="24" w:name="_Toc236976778"/>
+      <w:bookmarkStart w:id="24" w:name="_Toc237016819"/>
       <w:r>
         <w:t>5.6 Fragmento representativo del código</w:t>
       </w:r>
@@ -9675,7 +10121,7 @@
         <w:pStyle w:val="Heading2"/>
         <w:spacing w:before="260" w:after="120"/>
       </w:pPr>
-      <w:bookmarkStart w:id="25" w:name="_Toc236976779"/>
+      <w:bookmarkStart w:id="25" w:name="_Toc237016820"/>
       <w:r>
         <w:t>5.7 Extensión con inteligencia artificial</w:t>
       </w:r>
@@ -9762,7 +10208,7 @@
         <w:pStyle w:val="Heading2"/>
         <w:spacing w:before="260" w:after="120"/>
       </w:pPr>
-      <w:bookmarkStart w:id="26" w:name="_Toc236976780"/>
+      <w:bookmarkStart w:id="26" w:name="_Toc237016821"/>
       <w:r>
         <w:t>5.8 Implementación en Arduino Cloud</w:t>
       </w:r>
@@ -9789,7 +10235,7 @@
         <w:pStyle w:val="Heading3"/>
         <w:spacing w:before="200" w:after="100"/>
       </w:pPr>
-      <w:bookmarkStart w:id="27" w:name="_Toc236976781"/>
+      <w:bookmarkStart w:id="27" w:name="_Toc237016822"/>
       <w:r>
         <w:t>El problema que plantea ArduinoCloud.update()</w:t>
       </w:r>
@@ -9816,7 +10262,7 @@
         <w:pStyle w:val="Heading3"/>
         <w:spacing w:before="200" w:after="100"/>
       </w:pPr>
-      <w:bookmarkStart w:id="28" w:name="_Toc236976782"/>
+      <w:bookmarkStart w:id="28" w:name="_Toc237016823"/>
       <w:r>
         <w:t>Seguridad entre hilos de las variables de nube</w:t>
       </w:r>
@@ -9838,7 +10284,7 @@
         <w:pStyle w:val="Heading3"/>
         <w:spacing w:before="200" w:after="100"/>
       </w:pPr>
-      <w:bookmarkStart w:id="29" w:name="_Toc236976783"/>
+      <w:bookmarkStart w:id="29" w:name="_Toc237016824"/>
       <w:r>
         <w:t>Variables de nube y tablero</w:t>
       </w:r>
@@ -11376,9 +11822,9 @@
         </w:pBdr>
         <w:spacing w:before="360" w:after="180"/>
       </w:pPr>
-      <w:bookmarkStart w:id="30" w:name="_Toc236976784"/>
-      <w:r>
-        <w:t>6. Evidencias demostrables de programación concurrente</w:t>
+      <w:bookmarkStart w:id="30" w:name="_Toc237016825"/>
+      <w:r>
+        <w:t>6. Revisión del diseño a partir de la retroalimentación</w:t>
       </w:r>
       <w:bookmarkEnd w:id="30"/>
     </w:p>
@@ -11387,7 +11833,110 @@
         <w:spacing w:after="120" w:line="276" w:lineRule="auto"/>
       </w:pPr>
       <w:r>
-        <w:t>Esta sección responde al tercer componente de la asignación. Se desarrollaron seis programas ejecutables, ordenados como una progresión argumental: el primero muestra el problema, los cuatro siguientes construyen la solución capa por capa, y el último la mide en una PC. Todos son reproducibles desde los enlaces del Anexo A.</w:t>
+        <w:t>El facilitador planteó tres observaciones sobre la primera versión del sistema: si la instalación es de una o de dos fases, si lo que se protege es el inversor o los electrodomésticos, y la necesidad de una batería para que el equipo no deje de vigilar el voltaje mientras el programa está ocupado reconectando. Las tres son correctas y la tercera señala un defecto de fondo que el diseño original no resolvía. Esta sección documenta el análisis y los cambios aplicados en la versión 2.0.</w:t>
+      </w:r>
+    </w:p>
+    <w:p>
+      <w:pPr>
+        <w:pStyle w:val="Heading2"/>
+        <w:spacing w:before="260" w:after="120"/>
+      </w:pPr>
+      <w:bookmarkStart w:id="31" w:name="_Toc237016826"/>
+      <w:r>
+        <w:t>6.1 ¿Una fase o dos fases?</w:t>
+      </w:r>
+      <w:bookmarkEnd w:id="31"/>
+    </w:p>
+    <w:p>
+      <w:pPr>
+        <w:spacing w:after="120" w:line="276" w:lineRule="auto"/>
+      </w:pPr>
+      <w:r>
+        <w:t>La acometida residencial dominicana se presenta en dos configuraciones. La monofásica a dos hilos entrega 120 V entre una línea viva y el neutro, y es la de apartamentos y viviendas pequeñas sin equipos de 240 V. La monofásica trifilar, llamada corrientemente fase partida, entrega dos líneas vivas desfasadas 180 grados más un neutro: 120 V de cada línea al neutro y 240 V entre ambas. Es la habitual en viviendas con aire acondicionado, calentador eléctrico, estufa o bomba de agua.</w:t>
+      </w:r>
+    </w:p>
+    <w:p>
+      <w:pPr>
+        <w:spacing w:after="120" w:line="276" w:lineRule="auto"/>
+      </w:pPr>
+      <w:r>
+        <w:t>La primera versión medía una sola línea, y esa simplificación deja ciegas dos fallas que son precisamente las más caras.</w:t>
+      </w:r>
+    </w:p>
+    <w:p>
+      <w:pPr>
+        <w:pStyle w:val="Heading3"/>
+        <w:spacing w:before="200" w:after="100"/>
+      </w:pPr>
+      <w:bookmarkStart w:id="32" w:name="_Toc237016827"/>
+      <w:r>
+        <w:t>Fase perdida</w:t>
+      </w:r>
+      <w:bookmarkEnd w:id="32"/>
+    </w:p>
+    <w:p>
+      <w:pPr>
+        <w:spacing w:after="120" w:line="276" w:lineRule="auto"/>
+      </w:pPr>
+      <w:r>
+        <w:t>Un fusible del transformador de la distribuidora puede abrirse y dejar sin servicio una sola de las dos líneas. Si el monitor vigila L1 y la que muere es L2, el sistema no detecta absolutamente nada: reporta 120 V correctos mientras media vivienda queda sin luz. Peor aún, los equipos de 240 V quedan alimentados con la mitad de la tensión, que es la forma más rápida de quemar el compresor de un aire acondicionado.</w:t>
+      </w:r>
+    </w:p>
+    <w:p>
+      <w:pPr>
+        <w:pStyle w:val="Heading3"/>
+        <w:spacing w:before="200" w:after="100"/>
+      </w:pPr>
+      <w:bookmarkStart w:id="33" w:name="_Toc237016828"/>
+      <w:r>
+        <w:t>Neutro perdido</w:t>
+      </w:r>
+      <w:bookmarkEnd w:id="33"/>
+    </w:p>
+    <w:p>
+      <w:pPr>
+        <w:spacing w:after="120" w:line="276" w:lineRule="auto"/>
+      </w:pPr>
+      <w:r>
+        <w:t>Es la falla más destructiva de una instalación residencial y merece una explicación, porque no es intuitiva. Si el conductor neutro se suelta, las dos líneas quedan conectadas en serie a través de las cargas de la casa. El voltaje de 240 V se reparte entonces entre ambas en proporción inversa a su carga: la línea con menos aparatos conectados sube hacia 180 o 200 V, y la otra colapsa. En cuestión de segundos se queman los equipos del lado que subió.</w:t>
+      </w:r>
+    </w:p>
+    <w:p>
+      <w:pPr>
+        <w:spacing w:after="120" w:line="276" w:lineRule="auto"/>
+      </w:pPr>
+      <w:r>
+        <w:t>Con un solo sensor este fenómeno es literalmente invisible: si el sensor está en la línea que colapsó, el sistema cree que hay una subtensión ordinaria; si está en la que subió, cree que hay una sobretensión ordinaria. En ambos casos diagnostica mal. Con dos sensores la firma es inconfundible: la suma de las dos líneas se mantiene cerca de 240 V mientras la diferencia entre ellas se dispara. Por eso la versión 2.0 declara el estado NEUTRO_PERDIDO cuando el desbalance supera los 25 V, y lo evalúa antes que c</w:t>
+      </w:r>
+      <w:r>
+        <w:t>ualquier otra condición.</w:t>
+      </w:r>
+    </w:p>
+    <w:p>
+      <w:pPr>
+        <w:spacing w:after="120" w:line="276" w:lineRule="auto"/>
+      </w:pPr>
+      <w:r>
+        <w:t>La decisión de diseño fue implementar el caso general de fase partida, con dos sensores de voltaje y dos de corriente. Para una vivienda monofásica simple basta con poner la constante MONOFASICO en true: el mismo programa ignora entonces la segunda línea y desactiva la detección de desbalance, sin tocar una sola línea de lógica.</w:t>
+      </w:r>
+    </w:p>
+    <w:p>
+      <w:pPr>
+        <w:pStyle w:val="Heading2"/>
+        <w:spacing w:before="260" w:after="120"/>
+      </w:pPr>
+      <w:bookmarkStart w:id="34" w:name="_Toc237016829"/>
+      <w:r>
+        <w:t>6.2 ¿Se protege el inversor o se protegen los electrodomésticos?</w:t>
+      </w:r>
+      <w:bookmarkEnd w:id="34"/>
+    </w:p>
+    <w:p>
+      <w:pPr>
+        <w:spacing w:after="120" w:line="276" w:lineRule="auto"/>
+      </w:pPr>
+      <w:r>
+        <w:t>La pregunta del facilitador expone algo que el diseño original daba por supuesto sin decirlo. Son dos objetivos distintos y en ciertos momentos opuestos, y conviene resolverlos explícitamente.</w:t>
       </w:r>
     </w:p>
     <w:p>
@@ -11404,6 +11953,796 @@
           <w:szCs w:val="19"/>
         </w:rPr>
         <w:t xml:space="preserve">Tabla 7. </w:t>
+      </w:r>
+      <w:r>
+        <w:rPr>
+          <w:color w:val="404040"/>
+          <w:sz w:val="19"/>
+          <w:szCs w:val="19"/>
+        </w:rPr>
+        <w:t>Los tres escenarios de protección y cómo los resuelve el sistema.</w:t>
+      </w:r>
+    </w:p>
+    <w:tbl>
+      <w:tblPr>
+        <w:tblW w:w="9360" w:type="dxa"/>
+        <w:tblBorders>
+          <w:top w:val="single" w:sz="4" w:space="0" w:color="BFBFBF"/>
+          <w:left w:val="single" w:sz="4" w:space="0" w:color="BFBFBF"/>
+          <w:bottom w:val="single" w:sz="4" w:space="0" w:color="BFBFBF"/>
+          <w:right w:val="single" w:sz="4" w:space="0" w:color="BFBFBF"/>
+          <w:insideH w:val="single" w:sz="2" w:space="0" w:color="D9D9D9"/>
+          <w:insideV w:val="single" w:sz="2" w:space="0" w:color="D9D9D9"/>
+        </w:tblBorders>
+        <w:tblCellMar>
+          <w:left w:w="10" w:type="dxa"/>
+          <w:right w:w="10" w:type="dxa"/>
+        </w:tblCellMar>
+        <w:tblLook w:val="04A0" w:firstRow="1" w:lastRow="0" w:firstColumn="1" w:lastColumn="0" w:noHBand="0" w:noVBand="1"/>
+      </w:tblPr>
+      <w:tblGrid>
+        <w:gridCol w:w="1700"/>
+        <w:gridCol w:w="3200"/>
+        <w:gridCol w:w="4460"/>
+      </w:tblGrid>
+      <w:tr>
+        <w:tblPrEx>
+          <w:tblCellMar>
+            <w:top w:w="0" w:type="dxa"/>
+            <w:bottom w:w="0" w:type="dxa"/>
+          </w:tblCellMar>
+        </w:tblPrEx>
+        <w:trPr>
+          <w:cantSplit/>
+          <w:tblHeader/>
+        </w:trPr>
+        <w:tc>
+          <w:tcPr>
+            <w:tcW w:w="1700" w:type="dxa"/>
+            <w:shd w:val="clear" w:color="auto" w:fill="1F3864"/>
+            <w:tcMar>
+              <w:top w:w="60" w:type="dxa"/>
+              <w:left w:w="100" w:type="dxa"/>
+              <w:bottom w:w="60" w:type="dxa"/>
+              <w:right w:w="100" w:type="dxa"/>
+            </w:tcMar>
+            <w:vAlign w:val="center"/>
+          </w:tcPr>
+          <w:p>
+            <w:r>
+              <w:rPr>
+                <w:b/>
+                <w:bCs/>
+                <w:color w:val="FFFFFF"/>
+                <w:sz w:val="19"/>
+                <w:szCs w:val="19"/>
+              </w:rPr>
+              <w:t>Escenario</w:t>
+            </w:r>
+          </w:p>
+        </w:tc>
+        <w:tc>
+          <w:tcPr>
+            <w:tcW w:w="3200" w:type="dxa"/>
+            <w:shd w:val="clear" w:color="auto" w:fill="1F3864"/>
+            <w:tcMar>
+              <w:top w:w="60" w:type="dxa"/>
+              <w:left w:w="100" w:type="dxa"/>
+              <w:bottom w:w="60" w:type="dxa"/>
+              <w:right w:w="100" w:type="dxa"/>
+            </w:tcMar>
+            <w:vAlign w:val="center"/>
+          </w:tcPr>
+          <w:p>
+            <w:pPr>
+              <w:jc w:val="center"/>
+            </w:pPr>
+            <w:r>
+              <w:rPr>
+                <w:b/>
+                <w:bCs/>
+                <w:color w:val="FFFFFF"/>
+                <w:sz w:val="19"/>
+                <w:szCs w:val="19"/>
+              </w:rPr>
+              <w:t>Qué se protege</w:t>
+            </w:r>
+          </w:p>
+        </w:tc>
+        <w:tc>
+          <w:tcPr>
+            <w:tcW w:w="4460" w:type="dxa"/>
+            <w:shd w:val="clear" w:color="auto" w:fill="1F3864"/>
+            <w:tcMar>
+              <w:top w:w="60" w:type="dxa"/>
+              <w:left w:w="100" w:type="dxa"/>
+              <w:bottom w:w="60" w:type="dxa"/>
+              <w:right w:w="100" w:type="dxa"/>
+            </w:tcMar>
+            <w:vAlign w:val="center"/>
+          </w:tcPr>
+          <w:p>
+            <w:pPr>
+              <w:jc w:val="center"/>
+            </w:pPr>
+            <w:r>
+              <w:rPr>
+                <w:b/>
+                <w:bCs/>
+                <w:color w:val="FFFFFF"/>
+                <w:sz w:val="19"/>
+                <w:szCs w:val="19"/>
+              </w:rPr>
+              <w:t>Cómo actúa el sistema</w:t>
+            </w:r>
+          </w:p>
+        </w:tc>
+      </w:tr>
+      <w:tr>
+        <w:tblPrEx>
+          <w:tblCellMar>
+            <w:top w:w="0" w:type="dxa"/>
+            <w:bottom w:w="0" w:type="dxa"/>
+          </w:tblCellMar>
+        </w:tblPrEx>
+        <w:trPr>
+          <w:cantSplit/>
+        </w:trPr>
+        <w:tc>
+          <w:tcPr>
+            <w:tcW w:w="1700" w:type="dxa"/>
+            <w:tcMar>
+              <w:top w:w="60" w:type="dxa"/>
+              <w:left w:w="100" w:type="dxa"/>
+              <w:bottom w:w="60" w:type="dxa"/>
+              <w:right w:w="100" w:type="dxa"/>
+            </w:tcMar>
+            <w:vAlign w:val="center"/>
+          </w:tcPr>
+          <w:p>
+            <w:r>
+              <w:rPr>
+                <w:sz w:val="19"/>
+                <w:szCs w:val="19"/>
+              </w:rPr>
+              <w:t>A. Con inversor</w:t>
+            </w:r>
+          </w:p>
+        </w:tc>
+        <w:tc>
+          <w:tcPr>
+            <w:tcW w:w="3200" w:type="dxa"/>
+            <w:tcMar>
+              <w:top w:w="60" w:type="dxa"/>
+              <w:left w:w="100" w:type="dxa"/>
+              <w:bottom w:w="60" w:type="dxa"/>
+              <w:right w:w="100" w:type="dxa"/>
+            </w:tcMar>
+            <w:vAlign w:val="center"/>
+          </w:tcPr>
+          <w:p>
+            <w:pPr>
+              <w:jc w:val="right"/>
+            </w:pPr>
+            <w:r>
+              <w:rPr>
+                <w:sz w:val="19"/>
+                <w:szCs w:val="19"/>
+              </w:rPr>
+              <w:t>Los electrodomésticos</w:t>
+            </w:r>
+          </w:p>
+        </w:tc>
+        <w:tc>
+          <w:tcPr>
+            <w:tcW w:w="4460" w:type="dxa"/>
+            <w:tcMar>
+              <w:top w:w="60" w:type="dxa"/>
+              <w:left w:w="100" w:type="dxa"/>
+              <w:bottom w:w="60" w:type="dxa"/>
+              <w:right w:w="100" w:type="dxa"/>
+            </w:tcMar>
+            <w:vAlign w:val="center"/>
+          </w:tcPr>
+          <w:p>
+            <w:pPr>
+              <w:jc w:val="right"/>
+            </w:pPr>
+            <w:r>
+              <w:rPr>
+                <w:sz w:val="19"/>
+                <w:szCs w:val="19"/>
+              </w:rPr>
+              <w:t>Ante voltaje peligroso transfiere la carga al inversor. Los equipos quedan alimentados con onda limpia. Es el objetivo principal del proyecto.</w:t>
+            </w:r>
+          </w:p>
+        </w:tc>
+      </w:tr>
+      <w:tr>
+        <w:tblPrEx>
+          <w:tblCellMar>
+            <w:top w:w="0" w:type="dxa"/>
+            <w:bottom w:w="0" w:type="dxa"/>
+          </w:tblCellMar>
+        </w:tblPrEx>
+        <w:trPr>
+          <w:cantSplit/>
+        </w:trPr>
+        <w:tc>
+          <w:tcPr>
+            <w:tcW w:w="1700" w:type="dxa"/>
+            <w:shd w:val="clear" w:color="auto" w:fill="F2F2F2"/>
+            <w:tcMar>
+              <w:top w:w="60" w:type="dxa"/>
+              <w:left w:w="100" w:type="dxa"/>
+              <w:bottom w:w="60" w:type="dxa"/>
+              <w:right w:w="100" w:type="dxa"/>
+            </w:tcMar>
+            <w:vAlign w:val="center"/>
+          </w:tcPr>
+          <w:p>
+            <w:r>
+              <w:rPr>
+                <w:sz w:val="19"/>
+                <w:szCs w:val="19"/>
+              </w:rPr>
+              <w:t>B. Con inversor</w:t>
+            </w:r>
+          </w:p>
+        </w:tc>
+        <w:tc>
+          <w:tcPr>
+            <w:tcW w:w="3200" w:type="dxa"/>
+            <w:shd w:val="clear" w:color="auto" w:fill="F2F2F2"/>
+            <w:tcMar>
+              <w:top w:w="60" w:type="dxa"/>
+              <w:left w:w="100" w:type="dxa"/>
+              <w:bottom w:w="60" w:type="dxa"/>
+              <w:right w:w="100" w:type="dxa"/>
+            </w:tcMar>
+            <w:vAlign w:val="center"/>
+          </w:tcPr>
+          <w:p>
+            <w:pPr>
+              <w:jc w:val="right"/>
+            </w:pPr>
+            <w:r>
+              <w:rPr>
+                <w:sz w:val="19"/>
+                <w:szCs w:val="19"/>
+              </w:rPr>
+              <w:t>El inversor y el banco de baterías</w:t>
+            </w:r>
+          </w:p>
+        </w:tc>
+        <w:tc>
+          <w:tcPr>
+            <w:tcW w:w="4460" w:type="dxa"/>
+            <w:shd w:val="clear" w:color="auto" w:fill="F2F2F2"/>
+            <w:tcMar>
+              <w:top w:w="60" w:type="dxa"/>
+              <w:left w:w="100" w:type="dxa"/>
+              <w:bottom w:w="60" w:type="dxa"/>
+              <w:right w:w="100" w:type="dxa"/>
+            </w:tcMar>
+            <w:vAlign w:val="center"/>
+          </w:tcPr>
+          <w:p>
+            <w:pPr>
+              <w:jc w:val="right"/>
+            </w:pPr>
+            <w:r>
+              <w:rPr>
+                <w:sz w:val="19"/>
+                <w:szCs w:val="19"/>
+              </w:rPr>
+              <w:t>Aquí aparece el conflicto: el inversor aguanta 2400 W y la vivienda puede pedir 5000 W. Se activa el deslastre de carga.</w:t>
+            </w:r>
+          </w:p>
+        </w:tc>
+      </w:tr>
+      <w:tr>
+        <w:tblPrEx>
+          <w:tblCellMar>
+            <w:top w:w="0" w:type="dxa"/>
+            <w:bottom w:w="0" w:type="dxa"/>
+          </w:tblCellMar>
+        </w:tblPrEx>
+        <w:trPr>
+          <w:cantSplit/>
+        </w:trPr>
+        <w:tc>
+          <w:tcPr>
+            <w:tcW w:w="1700" w:type="dxa"/>
+            <w:tcMar>
+              <w:top w:w="60" w:type="dxa"/>
+              <w:left w:w="100" w:type="dxa"/>
+              <w:bottom w:w="60" w:type="dxa"/>
+              <w:right w:w="100" w:type="dxa"/>
+            </w:tcMar>
+            <w:vAlign w:val="center"/>
+          </w:tcPr>
+          <w:p>
+            <w:r>
+              <w:rPr>
+                <w:sz w:val="19"/>
+                <w:szCs w:val="19"/>
+              </w:rPr>
+              <w:t>C. Sin inversor</w:t>
+            </w:r>
+          </w:p>
+        </w:tc>
+        <w:tc>
+          <w:tcPr>
+            <w:tcW w:w="3200" w:type="dxa"/>
+            <w:tcMar>
+              <w:top w:w="60" w:type="dxa"/>
+              <w:left w:w="100" w:type="dxa"/>
+              <w:bottom w:w="60" w:type="dxa"/>
+              <w:right w:w="100" w:type="dxa"/>
+            </w:tcMar>
+            <w:vAlign w:val="center"/>
+          </w:tcPr>
+          <w:p>
+            <w:pPr>
+              <w:jc w:val="right"/>
+            </w:pPr>
+            <w:r>
+              <w:rPr>
+                <w:sz w:val="19"/>
+                <w:szCs w:val="19"/>
+              </w:rPr>
+              <w:t>Los electrodomésticos, sin continuidad</w:t>
+            </w:r>
+          </w:p>
+        </w:tc>
+        <w:tc>
+          <w:tcPr>
+            <w:tcW w:w="4460" w:type="dxa"/>
+            <w:tcMar>
+              <w:top w:w="60" w:type="dxa"/>
+              <w:left w:w="100" w:type="dxa"/>
+              <w:bottom w:w="60" w:type="dxa"/>
+              <w:right w:w="100" w:type="dxa"/>
+            </w:tcMar>
+            <w:vAlign w:val="center"/>
+          </w:tcPr>
+          <w:p>
+            <w:pPr>
+              <w:jc w:val="right"/>
+            </w:pPr>
+            <w:r>
+              <w:rPr>
+                <w:sz w:val="19"/>
+                <w:szCs w:val="19"/>
+              </w:rPr>
+              <w:t>No hay adónde transferir, pero sí de qué proteger: abre el contactor, desconecta la casa de la red peligrosa, avisa, y reconecta al normalizarse.</w:t>
+            </w:r>
+          </w:p>
+        </w:tc>
+      </w:tr>
+    </w:tbl>
+    <w:p>
+      <w:pPr>
+        <w:spacing w:after="120" w:line="276" w:lineRule="auto"/>
+      </w:pPr>
+      <w:r>
+        <w:t>El conflicto del escenario B es real y frecuente. Transferir toda la vivienda a un inversor de menor capacidad lo sobrecarga y lo hace apagarse por protección, con lo que se pierde incluso el refrigerador, que era justamente lo que se quería salvar. La respuesta es el deslastre de carga: un segundo relevador corta los circuitos no esenciales —aire acondicionado, calentador, secadora— y deja vivos los esenciales, que son la nevera, la iluminación y las comunicaciones.</w:t>
+      </w:r>
+    </w:p>
+    <w:p>
+      <w:pPr>
+        <w:spacing w:after="120" w:line="276" w:lineRule="auto"/>
+      </w:pPr>
+      <w:r>
+        <w:t>El deslastre se dispara por dos motivos independientes. El primero es que el consumo medido supere la capacidad del inversor. El segundo es que el banco de baterías caiga por debajo de 11.8 V, porque descargar una batería de plomo-ácido más allá del cincuenta por ciento le acorta la vida útil a la mitad; proteger la batería es proteger la inversión más cara de la instalación.</w:t>
+      </w:r>
+    </w:p>
+    <w:p>
+      <w:pPr>
+        <w:pStyle w:val="Heading2"/>
+        <w:spacing w:before="260" w:after="120"/>
+      </w:pPr>
+      <w:bookmarkStart w:id="35" w:name="_Toc237016830"/>
+      <w:r>
+        <w:t>6.3 La alimentación del propio monitor</w:t>
+      </w:r>
+      <w:bookmarkEnd w:id="35"/>
+    </w:p>
+    <w:p>
+      <w:pPr>
+        <w:spacing w:after="120" w:line="276" w:lineRule="auto"/>
+      </w:pPr>
+      <w:r>
+        <w:t>Esta es la observación más importante de las tres, porque señala un defecto que ninguna cantidad de buena programación podía corregir. Conviene separar dos problemas que se parecen y que tienen soluciones completamente distintas.</w:t>
+      </w:r>
+    </w:p>
+    <w:p>
+      <w:pPr>
+        <w:keepNext/>
+        <w:spacing w:before="200" w:after="80"/>
+      </w:pPr>
+      <w:r>
+        <w:rPr>
+          <w:b/>
+          <w:bCs/>
+          <w:color w:val="1F3864"/>
+          <w:sz w:val="19"/>
+          <w:szCs w:val="19"/>
+        </w:rPr>
+        <w:t xml:space="preserve">Tabla 8. </w:t>
+      </w:r>
+      <w:r>
+        <w:rPr>
+          <w:color w:val="404040"/>
+          <w:sz w:val="19"/>
+          <w:szCs w:val="19"/>
+        </w:rPr>
+        <w:t>Dos problemas distintos que impedían vigilar el voltaje.</w:t>
+      </w:r>
+    </w:p>
+    <w:tbl>
+      <w:tblPr>
+        <w:tblW w:w="9360" w:type="dxa"/>
+        <w:tblBorders>
+          <w:top w:val="single" w:sz="4" w:space="0" w:color="BFBFBF"/>
+          <w:left w:val="single" w:sz="4" w:space="0" w:color="BFBFBF"/>
+          <w:bottom w:val="single" w:sz="4" w:space="0" w:color="BFBFBF"/>
+          <w:right w:val="single" w:sz="4" w:space="0" w:color="BFBFBF"/>
+          <w:insideH w:val="single" w:sz="2" w:space="0" w:color="D9D9D9"/>
+          <w:insideV w:val="single" w:sz="2" w:space="0" w:color="D9D9D9"/>
+        </w:tblBorders>
+        <w:tblCellMar>
+          <w:left w:w="10" w:type="dxa"/>
+          <w:right w:w="10" w:type="dxa"/>
+        </w:tblCellMar>
+        <w:tblLook w:val="04A0" w:firstRow="1" w:lastRow="0" w:firstColumn="1" w:lastColumn="0" w:noHBand="0" w:noVBand="1"/>
+      </w:tblPr>
+      <w:tblGrid>
+        <w:gridCol w:w="2400"/>
+        <w:gridCol w:w="3400"/>
+        <w:gridCol w:w="3560"/>
+      </w:tblGrid>
+      <w:tr>
+        <w:tblPrEx>
+          <w:tblCellMar>
+            <w:top w:w="0" w:type="dxa"/>
+            <w:bottom w:w="0" w:type="dxa"/>
+          </w:tblCellMar>
+        </w:tblPrEx>
+        <w:trPr>
+          <w:cantSplit/>
+          <w:tblHeader/>
+        </w:trPr>
+        <w:tc>
+          <w:tcPr>
+            <w:tcW w:w="2400" w:type="dxa"/>
+            <w:shd w:val="clear" w:color="auto" w:fill="1F3864"/>
+            <w:tcMar>
+              <w:top w:w="60" w:type="dxa"/>
+              <w:left w:w="100" w:type="dxa"/>
+              <w:bottom w:w="60" w:type="dxa"/>
+              <w:right w:w="100" w:type="dxa"/>
+            </w:tcMar>
+            <w:vAlign w:val="center"/>
+          </w:tcPr>
+          <w:p>
+            <w:r>
+              <w:rPr>
+                <w:b/>
+                <w:bCs/>
+                <w:color w:val="FFFFFF"/>
+                <w:sz w:val="19"/>
+                <w:szCs w:val="19"/>
+              </w:rPr>
+              <w:t>Problema</w:t>
+            </w:r>
+          </w:p>
+        </w:tc>
+        <w:tc>
+          <w:tcPr>
+            <w:tcW w:w="3400" w:type="dxa"/>
+            <w:shd w:val="clear" w:color="auto" w:fill="1F3864"/>
+            <w:tcMar>
+              <w:top w:w="60" w:type="dxa"/>
+              <w:left w:w="100" w:type="dxa"/>
+              <w:bottom w:w="60" w:type="dxa"/>
+              <w:right w:w="100" w:type="dxa"/>
+            </w:tcMar>
+            <w:vAlign w:val="center"/>
+          </w:tcPr>
+          <w:p>
+            <w:pPr>
+              <w:jc w:val="center"/>
+            </w:pPr>
+            <w:r>
+              <w:rPr>
+                <w:b/>
+                <w:bCs/>
+                <w:color w:val="FFFFFF"/>
+                <w:sz w:val="19"/>
+                <w:szCs w:val="19"/>
+              </w:rPr>
+              <w:t>Por qué ocurre</w:t>
+            </w:r>
+          </w:p>
+        </w:tc>
+        <w:tc>
+          <w:tcPr>
+            <w:tcW w:w="3560" w:type="dxa"/>
+            <w:shd w:val="clear" w:color="auto" w:fill="1F3864"/>
+            <w:tcMar>
+              <w:top w:w="60" w:type="dxa"/>
+              <w:left w:w="100" w:type="dxa"/>
+              <w:bottom w:w="60" w:type="dxa"/>
+              <w:right w:w="100" w:type="dxa"/>
+            </w:tcMar>
+            <w:vAlign w:val="center"/>
+          </w:tcPr>
+          <w:p>
+            <w:pPr>
+              <w:jc w:val="center"/>
+            </w:pPr>
+            <w:r>
+              <w:rPr>
+                <w:b/>
+                <w:bCs/>
+                <w:color w:val="FFFFFF"/>
+                <w:sz w:val="19"/>
+                <w:szCs w:val="19"/>
+              </w:rPr>
+              <w:t>Solución</w:t>
+            </w:r>
+          </w:p>
+        </w:tc>
+      </w:tr>
+      <w:tr>
+        <w:tblPrEx>
+          <w:tblCellMar>
+            <w:top w:w="0" w:type="dxa"/>
+            <w:bottom w:w="0" w:type="dxa"/>
+          </w:tblCellMar>
+        </w:tblPrEx>
+        <w:trPr>
+          <w:cantSplit/>
+        </w:trPr>
+        <w:tc>
+          <w:tcPr>
+            <w:tcW w:w="2400" w:type="dxa"/>
+            <w:tcMar>
+              <w:top w:w="60" w:type="dxa"/>
+              <w:left w:w="100" w:type="dxa"/>
+              <w:bottom w:w="60" w:type="dxa"/>
+              <w:right w:w="100" w:type="dxa"/>
+            </w:tcMar>
+            <w:vAlign w:val="center"/>
+          </w:tcPr>
+          <w:p>
+            <w:r>
+              <w:rPr>
+                <w:sz w:val="19"/>
+                <w:szCs w:val="19"/>
+              </w:rPr>
+              <w:t>De software</w:t>
+            </w:r>
+          </w:p>
+        </w:tc>
+        <w:tc>
+          <w:tcPr>
+            <w:tcW w:w="3400" w:type="dxa"/>
+            <w:tcMar>
+              <w:top w:w="60" w:type="dxa"/>
+              <w:left w:w="100" w:type="dxa"/>
+              <w:bottom w:w="60" w:type="dxa"/>
+              <w:right w:w="100" w:type="dxa"/>
+            </w:tcMar>
+            <w:vAlign w:val="center"/>
+          </w:tcPr>
+          <w:p>
+            <w:pPr>
+              <w:jc w:val="right"/>
+            </w:pPr>
+            <w:r>
+              <w:rPr>
+                <w:sz w:val="19"/>
+                <w:szCs w:val="19"/>
+              </w:rPr>
+              <w:t>Una tarea lenta —reconectar el WiFi puede tardar 8 s— bloquea a la tarea crítica que vigila el voltaje.</w:t>
+            </w:r>
+          </w:p>
+        </w:tc>
+        <w:tc>
+          <w:tcPr>
+            <w:tcW w:w="3560" w:type="dxa"/>
+            <w:tcMar>
+              <w:top w:w="60" w:type="dxa"/>
+              <w:left w:w="100" w:type="dxa"/>
+              <w:bottom w:w="60" w:type="dxa"/>
+              <w:right w:w="100" w:type="dxa"/>
+            </w:tcMar>
+            <w:vAlign w:val="center"/>
+          </w:tcPr>
+          <w:p>
+            <w:pPr>
+              <w:jc w:val="right"/>
+            </w:pPr>
+            <w:r>
+              <w:rPr>
+                <w:sz w:val="19"/>
+                <w:szCs w:val="19"/>
+              </w:rPr>
+              <w:t>FreeRTOS. La tarea de red vive en el núcleo 0 y puede bloquearse sin que el muestreo, en el núcleo 1 y con prioridad superior, pierda un solo ciclo.</w:t>
+            </w:r>
+          </w:p>
+        </w:tc>
+      </w:tr>
+      <w:tr>
+        <w:tblPrEx>
+          <w:tblCellMar>
+            <w:top w:w="0" w:type="dxa"/>
+            <w:bottom w:w="0" w:type="dxa"/>
+          </w:tblCellMar>
+        </w:tblPrEx>
+        <w:trPr>
+          <w:cantSplit/>
+        </w:trPr>
+        <w:tc>
+          <w:tcPr>
+            <w:tcW w:w="2400" w:type="dxa"/>
+            <w:shd w:val="clear" w:color="auto" w:fill="F2F2F2"/>
+            <w:tcMar>
+              <w:top w:w="60" w:type="dxa"/>
+              <w:left w:w="100" w:type="dxa"/>
+              <w:bottom w:w="60" w:type="dxa"/>
+              <w:right w:w="100" w:type="dxa"/>
+            </w:tcMar>
+            <w:vAlign w:val="center"/>
+          </w:tcPr>
+          <w:p>
+            <w:r>
+              <w:rPr>
+                <w:sz w:val="19"/>
+                <w:szCs w:val="19"/>
+              </w:rPr>
+              <w:t>De hardware</w:t>
+            </w:r>
+          </w:p>
+        </w:tc>
+        <w:tc>
+          <w:tcPr>
+            <w:tcW w:w="3400" w:type="dxa"/>
+            <w:shd w:val="clear" w:color="auto" w:fill="F2F2F2"/>
+            <w:tcMar>
+              <w:top w:w="60" w:type="dxa"/>
+              <w:left w:w="100" w:type="dxa"/>
+              <w:bottom w:w="60" w:type="dxa"/>
+              <w:right w:w="100" w:type="dxa"/>
+            </w:tcMar>
+            <w:vAlign w:val="center"/>
+          </w:tcPr>
+          <w:p>
+            <w:pPr>
+              <w:jc w:val="right"/>
+            </w:pPr>
+            <w:r>
+              <w:rPr>
+                <w:sz w:val="19"/>
+                <w:szCs w:val="19"/>
+              </w:rPr>
+              <w:t>En un apagón el equipo se queda sin corriente y deja de existir.</w:t>
+            </w:r>
+          </w:p>
+        </w:tc>
+        <w:tc>
+          <w:tcPr>
+            <w:tcW w:w="3560" w:type="dxa"/>
+            <w:shd w:val="clear" w:color="auto" w:fill="F2F2F2"/>
+            <w:tcMar>
+              <w:top w:w="60" w:type="dxa"/>
+              <w:left w:w="100" w:type="dxa"/>
+              <w:bottom w:w="60" w:type="dxa"/>
+              <w:right w:w="100" w:type="dxa"/>
+            </w:tcMar>
+            <w:vAlign w:val="center"/>
+          </w:tcPr>
+          <w:p>
+            <w:pPr>
+              <w:jc w:val="right"/>
+            </w:pPr>
+            <w:r>
+              <w:rPr>
+                <w:sz w:val="19"/>
+                <w:szCs w:val="19"/>
+              </w:rPr>
+              <w:t>Alimentación de respaldo. Ninguna arquitectura de software salva a un microcontrolador apagado.</w:t>
+            </w:r>
+          </w:p>
+        </w:tc>
+      </w:tr>
+    </w:tbl>
+    <w:p>
+      <w:pPr>
+        <w:spacing w:after="120" w:line="276" w:lineRule="auto"/>
+      </w:pPr>
+      <w:r>
+        <w:t>La versión 1 resolvía el primero y ni siquiera se planteaba el segundo. Alimentaba el ESP32 desde los 120 V AC mediante una fuente HLK-PM01, de modo que el equipo se apagaba en el instante exacto del apagón: no podía cronometrar el corte, ni contarlo, ni avisar de él. Un monitor de apagones que se apaga con el apagón es una contradicción.</w:t>
+      </w:r>
+    </w:p>
+    <w:p>
+      <w:pPr>
+        <w:spacing w:after="120" w:line="276" w:lineRule="auto"/>
+      </w:pPr>
+      <w:r>
+        <w:t>La corrección aplicada consiste en alimentar el ESP32 desde el bus de 12 V del banco de baterías del inversor, mediante un convertidor reductor MP1584 o LM2596 a 5 V. La elección tiene tres ventajas sobre añadir una batería independiente: el monitor permanece activo durante todo el apagón, que es cuando sus datos valen algo; no hay una segunda batería que mantener y reemplazar; y de paso el equipo puede medir el voltaje del banco, estimar la autonomía restante y avisar antes de que el inversor se apague sol</w:t>
+      </w:r>
+      <w:r>
+        <w:t>o.</w:t>
+      </w:r>
+    </w:p>
+    <w:p>
+      <w:pPr>
+        <w:spacing w:after="120" w:line="276" w:lineRule="auto"/>
+      </w:pPr>
+      <w:r>
+        <w:t>Para leer los 12 V con el ADC de 3.3 V del ESP32 se añade un divisor de tensión de 100 k y 33 k. Con esa medida el sistema estima el estado de carga y genera dos avisos escalonados: a 11.8 V activa el deslastre, y a 11.4 V emite una alarma de tono agudo porque el inversor está a punto de desconectarse. En una vivienda sin inversor, la alternativa equivalente es una celda 18650 con módulo de carga TP4056 y elevador a 5 V.</w:t>
+      </w:r>
+    </w:p>
+    <w:p>
+      <w:pPr>
+        <w:spacing w:before="60" w:after="200"/>
+      </w:pPr>
+      <w:r>
+        <w:rPr>
+          <w:i/>
+          <w:iCs/>
+          <w:color w:val="666666"/>
+          <w:sz w:val="17"/>
+          <w:szCs w:val="17"/>
+        </w:rPr>
+        <w:t>El presupuesto de la sección 8 incorpora estos componentes adicionales: el segundo juego de sensores de voltaje y corriente, el relevador de deslastre y el convertidor reductor con su divisor de tensión.</w:t>
+      </w:r>
+    </w:p>
+    <w:p>
+      <w:r>
+        <w:br w:type="page"/>
+      </w:r>
+    </w:p>
+    <w:p>
+      <w:pPr>
+        <w:pStyle w:val="Heading1"/>
+        <w:pBdr>
+          <w:bottom w:val="single" w:sz="8" w:space="4" w:color="1F3864"/>
+        </w:pBdr>
+        <w:spacing w:before="360" w:after="180"/>
+      </w:pPr>
+      <w:bookmarkStart w:id="36" w:name="_Toc237016831"/>
+      <w:r>
+        <w:t>7. Evidencias demostrables de programación concurrente</w:t>
+      </w:r>
+      <w:bookmarkEnd w:id="36"/>
+    </w:p>
+    <w:p>
+      <w:pPr>
+        <w:spacing w:after="120" w:line="276" w:lineRule="auto"/>
+      </w:pPr>
+      <w:r>
+        <w:t>Esta sección responde al tercer componente de la asignación. Se desarrollaron seis programas ejecutables, ordenados como una progresión argumental: el primero muestra el problema, los cuatro siguientes construyen la solución capa por capa, y el último la mide en una PC. Todos son reproducibles desde los enlaces del Anexo A.</w:t>
+      </w:r>
+    </w:p>
+    <w:p>
+      <w:pPr>
+        <w:keepNext/>
+        <w:spacing w:before="200" w:after="80"/>
+      </w:pPr>
+      <w:r>
+        <w:rPr>
+          <w:b/>
+          <w:bCs/>
+          <w:color w:val="1F3864"/>
+          <w:sz w:val="19"/>
+          <w:szCs w:val="19"/>
+        </w:rPr>
+        <w:t xml:space="preserve">Tabla 9. </w:t>
       </w:r>
       <w:r>
         <w:rPr>
@@ -12200,11 +13539,11 @@
         <w:pStyle w:val="Heading2"/>
         <w:spacing w:before="260" w:after="120"/>
       </w:pPr>
-      <w:bookmarkStart w:id="31" w:name="_Toc236976785"/>
-      <w:r>
-        <w:t>6.1 Ejemplo 1 — El problema: programación secuencial bloqueante</w:t>
-      </w:r>
-      <w:bookmarkEnd w:id="31"/>
+      <w:bookmarkStart w:id="37" w:name="_Toc237016832"/>
+      <w:r>
+        <w:t>7.1 Ejemplo 1 — El problema: programación secuencial bloqueante</w:t>
+      </w:r>
+      <w:bookmarkEnd w:id="37"/>
     </w:p>
     <w:p>
       <w:pPr>
@@ -12227,11 +13566,11 @@
         <w:pStyle w:val="Heading2"/>
         <w:spacing w:before="260" w:after="120"/>
       </w:pPr>
-      <w:bookmarkStart w:id="32" w:name="_Toc236976786"/>
-      <w:r>
-        <w:t>6.2 Ejemplo 2 — Multitarea cooperativa con millis()</w:t>
-      </w:r>
-      <w:bookmarkEnd w:id="32"/>
+      <w:bookmarkStart w:id="38" w:name="_Toc237016833"/>
+      <w:r>
+        <w:t>7.2 Ejemplo 2 — Multitarea cooperativa con millis()</w:t>
+      </w:r>
+      <w:bookmarkEnd w:id="38"/>
     </w:p>
     <w:p>
       <w:pPr>
@@ -12262,11 +13601,11 @@
         <w:pStyle w:val="Heading2"/>
         <w:spacing w:before="260" w:after="120"/>
       </w:pPr>
-      <w:bookmarkStart w:id="33" w:name="_Toc236976787"/>
-      <w:r>
-        <w:t>6.3 Ejemplo 3 — Hilos reales, expulsión y dos núcleos</w:t>
-      </w:r>
-      <w:bookmarkEnd w:id="33"/>
+      <w:bookmarkStart w:id="39" w:name="_Toc237016834"/>
+      <w:r>
+        <w:t>7.3 Ejemplo 3 — Hilos reales, expulsión y dos núcleos</w:t>
+      </w:r>
+      <w:bookmarkEnd w:id="39"/>
     </w:p>
     <w:p>
       <w:pPr>
@@ -12292,11 +13631,11 @@
         <w:pStyle w:val="Heading2"/>
         <w:spacing w:before="260" w:after="120"/>
       </w:pPr>
-      <w:bookmarkStart w:id="34" w:name="_Toc236976788"/>
-      <w:r>
-        <w:t>6.4 Ejemplo 4 — La condición de carrera y su cura</w:t>
-      </w:r>
-      <w:bookmarkEnd w:id="34"/>
+      <w:bookmarkStart w:id="40" w:name="_Toc237016835"/>
+      <w:r>
+        <w:t>7.4 Ejemplo 4 — La condición de carrera y su cura</w:t>
+      </w:r>
+      <w:bookmarkEnd w:id="40"/>
     </w:p>
     <w:p>
       <w:pPr>
@@ -12327,11 +13666,11 @@
         <w:pStyle w:val="Heading2"/>
         <w:spacing w:before="260" w:after="120"/>
       </w:pPr>
-      <w:bookmarkStart w:id="35" w:name="_Toc236976789"/>
-      <w:r>
-        <w:t>6.5 Ejemplo 5 — Programación distribuida con MQTT</w:t>
-      </w:r>
-      <w:bookmarkEnd w:id="35"/>
+      <w:bookmarkStart w:id="41" w:name="_Toc237016836"/>
+      <w:r>
+        <w:t>7.5 Ejemplo 5 — Programación distribuida con MQTT</w:t>
+      </w:r>
+      <w:bookmarkEnd w:id="41"/>
     </w:p>
     <w:p>
       <w:pPr>
@@ -12362,11 +13701,11 @@
         <w:pStyle w:val="Heading2"/>
         <w:spacing w:before="260" w:after="120"/>
       </w:pPr>
-      <w:bookmarkStart w:id="36" w:name="_Toc236976790"/>
-      <w:r>
-        <w:t>6.6 Ejemplo 6 — Concurrencia y paralelismo, medidos con cronómetro</w:t>
-      </w:r>
-      <w:bookmarkEnd w:id="36"/>
+      <w:bookmarkStart w:id="42" w:name="_Toc237016837"/>
+      <w:r>
+        <w:t>7.6 Ejemplo 6 — Concurrencia y paralelismo, medidos con cronómetro</w:t>
+      </w:r>
+      <w:bookmarkEnd w:id="42"/>
     </w:p>
     <w:p>
       <w:pPr>
@@ -12389,7 +13728,7 @@
           <w:sz w:val="19"/>
           <w:szCs w:val="19"/>
         </w:rPr>
-        <w:t xml:space="preserve">Tabla 8. </w:t>
+        <w:t xml:space="preserve">Tabla 10. </w:t>
       </w:r>
       <w:r>
         <w:rPr>
@@ -13115,11 +14454,11 @@
         </w:pBdr>
         <w:spacing w:before="360" w:after="180"/>
       </w:pPr>
-      <w:bookmarkStart w:id="37" w:name="_Toc236976791"/>
-      <w:r>
-        <w:t>7. Presupuesto y cotización</w:t>
-      </w:r>
-      <w:bookmarkEnd w:id="37"/>
+      <w:bookmarkStart w:id="43" w:name="_Toc237016838"/>
+      <w:r>
+        <w:t>8. Presupuesto y cotización</w:t>
+      </w:r>
+      <w:bookmarkEnd w:id="43"/>
     </w:p>
     <w:p>
       <w:pPr>
@@ -13149,11 +14488,11 @@
         <w:pStyle w:val="Heading2"/>
         <w:spacing w:before="260" w:after="120"/>
       </w:pPr>
-      <w:bookmarkStart w:id="38" w:name="_Toc236976792"/>
-      <w:r>
-        <w:t>7.1 Escenario A — Prototipo académico simulado</w:t>
-      </w:r>
-      <w:bookmarkEnd w:id="38"/>
+      <w:bookmarkStart w:id="44" w:name="_Toc237016839"/>
+      <w:r>
+        <w:t>8.1 Escenario A — Prototipo académico simulado</w:t>
+      </w:r>
+      <w:bookmarkEnd w:id="44"/>
     </w:p>
     <w:p>
       <w:pPr>
@@ -13176,7 +14515,7 @@
           <w:sz w:val="19"/>
           <w:szCs w:val="19"/>
         </w:rPr>
-        <w:t xml:space="preserve">Tabla 9. </w:t>
+        <w:t xml:space="preserve">Tabla 11. </w:t>
       </w:r>
       <w:r>
         <w:rPr>
@@ -14080,22 +15419,22 @@
         <w:pStyle w:val="Heading2"/>
         <w:spacing w:before="260" w:after="120"/>
       </w:pPr>
-      <w:bookmarkStart w:id="39" w:name="_Toc236976793"/>
-      <w:r>
-        <w:t>7.2 Escenario B — Implementación física en una vivienda</w:t>
-      </w:r>
-      <w:bookmarkEnd w:id="39"/>
+      <w:bookmarkStart w:id="45" w:name="_Toc237016840"/>
+      <w:r>
+        <w:t>8.2 Escenario B — Implementación física en una vivienda</w:t>
+      </w:r>
+      <w:bookmarkEnd w:id="45"/>
     </w:p>
     <w:p>
       <w:pPr>
         <w:pStyle w:val="Heading3"/>
         <w:spacing w:before="200" w:after="100"/>
       </w:pPr>
-      <w:bookmarkStart w:id="40" w:name="_Toc236976794"/>
-      <w:r>
-        <w:t>7.2.1 Materiales y componentes</w:t>
-      </w:r>
-      <w:bookmarkEnd w:id="40"/>
+      <w:bookmarkStart w:id="46" w:name="_Toc237016841"/>
+      <w:r>
+        <w:t>8.2.1 Materiales y componentes</w:t>
+      </w:r>
+      <w:bookmarkEnd w:id="46"/>
     </w:p>
     <w:p>
       <w:pPr>
@@ -14110,7 +15449,7 @@
           <w:sz w:val="19"/>
           <w:szCs w:val="19"/>
         </w:rPr>
-        <w:t xml:space="preserve">Tabla 10. </w:t>
+        <w:t xml:space="preserve">Tabla 12. </w:t>
       </w:r>
       <w:r>
         <w:rPr>
@@ -14450,7 +15789,7 @@
                 <w:sz w:val="19"/>
                 <w:szCs w:val="19"/>
               </w:rPr>
-              <w:t>Sensor de voltaje AC ZMPT101B</w:t>
+              <w:t>Sensor de voltaje AC ZMPT101B (una por línea)</w:t>
             </w:r>
           </w:p>
         </w:tc>
@@ -14475,7 +15814,7 @@
                 <w:sz w:val="19"/>
                 <w:szCs w:val="19"/>
               </w:rPr>
-              <w:t>1</w:t>
+              <w:t>2</w:t>
             </w:r>
           </w:p>
         </w:tc>
@@ -14525,7 +15864,7 @@
                 <w:sz w:val="19"/>
                 <w:szCs w:val="19"/>
               </w:rPr>
-              <w:t>6.00</w:t>
+              <w:t>12.00</w:t>
             </w:r>
           </w:p>
         </w:tc>
@@ -14550,7 +15889,7 @@
                 <w:sz w:val="19"/>
                 <w:szCs w:val="19"/>
               </w:rPr>
-              <w:t>350.65</w:t>
+              <w:t>701.31</w:t>
             </w:r>
           </w:p>
         </w:tc>
@@ -15890,7 +17229,7 @@
                 <w:sz w:val="19"/>
                 <w:szCs w:val="19"/>
               </w:rPr>
-              <w:t>SUBTOTAL MATERIALES</w:t>
+              <w:t>Relé de deslastre de carga 30 A</w:t>
             </w:r>
           </w:p>
         </w:tc>
@@ -15910,6 +17249,15 @@
             <w:pPr>
               <w:jc w:val="right"/>
             </w:pPr>
+            <w:r>
+              <w:rPr>
+                <w:b/>
+                <w:bCs/>
+                <w:sz w:val="19"/>
+                <w:szCs w:val="19"/>
+              </w:rPr>
+              <w:t>1</w:t>
+            </w:r>
           </w:p>
         </w:tc>
         <w:tc>
@@ -15928,6 +17276,15 @@
             <w:pPr>
               <w:jc w:val="right"/>
             </w:pPr>
+            <w:r>
+              <w:rPr>
+                <w:b/>
+                <w:bCs/>
+                <w:sz w:val="19"/>
+                <w:szCs w:val="19"/>
+              </w:rPr>
+              <w:t>12.00</w:t>
+            </w:r>
           </w:p>
         </w:tc>
         <w:tc>
@@ -15953,7 +17310,7 @@
                 <w:sz w:val="19"/>
                 <w:szCs w:val="19"/>
               </w:rPr>
-              <w:t>135.50</w:t>
+              <w:t>12.00</w:t>
             </w:r>
           </w:p>
         </w:tc>
@@ -15980,7 +17337,254 @@
                 <w:sz w:val="19"/>
                 <w:szCs w:val="19"/>
               </w:rPr>
-              <w:t>7,918.94</w:t>
+              <w:t>701.31</w:t>
+            </w:r>
+          </w:p>
+        </w:tc>
+      </w:tr>
+      <w:tr>
+        <w:tblPrEx>
+          <w:tblCellMar>
+            <w:top w:w="0" w:type="dxa"/>
+            <w:bottom w:w="0" w:type="dxa"/>
+          </w:tblCellMar>
+        </w:tblPrEx>
+        <w:trPr>
+          <w:cantSplit/>
+        </w:trPr>
+        <w:tc>
+          <w:tcPr>
+            <w:tcW w:w="3400" w:type="dxa"/>
+            <w:shd w:val="clear" w:color="auto" w:fill="F2F2F2"/>
+            <w:tcMar>
+              <w:top w:w="60" w:type="dxa"/>
+              <w:left w:w="100" w:type="dxa"/>
+              <w:bottom w:w="60" w:type="dxa"/>
+              <w:right w:w="100" w:type="dxa"/>
+            </w:tcMar>
+            <w:vAlign w:val="center"/>
+          </w:tcPr>
+          <w:p>
+            <w:r>
+              <w:rPr>
+                <w:sz w:val="19"/>
+                <w:szCs w:val="19"/>
+              </w:rPr>
+              <w:t>Convertidor reductor MP1584 + divisor de tensión</w:t>
+            </w:r>
+          </w:p>
+        </w:tc>
+        <w:tc>
+          <w:tcPr>
+            <w:tcW w:w="900" w:type="dxa"/>
+            <w:shd w:val="clear" w:color="auto" w:fill="F2F2F2"/>
+            <w:tcMar>
+              <w:top w:w="60" w:type="dxa"/>
+              <w:left w:w="100" w:type="dxa"/>
+              <w:bottom w:w="60" w:type="dxa"/>
+              <w:right w:w="100" w:type="dxa"/>
+            </w:tcMar>
+            <w:vAlign w:val="center"/>
+          </w:tcPr>
+          <w:p>
+            <w:pPr>
+              <w:jc w:val="right"/>
+            </w:pPr>
+            <w:r>
+              <w:rPr>
+                <w:sz w:val="19"/>
+                <w:szCs w:val="19"/>
+              </w:rPr>
+              <w:t>1</w:t>
+            </w:r>
+          </w:p>
+        </w:tc>
+        <w:tc>
+          <w:tcPr>
+            <w:tcW w:w="1300" w:type="dxa"/>
+            <w:shd w:val="clear" w:color="auto" w:fill="F2F2F2"/>
+            <w:tcMar>
+              <w:top w:w="60" w:type="dxa"/>
+              <w:left w:w="100" w:type="dxa"/>
+              <w:bottom w:w="60" w:type="dxa"/>
+              <w:right w:w="100" w:type="dxa"/>
+            </w:tcMar>
+            <w:vAlign w:val="center"/>
+          </w:tcPr>
+          <w:p>
+            <w:pPr>
+              <w:jc w:val="right"/>
+            </w:pPr>
+            <w:r>
+              <w:rPr>
+                <w:sz w:val="19"/>
+                <w:szCs w:val="19"/>
+              </w:rPr>
+              <w:t>5.00</w:t>
+            </w:r>
+          </w:p>
+        </w:tc>
+        <w:tc>
+          <w:tcPr>
+            <w:tcW w:w="1800" w:type="dxa"/>
+            <w:shd w:val="clear" w:color="auto" w:fill="F2F2F2"/>
+            <w:tcMar>
+              <w:top w:w="60" w:type="dxa"/>
+              <w:left w:w="100" w:type="dxa"/>
+              <w:bottom w:w="60" w:type="dxa"/>
+              <w:right w:w="100" w:type="dxa"/>
+            </w:tcMar>
+            <w:vAlign w:val="center"/>
+          </w:tcPr>
+          <w:p>
+            <w:pPr>
+              <w:jc w:val="right"/>
+            </w:pPr>
+            <w:r>
+              <w:rPr>
+                <w:sz w:val="19"/>
+                <w:szCs w:val="19"/>
+              </w:rPr>
+              <w:t>5.00</w:t>
+            </w:r>
+          </w:p>
+        </w:tc>
+        <w:tc>
+          <w:tcPr>
+            <w:tcW w:w="1960" w:type="dxa"/>
+            <w:shd w:val="clear" w:color="auto" w:fill="F2F2F2"/>
+            <w:tcMar>
+              <w:top w:w="60" w:type="dxa"/>
+              <w:left w:w="100" w:type="dxa"/>
+              <w:bottom w:w="60" w:type="dxa"/>
+              <w:right w:w="100" w:type="dxa"/>
+            </w:tcMar>
+            <w:vAlign w:val="center"/>
+          </w:tcPr>
+          <w:p>
+            <w:pPr>
+              <w:jc w:val="right"/>
+            </w:pPr>
+            <w:r>
+              <w:rPr>
+                <w:sz w:val="19"/>
+                <w:szCs w:val="19"/>
+              </w:rPr>
+              <w:t>292.21</w:t>
+            </w:r>
+          </w:p>
+        </w:tc>
+      </w:tr>
+      <w:tr>
+        <w:tblPrEx>
+          <w:tblCellMar>
+            <w:top w:w="0" w:type="dxa"/>
+            <w:bottom w:w="0" w:type="dxa"/>
+          </w:tblCellMar>
+        </w:tblPrEx>
+        <w:trPr>
+          <w:cantSplit/>
+        </w:trPr>
+        <w:tc>
+          <w:tcPr>
+            <w:tcW w:w="3400" w:type="dxa"/>
+            <w:tcMar>
+              <w:top w:w="60" w:type="dxa"/>
+              <w:left w:w="100" w:type="dxa"/>
+              <w:bottom w:w="60" w:type="dxa"/>
+              <w:right w:w="100" w:type="dxa"/>
+            </w:tcMar>
+            <w:vAlign w:val="center"/>
+          </w:tcPr>
+          <w:p>
+            <w:r>
+              <w:rPr>
+                <w:sz w:val="19"/>
+                <w:szCs w:val="19"/>
+              </w:rPr>
+              <w:t>SUBTOTAL MATERIALES</w:t>
+            </w:r>
+          </w:p>
+        </w:tc>
+        <w:tc>
+          <w:tcPr>
+            <w:tcW w:w="900" w:type="dxa"/>
+            <w:tcMar>
+              <w:top w:w="60" w:type="dxa"/>
+              <w:left w:w="100" w:type="dxa"/>
+              <w:bottom w:w="60" w:type="dxa"/>
+              <w:right w:w="100" w:type="dxa"/>
+            </w:tcMar>
+            <w:vAlign w:val="center"/>
+          </w:tcPr>
+          <w:p>
+            <w:pPr>
+              <w:jc w:val="right"/>
+            </w:pPr>
+          </w:p>
+        </w:tc>
+        <w:tc>
+          <w:tcPr>
+            <w:tcW w:w="1300" w:type="dxa"/>
+            <w:tcMar>
+              <w:top w:w="60" w:type="dxa"/>
+              <w:left w:w="100" w:type="dxa"/>
+              <w:bottom w:w="60" w:type="dxa"/>
+              <w:right w:w="100" w:type="dxa"/>
+            </w:tcMar>
+            <w:vAlign w:val="center"/>
+          </w:tcPr>
+          <w:p>
+            <w:pPr>
+              <w:jc w:val="right"/>
+            </w:pPr>
+          </w:p>
+        </w:tc>
+        <w:tc>
+          <w:tcPr>
+            <w:tcW w:w="1800" w:type="dxa"/>
+            <w:tcMar>
+              <w:top w:w="60" w:type="dxa"/>
+              <w:left w:w="100" w:type="dxa"/>
+              <w:bottom w:w="60" w:type="dxa"/>
+              <w:right w:w="100" w:type="dxa"/>
+            </w:tcMar>
+            <w:vAlign w:val="center"/>
+          </w:tcPr>
+          <w:p>
+            <w:pPr>
+              <w:jc w:val="right"/>
+            </w:pPr>
+            <w:r>
+              <w:rPr>
+                <w:sz w:val="19"/>
+                <w:szCs w:val="19"/>
+              </w:rPr>
+              <w:t>158.50</w:t>
+            </w:r>
+          </w:p>
+        </w:tc>
+        <w:tc>
+          <w:tcPr>
+            <w:tcW w:w="1960" w:type="dxa"/>
+            <w:tcMar>
+              <w:top w:w="60" w:type="dxa"/>
+              <w:left w:w="100" w:type="dxa"/>
+              <w:bottom w:w="60" w:type="dxa"/>
+              <w:right w:w="100" w:type="dxa"/>
+            </w:tcMar>
+            <w:vAlign w:val="center"/>
+          </w:tcPr>
+          <w:p>
+            <w:pPr>
+              <w:jc w:val="right"/>
+            </w:pPr>
+            <w:r>
+              <w:rPr>
+                <w:sz w:val="19"/>
+                <w:szCs w:val="19"/>
+              </w:rPr>
+              <w:t>9,263.12</w:t>
             </w:r>
           </w:p>
         </w:tc>
@@ -15991,11 +17595,11 @@
         <w:pStyle w:val="Heading3"/>
         <w:spacing w:before="200" w:after="100"/>
       </w:pPr>
-      <w:bookmarkStart w:id="41" w:name="_Toc236976795"/>
-      <w:r>
-        <w:t>7.2.2 Logística, impuestos y servicios</w:t>
-      </w:r>
-      <w:bookmarkEnd w:id="41"/>
+      <w:bookmarkStart w:id="47" w:name="_Toc237016842"/>
+      <w:r>
+        <w:t>8.2.2 Logística, impuestos y servicios</w:t>
+      </w:r>
+      <w:bookmarkEnd w:id="47"/>
     </w:p>
     <w:p>
       <w:pPr>
@@ -16010,7 +17614,7 @@
           <w:sz w:val="19"/>
           <w:szCs w:val="19"/>
         </w:rPr>
-        <w:t xml:space="preserve">Tabla 11. </w:t>
+        <w:t xml:space="preserve">Tabla 13. </w:t>
       </w:r>
       <w:r>
         <w:rPr>
@@ -16240,7 +17844,7 @@
                 <w:sz w:val="19"/>
                 <w:szCs w:val="19"/>
               </w:rPr>
-              <w:t>135.50</w:t>
+              <w:t>158.50</w:t>
             </w:r>
           </w:p>
         </w:tc>
@@ -16264,7 +17868,7 @@
                 <w:sz w:val="19"/>
                 <w:szCs w:val="19"/>
               </w:rPr>
-              <w:t>7,918.94</w:t>
+              <w:t>9,263.12</w:t>
             </w:r>
           </w:p>
         </w:tc>
@@ -16347,7 +17951,7 @@
                 <w:sz w:val="19"/>
                 <w:szCs w:val="19"/>
               </w:rPr>
-              <w:t>27.10</w:t>
+              <w:t>31.70</w:t>
             </w:r>
           </w:p>
         </w:tc>
@@ -16372,7 +17976,7 @@
                 <w:sz w:val="19"/>
                 <w:szCs w:val="19"/>
               </w:rPr>
-              <w:t>1,583.79</w:t>
+              <w:t>1,852.62</w:t>
             </w:r>
           </w:p>
         </w:tc>
@@ -16452,7 +18056,7 @@
                 <w:sz w:val="19"/>
                 <w:szCs w:val="19"/>
               </w:rPr>
-              <w:t>162.60</w:t>
+              <w:t>190.20</w:t>
             </w:r>
           </w:p>
         </w:tc>
@@ -16476,7 +18080,7 @@
                 <w:sz w:val="19"/>
                 <w:szCs w:val="19"/>
               </w:rPr>
-              <w:t>9,502.73</w:t>
+              <w:t>11,115.74</w:t>
             </w:r>
           </w:p>
         </w:tc>
@@ -16559,7 +18163,7 @@
                 <w:sz w:val="19"/>
                 <w:szCs w:val="19"/>
               </w:rPr>
-              <w:t>29.27</w:t>
+              <w:t>34.24</w:t>
             </w:r>
           </w:p>
         </w:tc>
@@ -16584,7 +18188,7 @@
                 <w:sz w:val="19"/>
                 <w:szCs w:val="19"/>
               </w:rPr>
-              <w:t>1,710.61</w:t>
+              <w:t>2,001.07</w:t>
             </w:r>
           </w:p>
         </w:tc>
@@ -16664,7 +18268,7 @@
                 <w:sz w:val="19"/>
                 <w:szCs w:val="19"/>
               </w:rPr>
-              <w:t>191.87</w:t>
+              <w:t>224.44</w:t>
             </w:r>
           </w:p>
         </w:tc>
@@ -16691,7 +18295,7 @@
                 <w:sz w:val="19"/>
                 <w:szCs w:val="19"/>
               </w:rPr>
-              <w:t>11,213.34</w:t>
+              <w:t>13,116.81</w:t>
             </w:r>
           </w:p>
         </w:tc>
@@ -16983,7 +18587,7 @@
                 <w:sz w:val="19"/>
                 <w:szCs w:val="19"/>
               </w:rPr>
-              <w:t>326.87</w:t>
+              <w:t>359.44</w:t>
             </w:r>
           </w:p>
         </w:tc>
@@ -17010,7 +18614,7 @@
                 <w:sz w:val="19"/>
                 <w:szCs w:val="19"/>
               </w:rPr>
-              <w:t>19,103.06</w:t>
+              <w:t>21,006.53</w:t>
             </w:r>
           </w:p>
         </w:tc>
@@ -17194,7 +18798,7 @@
                 <w:sz w:val="19"/>
                 <w:szCs w:val="19"/>
               </w:rPr>
-              <w:t>782.87</w:t>
+              <w:t>815.44</w:t>
             </w:r>
           </w:p>
         </w:tc>
@@ -17221,7 +18825,7 @@
                 <w:sz w:val="19"/>
                 <w:szCs w:val="19"/>
               </w:rPr>
-              <w:t>45,752.79</w:t>
+              <w:t>47,656.26</w:t>
             </w:r>
           </w:p>
         </w:tc>
@@ -17247,11 +18851,11 @@
         <w:pStyle w:val="Heading3"/>
         <w:spacing w:before="200" w:after="100"/>
       </w:pPr>
-      <w:bookmarkStart w:id="42" w:name="_Toc236976796"/>
-      <w:r>
-        <w:t>7.2.3 Costos recurrentes</w:t>
-      </w:r>
-      <w:bookmarkEnd w:id="42"/>
+      <w:bookmarkStart w:id="48" w:name="_Toc237016843"/>
+      <w:r>
+        <w:t>8.2.3 Costos recurrentes</w:t>
+      </w:r>
+      <w:bookmarkEnd w:id="48"/>
     </w:p>
     <w:p>
       <w:pPr>
@@ -17266,7 +18870,7 @@
           <w:sz w:val="19"/>
           <w:szCs w:val="19"/>
         </w:rPr>
-        <w:t xml:space="preserve">Tabla 12. </w:t>
+        <w:t xml:space="preserve">Tabla 14. </w:t>
       </w:r>
       <w:r>
         <w:rPr>
@@ -17958,11 +19562,11 @@
         <w:pStyle w:val="Heading2"/>
         <w:spacing w:before="260" w:after="120"/>
       </w:pPr>
-      <w:bookmarkStart w:id="43" w:name="_Toc236976797"/>
-      <w:r>
-        <w:t>7.3 Análisis de retorno de la inversión</w:t>
-      </w:r>
-      <w:bookmarkEnd w:id="43"/>
+      <w:bookmarkStart w:id="49" w:name="_Toc237016844"/>
+      <w:r>
+        <w:t>8.3 Análisis de retorno de la inversión</w:t>
+      </w:r>
+      <w:bookmarkEnd w:id="49"/>
     </w:p>
     <w:p>
       <w:pPr>
@@ -17985,7 +19589,7 @@
           <w:sz w:val="19"/>
           <w:szCs w:val="19"/>
         </w:rPr>
-        <w:t xml:space="preserve">Tabla 13. </w:t>
+        <w:t xml:space="preserve">Tabla 15. </w:t>
       </w:r>
       <w:r>
         <w:rPr>
@@ -18485,7 +20089,7 @@
                 <w:sz w:val="19"/>
                 <w:szCs w:val="19"/>
               </w:rPr>
-              <w:t>19,103.06</w:t>
+              <w:t>21,006.53</w:t>
             </w:r>
           </w:p>
         </w:tc>
@@ -18564,7 +20168,7 @@
                 <w:sz w:val="19"/>
                 <w:szCs w:val="19"/>
               </w:rPr>
-              <w:t>13.2 meses</w:t>
+              <w:t>14.5 meses</w:t>
             </w:r>
           </w:p>
         </w:tc>
@@ -18616,11 +20220,11 @@
         </w:pBdr>
         <w:spacing w:before="360" w:after="180"/>
       </w:pPr>
-      <w:bookmarkStart w:id="44" w:name="_Toc236976798"/>
-      <w:r>
-        <w:t>8. Cronograma de implementación</w:t>
-      </w:r>
-      <w:bookmarkEnd w:id="44"/>
+      <w:bookmarkStart w:id="50" w:name="_Toc237016845"/>
+      <w:r>
+        <w:t>9. Cronograma de implementación</w:t>
+      </w:r>
+      <w:bookmarkEnd w:id="50"/>
     </w:p>
     <w:p>
       <w:pPr>
@@ -18643,7 +20247,7 @@
           <w:sz w:val="19"/>
           <w:szCs w:val="19"/>
         </w:rPr>
-        <w:t xml:space="preserve">Tabla 14. </w:t>
+        <w:t xml:space="preserve">Tabla 16. </w:t>
       </w:r>
       <w:r>
         <w:rPr>
@@ -19655,11 +21259,11 @@
         </w:pBdr>
         <w:spacing w:before="360" w:after="180"/>
       </w:pPr>
-      <w:bookmarkStart w:id="45" w:name="_Toc236976799"/>
-      <w:r>
-        <w:t>9. Conclusión</w:t>
-      </w:r>
-      <w:bookmarkEnd w:id="45"/>
+      <w:bookmarkStart w:id="51" w:name="_Toc237016846"/>
+      <w:r>
+        <w:t>10. Conclusión</w:t>
+      </w:r>
+      <w:bookmarkEnd w:id="51"/>
     </w:p>
     <w:p>
       <w:pPr>
@@ -19709,7 +21313,7 @@
         <w:spacing w:after="120" w:line="276" w:lineRule="auto"/>
       </w:pPr>
       <w:r>
-        <w:t>Desde el punto de vista de viabilidad, el análisis económico sitúa la implementación física en aproximadamente RD$19,103 instalada, con un período de recuperación estimado en trece meses fundamentado principalmente en el daño evitado a los electrodomésticos. Es una inversión razonable para el contexto dominicano, y su costo marginal disminuye al replicarse porque la ingeniería de software se amortiza entre todas las unidades.</w:t>
+        <w:t>Desde el punto de vista de viabilidad, el análisis económico sitúa la implementación física en aproximadamente RD$21,007 instalada, con un período de recuperación estimado en catorce meses y medio fundamentado principalmente en el daño evitado a los electrodomésticos. Es una inversión razonable para el contexto dominicano, y su costo marginal disminuye al replicarse porque la ingeniería de software se amortiza entre todas las unidades.</w:t>
       </w:r>
     </w:p>
     <w:p>
@@ -19728,11 +21332,11 @@
         <w:pStyle w:val="Heading2"/>
         <w:spacing w:before="260" w:after="120"/>
       </w:pPr>
-      <w:bookmarkStart w:id="46" w:name="_Toc236976800"/>
-      <w:r>
-        <w:t>9.1 Recomendaciones</w:t>
-      </w:r>
-      <w:bookmarkEnd w:id="46"/>
+      <w:bookmarkStart w:id="52" w:name="_Toc237016847"/>
+      <w:r>
+        <w:t>10.1 Recomendaciones</w:t>
+      </w:r>
+      <w:bookmarkEnd w:id="52"/>
     </w:p>
     <w:p>
       <w:pPr>
@@ -19812,22 +21416,22 @@
         </w:pBdr>
         <w:spacing w:before="360" w:after="180"/>
       </w:pPr>
-      <w:bookmarkStart w:id="47" w:name="_Toc236976801"/>
-      <w:r>
-        <w:t>10. Fuentes de investigación y bibliografía</w:t>
-      </w:r>
-      <w:bookmarkEnd w:id="47"/>
+      <w:bookmarkStart w:id="53" w:name="_Toc237016848"/>
+      <w:r>
+        <w:t>11. Fuentes de investigación y bibliografía</w:t>
+      </w:r>
+      <w:bookmarkEnd w:id="53"/>
     </w:p>
     <w:p>
       <w:pPr>
         <w:pStyle w:val="Heading2"/>
         <w:spacing w:before="260" w:after="120"/>
       </w:pPr>
-      <w:bookmarkStart w:id="48" w:name="_Toc236976802"/>
-      <w:r>
-        <w:t>10.1 Libros y artículos académicos</w:t>
-      </w:r>
-      <w:bookmarkEnd w:id="48"/>
+      <w:bookmarkStart w:id="54" w:name="_Toc237016849"/>
+      <w:r>
+        <w:t>11.1 Libros y artículos académicos</w:t>
+      </w:r>
+      <w:bookmarkEnd w:id="54"/>
     </w:p>
     <w:p>
       <w:pPr>
@@ -19899,11 +21503,11 @@
         <w:pStyle w:val="Heading2"/>
         <w:spacing w:before="260" w:after="120"/>
       </w:pPr>
-      <w:bookmarkStart w:id="49" w:name="_Toc236976803"/>
-      <w:r>
-        <w:t>10.2 Documentación técnica y normas</w:t>
-      </w:r>
-      <w:bookmarkEnd w:id="49"/>
+      <w:bookmarkStart w:id="55" w:name="_Toc237016850"/>
+      <w:r>
+        <w:t>11.2 Documentación técnica y normas</w:t>
+      </w:r>
+      <w:bookmarkEnd w:id="55"/>
     </w:p>
     <w:p>
       <w:pPr>
@@ -19917,7 +21521,7 @@
         </w:rPr>
         <w:t xml:space="preserve">Arduino. (2026). Arduino Cloud Documentation. </w:t>
       </w:r>
-      <w:hyperlink r:id="rId7" w:history="1">
+      <w:hyperlink r:id="rId8" w:history="1">
         <w:r>
           <w:rPr>
             <w:color w:val="1155CC"/>
@@ -19941,7 +21545,7 @@
         </w:rPr>
         <w:t xml:space="preserve">Espressif Systems. (2026). ESP-IDF Programming Guide: FreeRTOS (IDF) API Reference. </w:t>
       </w:r>
-      <w:hyperlink r:id="rId8" w:history="1">
+      <w:hyperlink r:id="rId9" w:history="1">
         <w:r>
           <w:rPr>
             <w:color w:val="1155CC"/>
@@ -19965,7 +21569,7 @@
         </w:rPr>
         <w:t xml:space="preserve">Espressif Systems. (2026). ESP32 Series Datasheet y Technical Reference Manual. </w:t>
       </w:r>
-      <w:hyperlink r:id="rId9" w:history="1">
+      <w:hyperlink r:id="rId10" w:history="1">
         <w:r>
           <w:rPr>
             <w:color w:val="1155CC"/>
@@ -19989,7 +21593,7 @@
         </w:rPr>
         <w:t xml:space="preserve">OASIS. (2019). MQTT Version 5.0 — OASIS Standard. </w:t>
       </w:r>
-      <w:hyperlink r:id="rId10" w:history="1">
+      <w:hyperlink r:id="rId11" w:history="1">
         <w:r>
           <w:rPr>
             <w:color w:val="1155CC"/>
@@ -20013,7 +21617,7 @@
         </w:rPr>
         <w:t xml:space="preserve">Python Software Foundation. (2026). Documentación de las bibliotecas threading, multiprocessing y asyncio, Python 3.11. </w:t>
       </w:r>
-      <w:hyperlink r:id="rId11" w:history="1">
+      <w:hyperlink r:id="rId12" w:history="1">
         <w:r>
           <w:rPr>
             <w:color w:val="1155CC"/>
@@ -20037,7 +21641,7 @@
         </w:rPr>
         <w:t xml:space="preserve">Wokwi. (2026). Wokwi Documentation: ESP32 Simulator. </w:t>
       </w:r>
-      <w:hyperlink r:id="rId12" w:history="1">
+      <w:hyperlink r:id="rId13" w:history="1">
         <w:r>
           <w:rPr>
             <w:color w:val="1155CC"/>
@@ -20054,11 +21658,11 @@
         <w:pStyle w:val="Heading2"/>
         <w:spacing w:before="260" w:after="120"/>
       </w:pPr>
-      <w:bookmarkStart w:id="50" w:name="_Toc236976804"/>
-      <w:r>
-        <w:t>10.3 Conferencias y recursos en línea</w:t>
-      </w:r>
-      <w:bookmarkEnd w:id="50"/>
+      <w:bookmarkStart w:id="56" w:name="_Toc237016851"/>
+      <w:r>
+        <w:t>11.3 Conferencias y recursos en línea</w:t>
+      </w:r>
+      <w:bookmarkEnd w:id="56"/>
     </w:p>
     <w:p>
       <w:pPr>
@@ -20072,7 +21676,7 @@
         </w:rPr>
         <w:t xml:space="preserve">Pike, R. (2012). Concurrency is not Parallelism. Heroku Waza Conference. </w:t>
       </w:r>
-      <w:hyperlink r:id="rId13" w:history="1">
+      <w:hyperlink r:id="rId14" w:history="1">
         <w:r>
           <w:rPr>
             <w:color w:val="1155CC"/>
@@ -20096,7 +21700,7 @@
         </w:rPr>
         <w:t xml:space="preserve">Red Hat. (2023). IoT: ¿qué es el Internet de las cosas y cómo funciona? </w:t>
       </w:r>
-      <w:hyperlink r:id="rId14" w:history="1">
+      <w:hyperlink r:id="rId15" w:history="1">
         <w:r>
           <w:rPr>
             <w:color w:val="1155CC"/>
@@ -20126,11 +21730,11 @@
         <w:pStyle w:val="Heading2"/>
         <w:spacing w:before="260" w:after="120"/>
       </w:pPr>
-      <w:bookmarkStart w:id="51" w:name="_Toc236976805"/>
-      <w:r>
-        <w:t>10.4 Fuentes de datos económicos</w:t>
-      </w:r>
-      <w:bookmarkEnd w:id="51"/>
+      <w:bookmarkStart w:id="57" w:name="_Toc237016852"/>
+      <w:r>
+        <w:t>11.4 Fuentes de datos económicos</w:t>
+      </w:r>
+      <w:bookmarkEnd w:id="57"/>
     </w:p>
     <w:p>
       <w:pPr>
@@ -20144,7 +21748,7 @@
         </w:rPr>
         <w:t xml:space="preserve">Banco Central de la República Dominicana. (2026). Tasa de cambio del dólar estadounidense, 5 de agosto de 2026: RD$58.0760 (compra) / RD$58.4424 (venta). </w:t>
       </w:r>
-      <w:hyperlink r:id="rId15" w:history="1">
+      <w:hyperlink r:id="rId16" w:history="1">
         <w:r>
           <w:rPr>
             <w:color w:val="1155CC"/>
@@ -20169,11 +21773,11 @@
         </w:pBdr>
         <w:spacing w:before="360" w:after="180"/>
       </w:pPr>
-      <w:bookmarkStart w:id="52" w:name="_Toc236976806"/>
+      <w:bookmarkStart w:id="58" w:name="_Toc237016853"/>
       <w:r>
         <w:t>Anexo A. Enlaces de acceso al código y a los videos</w:t>
       </w:r>
-      <w:bookmarkEnd w:id="52"/>
+      <w:bookmarkEnd w:id="58"/>
     </w:p>
     <w:p>
       <w:pPr>
@@ -20188,11 +21792,11 @@
         <w:pStyle w:val="Heading2"/>
         <w:spacing w:before="260" w:after="120"/>
       </w:pPr>
-      <w:bookmarkStart w:id="53" w:name="_Toc236976807"/>
+      <w:bookmarkStart w:id="59" w:name="_Toc237016854"/>
       <w:r>
         <w:t>A.1 Código fuente</w:t>
       </w:r>
-      <w:bookmarkEnd w:id="53"/>
+      <w:bookmarkEnd w:id="59"/>
     </w:p>
     <w:p>
       <w:pPr>
@@ -20207,7 +21811,7 @@
         <w:spacing w:before="160" w:after="160"/>
         <w:jc w:val="center"/>
       </w:pPr>
-      <w:hyperlink r:id="rId16" w:history="1">
+      <w:hyperlink r:id="rId17" w:history="1">
         <w:r>
           <w:rPr>
             <w:b/>
@@ -20658,11 +22262,11 @@
         <w:pStyle w:val="Heading2"/>
         <w:spacing w:before="260" w:after="120"/>
       </w:pPr>
-      <w:bookmarkStart w:id="54" w:name="_Toc236976808"/>
+      <w:bookmarkStart w:id="60" w:name="_Toc237016855"/>
       <w:r>
         <w:t>A.2 Material audiovisual de referencia</w:t>
       </w:r>
-      <w:bookmarkEnd w:id="54"/>
+      <w:bookmarkEnd w:id="60"/>
     </w:p>
     <w:p>
       <w:pPr>
@@ -20700,7 +22304,7 @@
           <w:sz w:val="19"/>
           <w:szCs w:val="19"/>
         </w:rPr>
-        <w:t xml:space="preserve">Tabla 15. </w:t>
+        <w:t xml:space="preserve">Tabla 17. </w:t>
       </w:r>
       <w:r>
         <w:rPr>
@@ -20908,7 +22512,7 @@
             </w:r>
           </w:p>
           <w:p>
-            <w:hyperlink r:id="rId17" w:history="1">
+            <w:hyperlink r:id="rId18" w:history="1">
               <w:r>
                 <w:rPr>
                   <w:color w:val="1155CC"/>
@@ -21009,7 +22613,7 @@
             </w:r>
           </w:p>
           <w:p>
-            <w:hyperlink r:id="rId18" w:history="1">
+            <w:hyperlink r:id="rId19" w:history="1">
               <w:r>
                 <w:rPr>
                   <w:color w:val="1155CC"/>
@@ -21108,7 +22712,7 @@
             </w:r>
           </w:p>
           <w:p>
-            <w:hyperlink r:id="rId19" w:history="1">
+            <w:hyperlink r:id="rId20" w:history="1">
               <w:r>
                 <w:rPr>
                   <w:color w:val="1155CC"/>
@@ -21209,7 +22813,7 @@
             </w:r>
           </w:p>
           <w:p>
-            <w:hyperlink r:id="rId20" w:history="1">
+            <w:hyperlink r:id="rId21" w:history="1">
               <w:r>
                 <w:rPr>
                   <w:color w:val="1155CC"/>
@@ -21308,7 +22912,7 @@
             </w:r>
           </w:p>
           <w:p>
-            <w:hyperlink r:id="rId21" w:history="1">
+            <w:hyperlink r:id="rId22" w:history="1">
               <w:r>
                 <w:rPr>
                   <w:color w:val="1155CC"/>
@@ -21409,7 +23013,7 @@
             </w:r>
           </w:p>
           <w:p>
-            <w:hyperlink r:id="rId22" w:history="1">
+            <w:hyperlink r:id="rId23" w:history="1">
               <w:r>
                 <w:rPr>
                   <w:color w:val="1155CC"/>
@@ -21508,7 +23112,7 @@
             </w:r>
           </w:p>
           <w:p>
-            <w:hyperlink r:id="rId23" w:history="1">
+            <w:hyperlink r:id="rId24" w:history="1">
               <w:r>
                 <w:rPr>
                   <w:color w:val="1155CC"/>
@@ -21609,7 +23213,7 @@
             </w:r>
           </w:p>
           <w:p>
-            <w:hyperlink r:id="rId24" w:history="1">
+            <w:hyperlink r:id="rId25" w:history="1">
               <w:r>
                 <w:rPr>
                   <w:color w:val="1155CC"/>
@@ -21708,7 +23312,7 @@
             </w:r>
           </w:p>
           <w:p>
-            <w:hyperlink r:id="rId25" w:history="1">
+            <w:hyperlink r:id="rId26" w:history="1">
               <w:r>
                 <w:rPr>
                   <w:color w:val="1155CC"/>
@@ -21809,7 +23413,7 @@
             </w:r>
           </w:p>
           <w:p>
-            <w:hyperlink r:id="rId26" w:history="1">
+            <w:hyperlink r:id="rId27" w:history="1">
               <w:r>
                 <w:rPr>
                   <w:color w:val="1155CC"/>
@@ -21908,7 +23512,7 @@
             </w:r>
           </w:p>
           <w:p>
-            <w:hyperlink r:id="rId27" w:history="1">
+            <w:hyperlink r:id="rId28" w:history="1">
               <w:r>
                 <w:rPr>
                   <w:color w:val="1155CC"/>
@@ -22009,7 +23613,7 @@
             </w:r>
           </w:p>
           <w:p>
-            <w:hyperlink r:id="rId28" w:history="1">
+            <w:hyperlink r:id="rId29" w:history="1">
               <w:r>
                 <w:rPr>
                   <w:color w:val="1155CC"/>
@@ -22108,7 +23712,7 @@
             </w:r>
           </w:p>
           <w:p>
-            <w:hyperlink r:id="rId29" w:history="1">
+            <w:hyperlink r:id="rId30" w:history="1">
               <w:r>
                 <w:rPr>
                   <w:color w:val="1155CC"/>
@@ -22209,7 +23813,7 @@
             </w:r>
           </w:p>
           <w:p>
-            <w:hyperlink r:id="rId30" w:history="1">
+            <w:hyperlink r:id="rId31" w:history="1">
               <w:r>
                 <w:rPr>
                   <w:color w:val="1155CC"/>
@@ -22308,7 +23912,7 @@
             </w:r>
           </w:p>
           <w:p>
-            <w:hyperlink r:id="rId31" w:history="1">
+            <w:hyperlink r:id="rId32" w:history="1">
               <w:r>
                 <w:rPr>
                   <w:color w:val="1155CC"/>
@@ -22409,7 +24013,7 @@
             </w:r>
           </w:p>
           <w:p>
-            <w:hyperlink r:id="rId32" w:history="1">
+            <w:hyperlink r:id="rId33" w:history="1">
               <w:r>
                 <w:rPr>
                   <w:color w:val="1155CC"/>
@@ -22508,7 +24112,7 @@
             </w:r>
           </w:p>
           <w:p>
-            <w:hyperlink r:id="rId33" w:history="1">
+            <w:hyperlink r:id="rId34" w:history="1">
               <w:r>
                 <w:rPr>
                   <w:color w:val="1155CC"/>
@@ -22609,7 +24213,7 @@
             </w:r>
           </w:p>
           <w:p>
-            <w:hyperlink r:id="rId34" w:history="1">
+            <w:hyperlink r:id="rId35" w:history="1">
               <w:r>
                 <w:rPr>
                   <w:color w:val="1155CC"/>
@@ -22708,7 +24312,7 @@
             </w:r>
           </w:p>
           <w:p>
-            <w:hyperlink r:id="rId35" w:history="1">
+            <w:hyperlink r:id="rId36" w:history="1">
               <w:r>
                 <w:rPr>
                   <w:color w:val="1155CC"/>
@@ -22809,7 +24413,7 @@
             </w:r>
           </w:p>
           <w:p>
-            <w:hyperlink r:id="rId36" w:history="1">
+            <w:hyperlink r:id="rId37" w:history="1">
               <w:r>
                 <w:rPr>
                   <w:color w:val="1155CC"/>
@@ -22908,7 +24512,7 @@
             </w:r>
           </w:p>
           <w:p>
-            <w:hyperlink r:id="rId37" w:history="1">
+            <w:hyperlink r:id="rId38" w:history="1">
               <w:r>
                 <w:rPr>
                   <w:color w:val="1155CC"/>
@@ -23009,7 +24613,7 @@
             </w:r>
           </w:p>
           <w:p>
-            <w:hyperlink r:id="rId38" w:history="1">
+            <w:hyperlink r:id="rId39" w:history="1">
               <w:r>
                 <w:rPr>
                   <w:color w:val="1155CC"/>
@@ -23108,7 +24712,7 @@
             </w:r>
           </w:p>
           <w:p>
-            <w:hyperlink r:id="rId39" w:history="1">
+            <w:hyperlink r:id="rId40" w:history="1">
               <w:r>
                 <w:rPr>
                   <w:color w:val="1155CC"/>
@@ -23143,11 +24747,11 @@
         <w:pStyle w:val="Heading2"/>
         <w:spacing w:before="260" w:after="120"/>
       </w:pPr>
-      <w:bookmarkStart w:id="55" w:name="_Toc236976809"/>
+      <w:bookmarkStart w:id="61" w:name="_Toc237016856"/>
       <w:r>
         <w:t>A.3 Qué se entrega</w:t>
       </w:r>
-      <w:bookmarkEnd w:id="55"/>
+      <w:bookmarkEnd w:id="61"/>
     </w:p>
     <w:p>
       <w:pPr>
@@ -23210,11 +24814,11 @@
         <w:pStyle w:val="Heading2"/>
         <w:spacing w:before="260" w:after="120"/>
       </w:pPr>
-      <w:bookmarkStart w:id="56" w:name="_Toc236976810"/>
+      <w:bookmarkStart w:id="62" w:name="_Toc237016857"/>
       <w:r>
         <w:t>Cómo reproducir cada demostración</w:t>
       </w:r>
-      <w:bookmarkEnd w:id="56"/>
+      <w:bookmarkEnd w:id="62"/>
     </w:p>
     <w:p>
       <w:pPr>
@@ -23295,7 +24899,7 @@
       </w:r>
     </w:p>
     <w:sectPr>
-      <w:footerReference w:type="default" r:id="rId40"/>
+      <w:footerReference w:type="default" r:id="rId41"/>
       <w:pgSz w:w="12240" w:h="15840"/>
       <w:pgMar w:top="1440" w:right="1440" w:bottom="1440" w:left="1440" w:header="708" w:footer="708" w:gutter="0"/>
       <w:cols w:space="720"/>
@@ -23409,10 +25013,10 @@
 <file path=word/numbering.xml><?xml version="1.0" encoding="utf-8"?>
 <w:numbering xmlns:wpc="http://schemas.microsoft.com/office/word/2010/wordprocessingCanvas" xmlns:cx="http://schemas.microsoft.com/office/drawing/2014/chartex" xmlns:cx1="http://schemas.microsoft.com/office/drawing/2015/9/8/chartex" xmlns:cx2="http://schemas.microsoft.com/office/drawing/2015/10/21/chartex" xmlns:cx3="http://schemas.microsoft.com/office/drawing/2016/5/9/chartex" xmlns:cx4="http://schemas.microsoft.com/office/drawing/2016/5/10/chartex" xmlns:cx5="http://schemas.microsoft.com/office/drawing/2016/5/11/chartex" xmlns:cx6="http://schemas.microsoft.com/office/drawing/2016/5/12/chartex" xmlns:cx7="http://schemas.microsoft.com/office/drawing/2016/5/13/chartex" xmlns:cx8="http://schemas.microsoft.com/office/drawing/2016/5/14/chartex" xmlns:mc="http://schemas.openxmlformats.org/markup-compatibility/2006" xmlns:aink="http://schemas.microsoft.com/office/drawing/2016/ink" xmlns:am3d="http://schemas.microsoft.com/office/drawing/2017/model3d" xmlns:o="urn:schemas-microsoft-com:office:office" xmlns:oel="http://schemas.microsoft.com/office/2019/extlst" xmlns:r="http://schemas.openxmlformats.org/officeDocument/2006/relationships" xmlns:m="http://schemas.openxmlformats.org/officeDocument/2006/math" xmlns:v="urn:schemas-microsoft-com:vml" xmlns:wp14="http://schemas.microsoft.com/office/word/2010/wordprocessingDrawing" xmlns:wp="http://schemas.openxmlformats.org/drawingml/2006/wordprocessingDrawing" xmlns:w10="urn:schemas-microsoft-com:office:word" xmlns:w="http://schemas.openxmlformats.org/wordprocessingml/2006/main" xmlns:w14="http://schemas.microsoft.com/office/word/2010/wordml" xmlns:w15="http://schemas.microsoft.com/office/word/2012/wordml" xmlns:w16cei="http://schemas.microsoft.com/office/word/2026/wordml/cei" xmlns:w16cex="http://schemas.microsoft.com/office/word/2018/wordml/cex" xmlns:w16cid="http://schemas.microsoft.com/office/word/2016/wordml/cid" xmlns:w16="http://schemas.microsoft.com/office/word/2018/wordml" xmlns:w16du="http://schemas.microsoft.com/office/word/2023/wordml/word16du" xmlns:w16sdtdh="http://schemas.microsoft.com/office/word/2020/wordml/sdtdatahash" xmlns:w16sdtfl="http://schemas.microsoft.com/office/word/2024/wordml/sdtformatlock" xmlns:w16se="http://schemas.microsoft.com/office/word/2015/wordml/symex" xmlns:wpg="http://schemas.microsoft.com/office/word/2010/wordprocessingGroup" xmlns:wpi="http://schemas.microsoft.com/office/word/2010/wordprocessingInk" xmlns:wne="http://schemas.microsoft.com/office/word/2006/wordml" xmlns:wps="http://schemas.microsoft.com/office/word/2010/wordprocessingShape" mc:Ignorable="w14 w15 w16se w16cid w16 w16cex w16sdtdh w16sdtfl w16du wp14">
   <w:abstractNum w:abstractNumId="0" w15:restartNumberingAfterBreak="0">
-    <w:nsid w:val="03C95446"/>
+    <w:nsid w:val="71A801DB"/>
     <w:multiLevelType w:val="hybridMultilevel"/>
-    <w:tmpl w:val="D1926C72"/>
-    <w:lvl w:ilvl="0" w:tplc="A850A86A">
+    <w:tmpl w:val="331E850A"/>
+    <w:lvl w:ilvl="0" w:tplc="6C7A236E">
       <w:start w:val="1"/>
       <w:numFmt w:val="bullet"/>
       <w:lvlText w:val="●"/>
@@ -23421,7 +25025,7 @@
         <w:ind w:left="720" w:hanging="360"/>
       </w:pPr>
     </w:lvl>
-    <w:lvl w:ilvl="1" w:tplc="97A88096">
+    <w:lvl w:ilvl="1" w:tplc="BE7C5492">
       <w:start w:val="1"/>
       <w:numFmt w:val="bullet"/>
       <w:lvlText w:val="○"/>
@@ -23430,7 +25034,7 @@
         <w:ind w:left="1440" w:hanging="360"/>
       </w:pPr>
     </w:lvl>
-    <w:lvl w:ilvl="2" w:tplc="9280C28A">
+    <w:lvl w:ilvl="2" w:tplc="DE283D5E">
       <w:start w:val="1"/>
       <w:numFmt w:val="bullet"/>
       <w:lvlText w:val="■"/>
@@ -23439,7 +25043,7 @@
         <w:ind w:left="2160" w:hanging="360"/>
       </w:pPr>
     </w:lvl>
-    <w:lvl w:ilvl="3" w:tplc="B87868C4">
+    <w:lvl w:ilvl="3" w:tplc="B2EC753E">
       <w:start w:val="1"/>
       <w:numFmt w:val="bullet"/>
       <w:lvlText w:val="●"/>
@@ -23448,7 +25052,7 @@
         <w:ind w:left="2880" w:hanging="360"/>
       </w:pPr>
     </w:lvl>
-    <w:lvl w:ilvl="4" w:tplc="8B9450F0">
+    <w:lvl w:ilvl="4" w:tplc="438EFABA">
       <w:start w:val="1"/>
       <w:numFmt w:val="bullet"/>
       <w:lvlText w:val="○"/>
@@ -23457,7 +25061,7 @@
         <w:ind w:left="3600" w:hanging="360"/>
       </w:pPr>
     </w:lvl>
-    <w:lvl w:ilvl="5" w:tplc="98B02E9A">
+    <w:lvl w:ilvl="5" w:tplc="4DE80BB0">
       <w:start w:val="1"/>
       <w:numFmt w:val="bullet"/>
       <w:lvlText w:val="■"/>
@@ -23466,7 +25070,7 @@
         <w:ind w:left="4320" w:hanging="360"/>
       </w:pPr>
     </w:lvl>
-    <w:lvl w:ilvl="6" w:tplc="44D05042">
+    <w:lvl w:ilvl="6" w:tplc="CA189838">
       <w:start w:val="1"/>
       <w:numFmt w:val="bullet"/>
       <w:lvlText w:val="●"/>
@@ -23475,7 +25079,7 @@
         <w:ind w:left="5040" w:hanging="360"/>
       </w:pPr>
     </w:lvl>
-    <w:lvl w:ilvl="7" w:tplc="60761F14">
+    <w:lvl w:ilvl="7" w:tplc="2CCA8D28">
       <w:start w:val="1"/>
       <w:numFmt w:val="bullet"/>
       <w:lvlText w:val="●"/>
@@ -23484,7 +25088,7 @@
         <w:ind w:left="5760" w:hanging="360"/>
       </w:pPr>
     </w:lvl>
-    <w:lvl w:ilvl="8" w:tplc="8FF2B614">
+    <w:lvl w:ilvl="8" w:tplc="9AEE06F2">
       <w:start w:val="1"/>
       <w:numFmt w:val="bullet"/>
       <w:lvlText w:val="●"/>
@@ -23495,10 +25099,10 @@
     </w:lvl>
   </w:abstractNum>
   <w:abstractNum w:abstractNumId="1" w15:restartNumberingAfterBreak="0">
-    <w:nsid w:val="610E1284"/>
+    <w:nsid w:val="7744461D"/>
     <w:multiLevelType w:val="hybridMultilevel"/>
-    <w:tmpl w:val="2F38EC0A"/>
-    <w:lvl w:ilvl="0" w:tplc="C9DCA2B6">
+    <w:tmpl w:val="F9DE5862"/>
+    <w:lvl w:ilvl="0" w:tplc="2F787614">
       <w:start w:val="1"/>
       <w:numFmt w:val="bullet"/>
       <w:lvlText w:val="●"/>
@@ -23512,7 +25116,7 @@
         <w:szCs w:val="16"/>
       </w:rPr>
     </w:lvl>
-    <w:lvl w:ilvl="1" w:tplc="A2D6732E">
+    <w:lvl w:ilvl="1" w:tplc="721AD930">
       <w:start w:val="1"/>
       <w:numFmt w:val="bullet"/>
       <w:lvlText w:val="○"/>
@@ -23521,49 +25125,49 @@
         <w:ind w:left="920" w:hanging="260"/>
       </w:pPr>
     </w:lvl>
-    <w:lvl w:ilvl="2" w:tplc="0DB2EB6C">
+    <w:lvl w:ilvl="2" w:tplc="8E049758">
       <w:numFmt w:val="decimal"/>
       <w:lvlText w:val=""/>
       <w:lvlJc w:val="left"/>
     </w:lvl>
-    <w:lvl w:ilvl="3" w:tplc="268C313A">
+    <w:lvl w:ilvl="3" w:tplc="BAE2FAEC">
       <w:numFmt w:val="decimal"/>
       <w:lvlText w:val=""/>
       <w:lvlJc w:val="left"/>
     </w:lvl>
-    <w:lvl w:ilvl="4" w:tplc="0A22206A">
+    <w:lvl w:ilvl="4" w:tplc="E19464D6">
       <w:numFmt w:val="decimal"/>
       <w:lvlText w:val=""/>
       <w:lvlJc w:val="left"/>
     </w:lvl>
-    <w:lvl w:ilvl="5" w:tplc="07D0220C">
+    <w:lvl w:ilvl="5" w:tplc="BBFC4712">
       <w:numFmt w:val="decimal"/>
       <w:lvlText w:val=""/>
       <w:lvlJc w:val="left"/>
     </w:lvl>
-    <w:lvl w:ilvl="6" w:tplc="8E0CF9FC">
+    <w:lvl w:ilvl="6" w:tplc="ECB6B102">
       <w:numFmt w:val="decimal"/>
       <w:lvlText w:val=""/>
       <w:lvlJc w:val="left"/>
     </w:lvl>
-    <w:lvl w:ilvl="7" w:tplc="ED5A3832">
+    <w:lvl w:ilvl="7" w:tplc="2FB69FE2">
       <w:numFmt w:val="decimal"/>
       <w:lvlText w:val=""/>
       <w:lvlJc w:val="left"/>
     </w:lvl>
-    <w:lvl w:ilvl="8" w:tplc="4E0807CA">
+    <w:lvl w:ilvl="8" w:tplc="51C08A12">
       <w:numFmt w:val="decimal"/>
       <w:lvlText w:val=""/>
       <w:lvlJc w:val="left"/>
     </w:lvl>
   </w:abstractNum>
-  <w:num w:numId="1" w16cid:durableId="336078840">
+  <w:num w:numId="1" w16cid:durableId="60949598">
     <w:abstractNumId w:val="0"/>
     <w:lvlOverride w:ilvl="0">
       <w:startOverride w:val="1"/>
     </w:lvlOverride>
   </w:num>
-  <w:num w:numId="2" w16cid:durableId="446853319">
+  <w:num w:numId="2" w16cid:durableId="1763792411">
     <w:abstractNumId w:val="1"/>
     <w:lvlOverride w:ilvl="0">
       <w:startOverride w:val="1"/>
@@ -24180,7 +25784,7 @@
     <w:autoRedefine/>
     <w:uiPriority w:val="39"/>
     <w:unhideWhenUsed/>
-    <w:rsid w:val="00B131FD"/>
+    <w:rsid w:val="00F802D4"/>
     <w:pPr>
       <w:spacing w:after="100"/>
     </w:pPr>
@@ -24192,7 +25796,7 @@
     <w:autoRedefine/>
     <w:uiPriority w:val="39"/>
     <w:unhideWhenUsed/>
-    <w:rsid w:val="00B131FD"/>
+    <w:rsid w:val="00F802D4"/>
     <w:pPr>
       <w:spacing w:after="100"/>
       <w:ind w:left="220"/>
@@ -24205,7 +25809,7 @@
     <w:autoRedefine/>
     <w:uiPriority w:val="39"/>
     <w:unhideWhenUsed/>
-    <w:rsid w:val="00B131FD"/>
+    <w:rsid w:val="00F802D4"/>
     <w:pPr>
       <w:spacing w:after="100"/>
       <w:ind w:left="440"/>

</xml_diff>

<commit_message>
Anadir declaracion de originalidad y uso de herramientas
</commit_message>
<xml_diff>
--- a/SmartPowerRD_Investigacion_CristianCarrera_2024-1932.docx
+++ b/SmartPowerRD_Investigacion_CristianCarrera_2024-1932.docx
@@ -12,7 +12,7 @@
           <w:noProof/>
         </w:rPr>
         <w:drawing>
-          <wp:inline distT="0" distB="0" distL="0" distR="0" wp14:anchorId="72D18C94" wp14:editId="6C0B071E">
+          <wp:inline distT="0" distB="0" distL="0" distR="0" wp14:anchorId="5CE1394E" wp14:editId="47604552">
             <wp:extent cx="1809750" cy="1047750"/>
             <wp:effectExtent l="0" t="0" r="0" b="0"/>
             <wp:docPr id="1" name="Picture 1"/>
@@ -803,7 +803,7 @@
         </w:pBdr>
         <w:spacing w:before="360" w:after="180"/>
       </w:pPr>
-      <w:bookmarkStart w:id="0" w:name="_Toc237016795"/>
+      <w:bookmarkStart w:id="0" w:name="_Toc237017531"/>
       <w:r>
         <w:t>Índice de contenido</w:t>
       </w:r>
@@ -812,7 +812,7 @@
     <w:sdt>
       <w:sdtPr>
         <w:alias w:val="Tabla de contenido"/>
-        <w:id w:val="-1266380396"/>
+        <w:id w:val="-1439751076"/>
       </w:sdtPr>
       <w:sdtEndPr/>
       <w:sdtContent>
@@ -841,7 +841,7 @@
           <w:r>
             <w:fldChar w:fldCharType="separate"/>
           </w:r>
-          <w:hyperlink w:anchor="_Toc237016795" w:history="1">
+          <w:hyperlink w:anchor="_Toc237017531" w:history="1">
             <w:r>
               <w:rPr>
                 <w:rStyle w:val="Hyperlink"/>
@@ -865,7 +865,7 @@
               <w:rPr>
                 <w:noProof/>
               </w:rPr>
-              <w:instrText xml:space="preserve"> PAGEREF _Toc237016795 \h </w:instrText>
+              <w:instrText xml:space="preserve"> PAGEREF _Toc237017531 \h </w:instrText>
             </w:r>
             <w:r>
               <w:rPr>
@@ -908,7 +908,7 @@
               <w14:ligatures w14:val="standardContextual"/>
             </w:rPr>
           </w:pPr>
-          <w:hyperlink w:anchor="_Toc237016796" w:history="1">
+          <w:hyperlink w:anchor="_Toc237017532" w:history="1">
             <w:r>
               <w:rPr>
                 <w:rStyle w:val="Hyperlink"/>
@@ -932,7 +932,7 @@
               <w:rPr>
                 <w:noProof/>
               </w:rPr>
-              <w:instrText xml:space="preserve"> PAGEREF _Toc237016796 \h </w:instrText>
+              <w:instrText xml:space="preserve"> PAGEREF _Toc237017532 \h </w:instrText>
             </w:r>
             <w:r>
               <w:rPr>
@@ -975,7 +975,7 @@
               <w14:ligatures w14:val="standardContextual"/>
             </w:rPr>
           </w:pPr>
-          <w:hyperlink w:anchor="_Toc237016797" w:history="1">
+          <w:hyperlink w:anchor="_Toc237017533" w:history="1">
             <w:r>
               <w:rPr>
                 <w:rStyle w:val="Hyperlink"/>
@@ -999,7 +999,7 @@
               <w:rPr>
                 <w:noProof/>
               </w:rPr>
-              <w:instrText xml:space="preserve"> PAGEREF _Toc237016797 \h </w:instrText>
+              <w:instrText xml:space="preserve"> PAGEREF _Toc237017533 \h </w:instrText>
             </w:r>
             <w:r>
               <w:rPr>
@@ -1042,7 +1042,7 @@
               <w14:ligatures w14:val="standardContextual"/>
             </w:rPr>
           </w:pPr>
-          <w:hyperlink w:anchor="_Toc237016798" w:history="1">
+          <w:hyperlink w:anchor="_Toc237017534" w:history="1">
             <w:r>
               <w:rPr>
                 <w:rStyle w:val="Hyperlink"/>
@@ -1066,7 +1066,7 @@
               <w:rPr>
                 <w:noProof/>
               </w:rPr>
-              <w:instrText xml:space="preserve"> PAGEREF _Toc237016798 \h </w:instrText>
+              <w:instrText xml:space="preserve"> PAGEREF _Toc237017534 \h </w:instrText>
             </w:r>
             <w:r>
               <w:rPr>
@@ -1109,7 +1109,7 @@
               <w14:ligatures w14:val="standardContextual"/>
             </w:rPr>
           </w:pPr>
-          <w:hyperlink w:anchor="_Toc237016799" w:history="1">
+          <w:hyperlink w:anchor="_Toc237017535" w:history="1">
             <w:r>
               <w:rPr>
                 <w:rStyle w:val="Hyperlink"/>
@@ -1133,7 +1133,7 @@
               <w:rPr>
                 <w:noProof/>
               </w:rPr>
-              <w:instrText xml:space="preserve"> PAGEREF _Toc237016799 \h </w:instrText>
+              <w:instrText xml:space="preserve"> PAGEREF _Toc237017535 \h </w:instrText>
             </w:r>
             <w:r>
               <w:rPr>
@@ -1176,7 +1176,7 @@
               <w14:ligatures w14:val="standardContextual"/>
             </w:rPr>
           </w:pPr>
-          <w:hyperlink w:anchor="_Toc237016800" w:history="1">
+          <w:hyperlink w:anchor="_Toc237017536" w:history="1">
             <w:r>
               <w:rPr>
                 <w:rStyle w:val="Hyperlink"/>
@@ -1200,7 +1200,7 @@
               <w:rPr>
                 <w:noProof/>
               </w:rPr>
-              <w:instrText xml:space="preserve"> PAGEREF _Toc237016800 \h </w:instrText>
+              <w:instrText xml:space="preserve"> PAGEREF _Toc237017536 \h </w:instrText>
             </w:r>
             <w:r>
               <w:rPr>
@@ -1243,7 +1243,7 @@
               <w14:ligatures w14:val="standardContextual"/>
             </w:rPr>
           </w:pPr>
-          <w:hyperlink w:anchor="_Toc237016801" w:history="1">
+          <w:hyperlink w:anchor="_Toc237017537" w:history="1">
             <w:r>
               <w:rPr>
                 <w:rStyle w:val="Hyperlink"/>
@@ -1267,7 +1267,7 @@
               <w:rPr>
                 <w:noProof/>
               </w:rPr>
-              <w:instrText xml:space="preserve"> PAGEREF _Toc237016801 \h </w:instrText>
+              <w:instrText xml:space="preserve"> PAGEREF _Toc237017537 \h </w:instrText>
             </w:r>
             <w:r>
               <w:rPr>
@@ -1310,7 +1310,7 @@
               <w14:ligatures w14:val="standardContextual"/>
             </w:rPr>
           </w:pPr>
-          <w:hyperlink w:anchor="_Toc237016802" w:history="1">
+          <w:hyperlink w:anchor="_Toc237017538" w:history="1">
             <w:r>
               <w:rPr>
                 <w:rStyle w:val="Hyperlink"/>
@@ -1334,7 +1334,7 @@
               <w:rPr>
                 <w:noProof/>
               </w:rPr>
-              <w:instrText xml:space="preserve"> PAGEREF _Toc237016802 \h </w:instrText>
+              <w:instrText xml:space="preserve"> PAGEREF _Toc237017538 \h </w:instrText>
             </w:r>
             <w:r>
               <w:rPr>
@@ -1377,7 +1377,7 @@
               <w14:ligatures w14:val="standardContextual"/>
             </w:rPr>
           </w:pPr>
-          <w:hyperlink w:anchor="_Toc237016803" w:history="1">
+          <w:hyperlink w:anchor="_Toc237017539" w:history="1">
             <w:r>
               <w:rPr>
                 <w:rStyle w:val="Hyperlink"/>
@@ -1401,7 +1401,7 @@
               <w:rPr>
                 <w:noProof/>
               </w:rPr>
-              <w:instrText xml:space="preserve"> PAGEREF _Toc237016803 \h </w:instrText>
+              <w:instrText xml:space="preserve"> PAGEREF _Toc237017539 \h </w:instrText>
             </w:r>
             <w:r>
               <w:rPr>
@@ -1444,7 +1444,7 @@
               <w14:ligatures w14:val="standardContextual"/>
             </w:rPr>
           </w:pPr>
-          <w:hyperlink w:anchor="_Toc237016804" w:history="1">
+          <w:hyperlink w:anchor="_Toc237017540" w:history="1">
             <w:r>
               <w:rPr>
                 <w:rStyle w:val="Hyperlink"/>
@@ -1468,7 +1468,7 @@
               <w:rPr>
                 <w:noProof/>
               </w:rPr>
-              <w:instrText xml:space="preserve"> PAGEREF _Toc237016804 \h </w:instrText>
+              <w:instrText xml:space="preserve"> PAGEREF _Toc237017540 \h </w:instrText>
             </w:r>
             <w:r>
               <w:rPr>
@@ -1511,7 +1511,7 @@
               <w14:ligatures w14:val="standardContextual"/>
             </w:rPr>
           </w:pPr>
-          <w:hyperlink w:anchor="_Toc237016805" w:history="1">
+          <w:hyperlink w:anchor="_Toc237017541" w:history="1">
             <w:r>
               <w:rPr>
                 <w:rStyle w:val="Hyperlink"/>
@@ -1535,7 +1535,7 @@
               <w:rPr>
                 <w:noProof/>
               </w:rPr>
-              <w:instrText xml:space="preserve"> PAGEREF _Toc237016805 \h </w:instrText>
+              <w:instrText xml:space="preserve"> PAGEREF _Toc237017541 \h </w:instrText>
             </w:r>
             <w:r>
               <w:rPr>
@@ -1578,7 +1578,7 @@
               <w14:ligatures w14:val="standardContextual"/>
             </w:rPr>
           </w:pPr>
-          <w:hyperlink w:anchor="_Toc237016806" w:history="1">
+          <w:hyperlink w:anchor="_Toc237017542" w:history="1">
             <w:r>
               <w:rPr>
                 <w:rStyle w:val="Hyperlink"/>
@@ -1602,7 +1602,7 @@
               <w:rPr>
                 <w:noProof/>
               </w:rPr>
-              <w:instrText xml:space="preserve"> PAGEREF _Toc237016806 \h </w:instrText>
+              <w:instrText xml:space="preserve"> PAGEREF _Toc237017542 \h </w:instrText>
             </w:r>
             <w:r>
               <w:rPr>
@@ -1645,7 +1645,7 @@
               <w14:ligatures w14:val="standardContextual"/>
             </w:rPr>
           </w:pPr>
-          <w:hyperlink w:anchor="_Toc237016807" w:history="1">
+          <w:hyperlink w:anchor="_Toc237017543" w:history="1">
             <w:r>
               <w:rPr>
                 <w:rStyle w:val="Hyperlink"/>
@@ -1669,7 +1669,7 @@
               <w:rPr>
                 <w:noProof/>
               </w:rPr>
-              <w:instrText xml:space="preserve"> PAGEREF _Toc237016807 \h </w:instrText>
+              <w:instrText xml:space="preserve"> PAGEREF _Toc237017543 \h </w:instrText>
             </w:r>
             <w:r>
               <w:rPr>
@@ -1712,7 +1712,7 @@
               <w14:ligatures w14:val="standardContextual"/>
             </w:rPr>
           </w:pPr>
-          <w:hyperlink w:anchor="_Toc237016808" w:history="1">
+          <w:hyperlink w:anchor="_Toc237017544" w:history="1">
             <w:r>
               <w:rPr>
                 <w:rStyle w:val="Hyperlink"/>
@@ -1736,7 +1736,7 @@
               <w:rPr>
                 <w:noProof/>
               </w:rPr>
-              <w:instrText xml:space="preserve"> PAGEREF _Toc237016808 \h </w:instrText>
+              <w:instrText xml:space="preserve"> PAGEREF _Toc237017544 \h </w:instrText>
             </w:r>
             <w:r>
               <w:rPr>
@@ -1779,7 +1779,7 @@
               <w14:ligatures w14:val="standardContextual"/>
             </w:rPr>
           </w:pPr>
-          <w:hyperlink w:anchor="_Toc237016809" w:history="1">
+          <w:hyperlink w:anchor="_Toc237017545" w:history="1">
             <w:r>
               <w:rPr>
                 <w:rStyle w:val="Hyperlink"/>
@@ -1803,7 +1803,7 @@
               <w:rPr>
                 <w:noProof/>
               </w:rPr>
-              <w:instrText xml:space="preserve"> PAGEREF _Toc237016809 \h </w:instrText>
+              <w:instrText xml:space="preserve"> PAGEREF _Toc237017545 \h </w:instrText>
             </w:r>
             <w:r>
               <w:rPr>
@@ -1846,7 +1846,7 @@
               <w14:ligatures w14:val="standardContextual"/>
             </w:rPr>
           </w:pPr>
-          <w:hyperlink w:anchor="_Toc237016810" w:history="1">
+          <w:hyperlink w:anchor="_Toc237017546" w:history="1">
             <w:r>
               <w:rPr>
                 <w:rStyle w:val="Hyperlink"/>
@@ -1870,7 +1870,7 @@
               <w:rPr>
                 <w:noProof/>
               </w:rPr>
-              <w:instrText xml:space="preserve"> PAGEREF _Toc237016810 \h </w:instrText>
+              <w:instrText xml:space="preserve"> PAGEREF _Toc237017546 \h </w:instrText>
             </w:r>
             <w:r>
               <w:rPr>
@@ -1913,7 +1913,7 @@
               <w14:ligatures w14:val="standardContextual"/>
             </w:rPr>
           </w:pPr>
-          <w:hyperlink w:anchor="_Toc237016811" w:history="1">
+          <w:hyperlink w:anchor="_Toc237017547" w:history="1">
             <w:r>
               <w:rPr>
                 <w:rStyle w:val="Hyperlink"/>
@@ -1937,7 +1937,7 @@
               <w:rPr>
                 <w:noProof/>
               </w:rPr>
-              <w:instrText xml:space="preserve"> PAGEREF _Toc237016811 \h </w:instrText>
+              <w:instrText xml:space="preserve"> PAGEREF _Toc237017547 \h </w:instrText>
             </w:r>
             <w:r>
               <w:rPr>
@@ -1980,7 +1980,7 @@
               <w14:ligatures w14:val="standardContextual"/>
             </w:rPr>
           </w:pPr>
-          <w:hyperlink w:anchor="_Toc237016812" w:history="1">
+          <w:hyperlink w:anchor="_Toc237017548" w:history="1">
             <w:r>
               <w:rPr>
                 <w:rStyle w:val="Hyperlink"/>
@@ -2004,7 +2004,7 @@
               <w:rPr>
                 <w:noProof/>
               </w:rPr>
-              <w:instrText xml:space="preserve"> PAGEREF _Toc237016812 \h </w:instrText>
+              <w:instrText xml:space="preserve"> PAGEREF _Toc237017548 \h </w:instrText>
             </w:r>
             <w:r>
               <w:rPr>
@@ -2047,7 +2047,7 @@
               <w14:ligatures w14:val="standardContextual"/>
             </w:rPr>
           </w:pPr>
-          <w:hyperlink w:anchor="_Toc237016813" w:history="1">
+          <w:hyperlink w:anchor="_Toc237017549" w:history="1">
             <w:r>
               <w:rPr>
                 <w:rStyle w:val="Hyperlink"/>
@@ -2071,7 +2071,7 @@
               <w:rPr>
                 <w:noProof/>
               </w:rPr>
-              <w:instrText xml:space="preserve"> PAGEREF _Toc237016813 \h </w:instrText>
+              <w:instrText xml:space="preserve"> PAGEREF _Toc237017549 \h </w:instrText>
             </w:r>
             <w:r>
               <w:rPr>
@@ -2114,7 +2114,7 @@
               <w14:ligatures w14:val="standardContextual"/>
             </w:rPr>
           </w:pPr>
-          <w:hyperlink w:anchor="_Toc237016814" w:history="1">
+          <w:hyperlink w:anchor="_Toc237017550" w:history="1">
             <w:r>
               <w:rPr>
                 <w:rStyle w:val="Hyperlink"/>
@@ -2138,7 +2138,7 @@
               <w:rPr>
                 <w:noProof/>
               </w:rPr>
-              <w:instrText xml:space="preserve"> PAGEREF _Toc237016814 \h </w:instrText>
+              <w:instrText xml:space="preserve"> PAGEREF _Toc237017550 \h </w:instrText>
             </w:r>
             <w:r>
               <w:rPr>
@@ -2181,7 +2181,7 @@
               <w14:ligatures w14:val="standardContextual"/>
             </w:rPr>
           </w:pPr>
-          <w:hyperlink w:anchor="_Toc237016815" w:history="1">
+          <w:hyperlink w:anchor="_Toc237017551" w:history="1">
             <w:r>
               <w:rPr>
                 <w:rStyle w:val="Hyperlink"/>
@@ -2205,7 +2205,7 @@
               <w:rPr>
                 <w:noProof/>
               </w:rPr>
-              <w:instrText xml:space="preserve"> PAGEREF _Toc237016815 \h </w:instrText>
+              <w:instrText xml:space="preserve"> PAGEREF _Toc237017551 \h </w:instrText>
             </w:r>
             <w:r>
               <w:rPr>
@@ -2248,7 +2248,7 @@
               <w14:ligatures w14:val="standardContextual"/>
             </w:rPr>
           </w:pPr>
-          <w:hyperlink w:anchor="_Toc237016816" w:history="1">
+          <w:hyperlink w:anchor="_Toc237017552" w:history="1">
             <w:r>
               <w:rPr>
                 <w:rStyle w:val="Hyperlink"/>
@@ -2272,7 +2272,7 @@
               <w:rPr>
                 <w:noProof/>
               </w:rPr>
-              <w:instrText xml:space="preserve"> PAGEREF _Toc237016816 \h </w:instrText>
+              <w:instrText xml:space="preserve"> PAGEREF _Toc237017552 \h </w:instrText>
             </w:r>
             <w:r>
               <w:rPr>
@@ -2315,7 +2315,7 @@
               <w14:ligatures w14:val="standardContextual"/>
             </w:rPr>
           </w:pPr>
-          <w:hyperlink w:anchor="_Toc237016817" w:history="1">
+          <w:hyperlink w:anchor="_Toc237017553" w:history="1">
             <w:r>
               <w:rPr>
                 <w:rStyle w:val="Hyperlink"/>
@@ -2339,7 +2339,7 @@
               <w:rPr>
                 <w:noProof/>
               </w:rPr>
-              <w:instrText xml:space="preserve"> PAGEREF _Toc237016817 \h </w:instrText>
+              <w:instrText xml:space="preserve"> PAGEREF _Toc237017553 \h </w:instrText>
             </w:r>
             <w:r>
               <w:rPr>
@@ -2382,7 +2382,7 @@
               <w14:ligatures w14:val="standardContextual"/>
             </w:rPr>
           </w:pPr>
-          <w:hyperlink w:anchor="_Toc237016818" w:history="1">
+          <w:hyperlink w:anchor="_Toc237017554" w:history="1">
             <w:r>
               <w:rPr>
                 <w:rStyle w:val="Hyperlink"/>
@@ -2406,7 +2406,7 @@
               <w:rPr>
                 <w:noProof/>
               </w:rPr>
-              <w:instrText xml:space="preserve"> PAGEREF _Toc237016818 \h </w:instrText>
+              <w:instrText xml:space="preserve"> PAGEREF _Toc237017554 \h </w:instrText>
             </w:r>
             <w:r>
               <w:rPr>
@@ -2449,7 +2449,7 @@
               <w14:ligatures w14:val="standardContextual"/>
             </w:rPr>
           </w:pPr>
-          <w:hyperlink w:anchor="_Toc237016819" w:history="1">
+          <w:hyperlink w:anchor="_Toc237017555" w:history="1">
             <w:r>
               <w:rPr>
                 <w:rStyle w:val="Hyperlink"/>
@@ -2473,7 +2473,7 @@
               <w:rPr>
                 <w:noProof/>
               </w:rPr>
-              <w:instrText xml:space="preserve"> PAGEREF _Toc237016819 \h </w:instrText>
+              <w:instrText xml:space="preserve"> PAGEREF _Toc237017555 \h </w:instrText>
             </w:r>
             <w:r>
               <w:rPr>
@@ -2516,7 +2516,7 @@
               <w14:ligatures w14:val="standardContextual"/>
             </w:rPr>
           </w:pPr>
-          <w:hyperlink w:anchor="_Toc237016820" w:history="1">
+          <w:hyperlink w:anchor="_Toc237017556" w:history="1">
             <w:r>
               <w:rPr>
                 <w:rStyle w:val="Hyperlink"/>
@@ -2540,7 +2540,7 @@
               <w:rPr>
                 <w:noProof/>
               </w:rPr>
-              <w:instrText xml:space="preserve"> PAGEREF _Toc237016820 \h </w:instrText>
+              <w:instrText xml:space="preserve"> PAGEREF _Toc237017556 \h </w:instrText>
             </w:r>
             <w:r>
               <w:rPr>
@@ -2583,7 +2583,7 @@
               <w14:ligatures w14:val="standardContextual"/>
             </w:rPr>
           </w:pPr>
-          <w:hyperlink w:anchor="_Toc237016821" w:history="1">
+          <w:hyperlink w:anchor="_Toc237017557" w:history="1">
             <w:r>
               <w:rPr>
                 <w:rStyle w:val="Hyperlink"/>
@@ -2607,7 +2607,7 @@
               <w:rPr>
                 <w:noProof/>
               </w:rPr>
-              <w:instrText xml:space="preserve"> PAGEREF _Toc237016821 \h </w:instrText>
+              <w:instrText xml:space="preserve"> PAGEREF _Toc237017557 \h </w:instrText>
             </w:r>
             <w:r>
               <w:rPr>
@@ -2650,7 +2650,7 @@
               <w14:ligatures w14:val="standardContextual"/>
             </w:rPr>
           </w:pPr>
-          <w:hyperlink w:anchor="_Toc237016822" w:history="1">
+          <w:hyperlink w:anchor="_Toc237017558" w:history="1">
             <w:r>
               <w:rPr>
                 <w:rStyle w:val="Hyperlink"/>
@@ -2674,7 +2674,7 @@
               <w:rPr>
                 <w:noProof/>
               </w:rPr>
-              <w:instrText xml:space="preserve"> PAGEREF _Toc237016822 \h </w:instrText>
+              <w:instrText xml:space="preserve"> PAGEREF _Toc237017558 \h </w:instrText>
             </w:r>
             <w:r>
               <w:rPr>
@@ -2717,7 +2717,7 @@
               <w14:ligatures w14:val="standardContextual"/>
             </w:rPr>
           </w:pPr>
-          <w:hyperlink w:anchor="_Toc237016823" w:history="1">
+          <w:hyperlink w:anchor="_Toc237017559" w:history="1">
             <w:r>
               <w:rPr>
                 <w:rStyle w:val="Hyperlink"/>
@@ -2741,7 +2741,7 @@
               <w:rPr>
                 <w:noProof/>
               </w:rPr>
-              <w:instrText xml:space="preserve"> PAGEREF _Toc237016823 \h </w:instrText>
+              <w:instrText xml:space="preserve"> PAGEREF _Toc237017559 \h </w:instrText>
             </w:r>
             <w:r>
               <w:rPr>
@@ -2784,7 +2784,7 @@
               <w14:ligatures w14:val="standardContextual"/>
             </w:rPr>
           </w:pPr>
-          <w:hyperlink w:anchor="_Toc237016824" w:history="1">
+          <w:hyperlink w:anchor="_Toc237017560" w:history="1">
             <w:r>
               <w:rPr>
                 <w:rStyle w:val="Hyperlink"/>
@@ -2808,7 +2808,7 @@
               <w:rPr>
                 <w:noProof/>
               </w:rPr>
-              <w:instrText xml:space="preserve"> PAGEREF _Toc237016824 \h </w:instrText>
+              <w:instrText xml:space="preserve"> PAGEREF _Toc237017560 \h </w:instrText>
             </w:r>
             <w:r>
               <w:rPr>
@@ -2851,7 +2851,7 @@
               <w14:ligatures w14:val="standardContextual"/>
             </w:rPr>
           </w:pPr>
-          <w:hyperlink w:anchor="_Toc237016825" w:history="1">
+          <w:hyperlink w:anchor="_Toc237017561" w:history="1">
             <w:r>
               <w:rPr>
                 <w:rStyle w:val="Hyperlink"/>
@@ -2875,7 +2875,7 @@
               <w:rPr>
                 <w:noProof/>
               </w:rPr>
-              <w:instrText xml:space="preserve"> PAGEREF _Toc237016825 \h </w:instrText>
+              <w:instrText xml:space="preserve"> PAGEREF _Toc237017561 \h </w:instrText>
             </w:r>
             <w:r>
               <w:rPr>
@@ -2918,7 +2918,7 @@
               <w14:ligatures w14:val="standardContextual"/>
             </w:rPr>
           </w:pPr>
-          <w:hyperlink w:anchor="_Toc237016826" w:history="1">
+          <w:hyperlink w:anchor="_Toc237017562" w:history="1">
             <w:r>
               <w:rPr>
                 <w:rStyle w:val="Hyperlink"/>
@@ -2942,7 +2942,7 @@
               <w:rPr>
                 <w:noProof/>
               </w:rPr>
-              <w:instrText xml:space="preserve"> PAGEREF _Toc237016826 \h </w:instrText>
+              <w:instrText xml:space="preserve"> PAGEREF _Toc237017562 \h </w:instrText>
             </w:r>
             <w:r>
               <w:rPr>
@@ -2985,7 +2985,7 @@
               <w14:ligatures w14:val="standardContextual"/>
             </w:rPr>
           </w:pPr>
-          <w:hyperlink w:anchor="_Toc237016827" w:history="1">
+          <w:hyperlink w:anchor="_Toc237017563" w:history="1">
             <w:r>
               <w:rPr>
                 <w:rStyle w:val="Hyperlink"/>
@@ -3009,7 +3009,7 @@
               <w:rPr>
                 <w:noProof/>
               </w:rPr>
-              <w:instrText xml:space="preserve"> PAGEREF _Toc237016827 \h </w:instrText>
+              <w:instrText xml:space="preserve"> PAGEREF _Toc237017563 \h </w:instrText>
             </w:r>
             <w:r>
               <w:rPr>
@@ -3052,7 +3052,7 @@
               <w14:ligatures w14:val="standardContextual"/>
             </w:rPr>
           </w:pPr>
-          <w:hyperlink w:anchor="_Toc237016828" w:history="1">
+          <w:hyperlink w:anchor="_Toc237017564" w:history="1">
             <w:r>
               <w:rPr>
                 <w:rStyle w:val="Hyperlink"/>
@@ -3076,7 +3076,7 @@
               <w:rPr>
                 <w:noProof/>
               </w:rPr>
-              <w:instrText xml:space="preserve"> PAGEREF _Toc237016828 \h </w:instrText>
+              <w:instrText xml:space="preserve"> PAGEREF _Toc237017564 \h </w:instrText>
             </w:r>
             <w:r>
               <w:rPr>
@@ -3119,7 +3119,7 @@
               <w14:ligatures w14:val="standardContextual"/>
             </w:rPr>
           </w:pPr>
-          <w:hyperlink w:anchor="_Toc237016829" w:history="1">
+          <w:hyperlink w:anchor="_Toc237017565" w:history="1">
             <w:r>
               <w:rPr>
                 <w:rStyle w:val="Hyperlink"/>
@@ -3143,7 +3143,7 @@
               <w:rPr>
                 <w:noProof/>
               </w:rPr>
-              <w:instrText xml:space="preserve"> PAGEREF _Toc237016829 \h </w:instrText>
+              <w:instrText xml:space="preserve"> PAGEREF _Toc237017565 \h </w:instrText>
             </w:r>
             <w:r>
               <w:rPr>
@@ -3186,7 +3186,7 @@
               <w14:ligatures w14:val="standardContextual"/>
             </w:rPr>
           </w:pPr>
-          <w:hyperlink w:anchor="_Toc237016830" w:history="1">
+          <w:hyperlink w:anchor="_Toc237017566" w:history="1">
             <w:r>
               <w:rPr>
                 <w:rStyle w:val="Hyperlink"/>
@@ -3210,7 +3210,7 @@
               <w:rPr>
                 <w:noProof/>
               </w:rPr>
-              <w:instrText xml:space="preserve"> PAGEREF _Toc237016830 \h </w:instrText>
+              <w:instrText xml:space="preserve"> PAGEREF _Toc237017566 \h </w:instrText>
             </w:r>
             <w:r>
               <w:rPr>
@@ -3253,7 +3253,7 @@
               <w14:ligatures w14:val="standardContextual"/>
             </w:rPr>
           </w:pPr>
-          <w:hyperlink w:anchor="_Toc237016831" w:history="1">
+          <w:hyperlink w:anchor="_Toc237017567" w:history="1">
             <w:r>
               <w:rPr>
                 <w:rStyle w:val="Hyperlink"/>
@@ -3277,7 +3277,7 @@
               <w:rPr>
                 <w:noProof/>
               </w:rPr>
-              <w:instrText xml:space="preserve"> PAGEREF _Toc237016831 \h </w:instrText>
+              <w:instrText xml:space="preserve"> PAGEREF _Toc237017567 \h </w:instrText>
             </w:r>
             <w:r>
               <w:rPr>
@@ -3320,7 +3320,7 @@
               <w14:ligatures w14:val="standardContextual"/>
             </w:rPr>
           </w:pPr>
-          <w:hyperlink w:anchor="_Toc237016832" w:history="1">
+          <w:hyperlink w:anchor="_Toc237017568" w:history="1">
             <w:r>
               <w:rPr>
                 <w:rStyle w:val="Hyperlink"/>
@@ -3344,7 +3344,7 @@
               <w:rPr>
                 <w:noProof/>
               </w:rPr>
-              <w:instrText xml:space="preserve"> PAGEREF _Toc237016832 \h </w:instrText>
+              <w:instrText xml:space="preserve"> PAGEREF _Toc237017568 \h </w:instrText>
             </w:r>
             <w:r>
               <w:rPr>
@@ -3387,7 +3387,7 @@
               <w14:ligatures w14:val="standardContextual"/>
             </w:rPr>
           </w:pPr>
-          <w:hyperlink w:anchor="_Toc237016833" w:history="1">
+          <w:hyperlink w:anchor="_Toc237017569" w:history="1">
             <w:r>
               <w:rPr>
                 <w:rStyle w:val="Hyperlink"/>
@@ -3411,7 +3411,7 @@
               <w:rPr>
                 <w:noProof/>
               </w:rPr>
-              <w:instrText xml:space="preserve"> PAGEREF _Toc237016833 \h </w:instrText>
+              <w:instrText xml:space="preserve"> PAGEREF _Toc237017569 \h </w:instrText>
             </w:r>
             <w:r>
               <w:rPr>
@@ -3454,7 +3454,7 @@
               <w14:ligatures w14:val="standardContextual"/>
             </w:rPr>
           </w:pPr>
-          <w:hyperlink w:anchor="_Toc237016834" w:history="1">
+          <w:hyperlink w:anchor="_Toc237017570" w:history="1">
             <w:r>
               <w:rPr>
                 <w:rStyle w:val="Hyperlink"/>
@@ -3478,7 +3478,7 @@
               <w:rPr>
                 <w:noProof/>
               </w:rPr>
-              <w:instrText xml:space="preserve"> PAGEREF _Toc237016834 \h </w:instrText>
+              <w:instrText xml:space="preserve"> PAGEREF _Toc237017570 \h </w:instrText>
             </w:r>
             <w:r>
               <w:rPr>
@@ -3521,7 +3521,7 @@
               <w14:ligatures w14:val="standardContextual"/>
             </w:rPr>
           </w:pPr>
-          <w:hyperlink w:anchor="_Toc237016835" w:history="1">
+          <w:hyperlink w:anchor="_Toc237017571" w:history="1">
             <w:r>
               <w:rPr>
                 <w:rStyle w:val="Hyperlink"/>
@@ -3545,7 +3545,7 @@
               <w:rPr>
                 <w:noProof/>
               </w:rPr>
-              <w:instrText xml:space="preserve"> PAGEREF _Toc237016835 \h </w:instrText>
+              <w:instrText xml:space="preserve"> PAGEREF _Toc237017571 \h </w:instrText>
             </w:r>
             <w:r>
               <w:rPr>
@@ -3588,7 +3588,7 @@
               <w14:ligatures w14:val="standardContextual"/>
             </w:rPr>
           </w:pPr>
-          <w:hyperlink w:anchor="_Toc237016836" w:history="1">
+          <w:hyperlink w:anchor="_Toc237017572" w:history="1">
             <w:r>
               <w:rPr>
                 <w:rStyle w:val="Hyperlink"/>
@@ -3612,7 +3612,7 @@
               <w:rPr>
                 <w:noProof/>
               </w:rPr>
-              <w:instrText xml:space="preserve"> PAGEREF _Toc237016836 \h </w:instrText>
+              <w:instrText xml:space="preserve"> PAGEREF _Toc237017572 \h </w:instrText>
             </w:r>
             <w:r>
               <w:rPr>
@@ -3655,7 +3655,7 @@
               <w14:ligatures w14:val="standardContextual"/>
             </w:rPr>
           </w:pPr>
-          <w:hyperlink w:anchor="_Toc237016837" w:history="1">
+          <w:hyperlink w:anchor="_Toc237017573" w:history="1">
             <w:r>
               <w:rPr>
                 <w:rStyle w:val="Hyperlink"/>
@@ -3679,7 +3679,7 @@
               <w:rPr>
                 <w:noProof/>
               </w:rPr>
-              <w:instrText xml:space="preserve"> PAGEREF _Toc237016837 \h </w:instrText>
+              <w:instrText xml:space="preserve"> PAGEREF _Toc237017573 \h </w:instrText>
             </w:r>
             <w:r>
               <w:rPr>
@@ -3722,7 +3722,7 @@
               <w14:ligatures w14:val="standardContextual"/>
             </w:rPr>
           </w:pPr>
-          <w:hyperlink w:anchor="_Toc237016838" w:history="1">
+          <w:hyperlink w:anchor="_Toc237017574" w:history="1">
             <w:r>
               <w:rPr>
                 <w:rStyle w:val="Hyperlink"/>
@@ -3746,7 +3746,7 @@
               <w:rPr>
                 <w:noProof/>
               </w:rPr>
-              <w:instrText xml:space="preserve"> PAGEREF _Toc237016838 \h </w:instrText>
+              <w:instrText xml:space="preserve"> PAGEREF _Toc237017574 \h </w:instrText>
             </w:r>
             <w:r>
               <w:rPr>
@@ -3789,7 +3789,7 @@
               <w14:ligatures w14:val="standardContextual"/>
             </w:rPr>
           </w:pPr>
-          <w:hyperlink w:anchor="_Toc237016839" w:history="1">
+          <w:hyperlink w:anchor="_Toc237017575" w:history="1">
             <w:r>
               <w:rPr>
                 <w:rStyle w:val="Hyperlink"/>
@@ -3813,7 +3813,7 @@
               <w:rPr>
                 <w:noProof/>
               </w:rPr>
-              <w:instrText xml:space="preserve"> PAGEREF _Toc237016839 \h </w:instrText>
+              <w:instrText xml:space="preserve"> PAGEREF _Toc237017575 \h </w:instrText>
             </w:r>
             <w:r>
               <w:rPr>
@@ -3856,7 +3856,7 @@
               <w14:ligatures w14:val="standardContextual"/>
             </w:rPr>
           </w:pPr>
-          <w:hyperlink w:anchor="_Toc237016840" w:history="1">
+          <w:hyperlink w:anchor="_Toc237017576" w:history="1">
             <w:r>
               <w:rPr>
                 <w:rStyle w:val="Hyperlink"/>
@@ -3880,7 +3880,7 @@
               <w:rPr>
                 <w:noProof/>
               </w:rPr>
-              <w:instrText xml:space="preserve"> PAGEREF _Toc237016840 \h </w:instrText>
+              <w:instrText xml:space="preserve"> PAGEREF _Toc237017576 \h </w:instrText>
             </w:r>
             <w:r>
               <w:rPr>
@@ -3923,7 +3923,7 @@
               <w14:ligatures w14:val="standardContextual"/>
             </w:rPr>
           </w:pPr>
-          <w:hyperlink w:anchor="_Toc237016841" w:history="1">
+          <w:hyperlink w:anchor="_Toc237017577" w:history="1">
             <w:r>
               <w:rPr>
                 <w:rStyle w:val="Hyperlink"/>
@@ -3947,7 +3947,7 @@
               <w:rPr>
                 <w:noProof/>
               </w:rPr>
-              <w:instrText xml:space="preserve"> PAGEREF _Toc237016841 \h </w:instrText>
+              <w:instrText xml:space="preserve"> PAGEREF _Toc237017577 \h </w:instrText>
             </w:r>
             <w:r>
               <w:rPr>
@@ -3990,7 +3990,7 @@
               <w14:ligatures w14:val="standardContextual"/>
             </w:rPr>
           </w:pPr>
-          <w:hyperlink w:anchor="_Toc237016842" w:history="1">
+          <w:hyperlink w:anchor="_Toc237017578" w:history="1">
             <w:r>
               <w:rPr>
                 <w:rStyle w:val="Hyperlink"/>
@@ -4014,7 +4014,7 @@
               <w:rPr>
                 <w:noProof/>
               </w:rPr>
-              <w:instrText xml:space="preserve"> PAGEREF _Toc237016842 \h </w:instrText>
+              <w:instrText xml:space="preserve"> PAGEREF _Toc237017578 \h </w:instrText>
             </w:r>
             <w:r>
               <w:rPr>
@@ -4057,7 +4057,7 @@
               <w14:ligatures w14:val="standardContextual"/>
             </w:rPr>
           </w:pPr>
-          <w:hyperlink w:anchor="_Toc237016843" w:history="1">
+          <w:hyperlink w:anchor="_Toc237017579" w:history="1">
             <w:r>
               <w:rPr>
                 <w:rStyle w:val="Hyperlink"/>
@@ -4081,7 +4081,7 @@
               <w:rPr>
                 <w:noProof/>
               </w:rPr>
-              <w:instrText xml:space="preserve"> PAGEREF _Toc237016843 \h </w:instrText>
+              <w:instrText xml:space="preserve"> PAGEREF _Toc237017579 \h </w:instrText>
             </w:r>
             <w:r>
               <w:rPr>
@@ -4124,7 +4124,7 @@
               <w14:ligatures w14:val="standardContextual"/>
             </w:rPr>
           </w:pPr>
-          <w:hyperlink w:anchor="_Toc237016844" w:history="1">
+          <w:hyperlink w:anchor="_Toc237017580" w:history="1">
             <w:r>
               <w:rPr>
                 <w:rStyle w:val="Hyperlink"/>
@@ -4148,7 +4148,7 @@
               <w:rPr>
                 <w:noProof/>
               </w:rPr>
-              <w:instrText xml:space="preserve"> PAGEREF _Toc237016844 \h </w:instrText>
+              <w:instrText xml:space="preserve"> PAGEREF _Toc237017580 \h </w:instrText>
             </w:r>
             <w:r>
               <w:rPr>
@@ -4191,7 +4191,7 @@
               <w14:ligatures w14:val="standardContextual"/>
             </w:rPr>
           </w:pPr>
-          <w:hyperlink w:anchor="_Toc237016845" w:history="1">
+          <w:hyperlink w:anchor="_Toc237017581" w:history="1">
             <w:r>
               <w:rPr>
                 <w:rStyle w:val="Hyperlink"/>
@@ -4215,7 +4215,7 @@
               <w:rPr>
                 <w:noProof/>
               </w:rPr>
-              <w:instrText xml:space="preserve"> PAGEREF _Toc237016845 \h </w:instrText>
+              <w:instrText xml:space="preserve"> PAGEREF _Toc237017581 \h </w:instrText>
             </w:r>
             <w:r>
               <w:rPr>
@@ -4258,7 +4258,7 @@
               <w14:ligatures w14:val="standardContextual"/>
             </w:rPr>
           </w:pPr>
-          <w:hyperlink w:anchor="_Toc237016846" w:history="1">
+          <w:hyperlink w:anchor="_Toc237017582" w:history="1">
             <w:r>
               <w:rPr>
                 <w:rStyle w:val="Hyperlink"/>
@@ -4282,7 +4282,7 @@
               <w:rPr>
                 <w:noProof/>
               </w:rPr>
-              <w:instrText xml:space="preserve"> PAGEREF _Toc237016846 \h </w:instrText>
+              <w:instrText xml:space="preserve"> PAGEREF _Toc237017582 \h </w:instrText>
             </w:r>
             <w:r>
               <w:rPr>
@@ -4325,7 +4325,7 @@
               <w14:ligatures w14:val="standardContextual"/>
             </w:rPr>
           </w:pPr>
-          <w:hyperlink w:anchor="_Toc237016847" w:history="1">
+          <w:hyperlink w:anchor="_Toc237017583" w:history="1">
             <w:r>
               <w:rPr>
                 <w:rStyle w:val="Hyperlink"/>
@@ -4349,7 +4349,7 @@
               <w:rPr>
                 <w:noProof/>
               </w:rPr>
-              <w:instrText xml:space="preserve"> PAGEREF _Toc237016847 \h </w:instrText>
+              <w:instrText xml:space="preserve"> PAGEREF _Toc237017583 \h </w:instrText>
             </w:r>
             <w:r>
               <w:rPr>
@@ -4392,13 +4392,13 @@
               <w14:ligatures w14:val="standardContextual"/>
             </w:rPr>
           </w:pPr>
-          <w:hyperlink w:anchor="_Toc237016848" w:history="1">
+          <w:hyperlink w:anchor="_Toc237017584" w:history="1">
             <w:r>
               <w:rPr>
                 <w:rStyle w:val="Hyperlink"/>
                 <w:noProof/>
               </w:rPr>
-              <w:t>11. Fuentes de investigación y bibliografía</w:t>
+              <w:t>11. Declaración de originalidad y uso de herramientas</w:t>
             </w:r>
             <w:r>
               <w:rPr>
@@ -4416,7 +4416,7 @@
               <w:rPr>
                 <w:noProof/>
               </w:rPr>
-              <w:instrText xml:space="preserve"> PAGEREF _Toc237016848 \h </w:instrText>
+              <w:instrText xml:space="preserve"> PAGEREF _Toc237017584 \h </w:instrText>
             </w:r>
             <w:r>
               <w:rPr>
@@ -4434,6 +4434,73 @@
                 <w:noProof/>
               </w:rPr>
               <w:t>28</w:t>
+            </w:r>
+            <w:r>
+              <w:rPr>
+                <w:noProof/>
+              </w:rPr>
+              <w:fldChar w:fldCharType="end"/>
+            </w:r>
+          </w:hyperlink>
+        </w:p>
+        <w:p>
+          <w:pPr>
+            <w:pStyle w:val="TOC1"/>
+            <w:tabs>
+              <w:tab w:val="right" w:leader="dot" w:pos="9350"/>
+            </w:tabs>
+            <w:rPr>
+              <w:rFonts w:asciiTheme="minorHAnsi" w:eastAsiaTheme="minorEastAsia" w:hAnsiTheme="minorHAnsi" w:cstheme="minorBidi"/>
+              <w:noProof/>
+              <w:color w:val="auto"/>
+              <w:kern w:val="2"/>
+              <w:sz w:val="24"/>
+              <w:szCs w:val="24"/>
+              <w14:ligatures w14:val="standardContextual"/>
+            </w:rPr>
+          </w:pPr>
+          <w:hyperlink w:anchor="_Toc237017585" w:history="1">
+            <w:r>
+              <w:rPr>
+                <w:rStyle w:val="Hyperlink"/>
+                <w:noProof/>
+              </w:rPr>
+              <w:t>12. Fuentes de investigación y bibliografía</w:t>
+            </w:r>
+            <w:r>
+              <w:rPr>
+                <w:noProof/>
+              </w:rPr>
+              <w:tab/>
+            </w:r>
+            <w:r>
+              <w:rPr>
+                <w:noProof/>
+              </w:rPr>
+              <w:fldChar w:fldCharType="begin"/>
+            </w:r>
+            <w:r>
+              <w:rPr>
+                <w:noProof/>
+              </w:rPr>
+              <w:instrText xml:space="preserve"> PAGEREF _Toc237017585 \h </w:instrText>
+            </w:r>
+            <w:r>
+              <w:rPr>
+                <w:noProof/>
+              </w:rPr>
+            </w:r>
+            <w:r>
+              <w:rPr>
+                <w:noProof/>
+              </w:rPr>
+              <w:fldChar w:fldCharType="separate"/>
+            </w:r>
+            <w:r>
+              <w:rPr>
+                <w:noProof/>
+              </w:rPr>
+              <w:t>29</w:t>
             </w:r>
             <w:r>
               <w:rPr>
@@ -4459,13 +4526,13 @@
               <w14:ligatures w14:val="standardContextual"/>
             </w:rPr>
           </w:pPr>
-          <w:hyperlink w:anchor="_Toc237016849" w:history="1">
+          <w:hyperlink w:anchor="_Toc237017586" w:history="1">
             <w:r>
               <w:rPr>
                 <w:rStyle w:val="Hyperlink"/>
                 <w:noProof/>
               </w:rPr>
-              <w:t>11.1 Libros y artículos académicos</w:t>
+              <w:t>12.1 Libros y artículos académicos</w:t>
             </w:r>
             <w:r>
               <w:rPr>
@@ -4483,7 +4550,7 @@
               <w:rPr>
                 <w:noProof/>
               </w:rPr>
-              <w:instrText xml:space="preserve"> PAGEREF _Toc237016849 \h </w:instrText>
+              <w:instrText xml:space="preserve"> PAGEREF _Toc237017586 \h </w:instrText>
             </w:r>
             <w:r>
               <w:rPr>
@@ -4500,7 +4567,7 @@
               <w:rPr>
                 <w:noProof/>
               </w:rPr>
-              <w:t>28</w:t>
+              <w:t>29</w:t>
             </w:r>
             <w:r>
               <w:rPr>
@@ -4526,13 +4593,13 @@
               <w14:ligatures w14:val="standardContextual"/>
             </w:rPr>
           </w:pPr>
-          <w:hyperlink w:anchor="_Toc237016850" w:history="1">
+          <w:hyperlink w:anchor="_Toc237017587" w:history="1">
             <w:r>
               <w:rPr>
                 <w:rStyle w:val="Hyperlink"/>
                 <w:noProof/>
               </w:rPr>
-              <w:t>11.2 Documentación técnica y normas</w:t>
+              <w:t>12.2 Documentación técnica y normas</w:t>
             </w:r>
             <w:r>
               <w:rPr>
@@ -4550,7 +4617,7 @@
               <w:rPr>
                 <w:noProof/>
               </w:rPr>
-              <w:instrText xml:space="preserve"> PAGEREF _Toc237016850 \h </w:instrText>
+              <w:instrText xml:space="preserve"> PAGEREF _Toc237017587 \h </w:instrText>
             </w:r>
             <w:r>
               <w:rPr>
@@ -4567,7 +4634,7 @@
               <w:rPr>
                 <w:noProof/>
               </w:rPr>
-              <w:t>28</w:t>
+              <w:t>29</w:t>
             </w:r>
             <w:r>
               <w:rPr>
@@ -4593,13 +4660,13 @@
               <w14:ligatures w14:val="standardContextual"/>
             </w:rPr>
           </w:pPr>
-          <w:hyperlink w:anchor="_Toc237016851" w:history="1">
+          <w:hyperlink w:anchor="_Toc237017588" w:history="1">
             <w:r>
               <w:rPr>
                 <w:rStyle w:val="Hyperlink"/>
                 <w:noProof/>
               </w:rPr>
-              <w:t>11.3 Conferencias y recursos en línea</w:t>
+              <w:t>12.3 Conferencias y recursos en línea</w:t>
             </w:r>
             <w:r>
               <w:rPr>
@@ -4617,7 +4684,7 @@
               <w:rPr>
                 <w:noProof/>
               </w:rPr>
-              <w:instrText xml:space="preserve"> PAGEREF _Toc237016851 \h </w:instrText>
+              <w:instrText xml:space="preserve"> PAGEREF _Toc237017588 \h </w:instrText>
             </w:r>
             <w:r>
               <w:rPr>
@@ -4634,7 +4701,7 @@
               <w:rPr>
                 <w:noProof/>
               </w:rPr>
-              <w:t>28</w:t>
+              <w:t>29</w:t>
             </w:r>
             <w:r>
               <w:rPr>
@@ -4660,13 +4727,13 @@
               <w14:ligatures w14:val="standardContextual"/>
             </w:rPr>
           </w:pPr>
-          <w:hyperlink w:anchor="_Toc237016852" w:history="1">
+          <w:hyperlink w:anchor="_Toc237017589" w:history="1">
             <w:r>
               <w:rPr>
                 <w:rStyle w:val="Hyperlink"/>
                 <w:noProof/>
               </w:rPr>
-              <w:t>11.4 Fuentes de datos económicos</w:t>
+              <w:t>12.4 Fuentes de datos económicos</w:t>
             </w:r>
             <w:r>
               <w:rPr>
@@ -4684,7 +4751,7 @@
               <w:rPr>
                 <w:noProof/>
               </w:rPr>
-              <w:instrText xml:space="preserve"> PAGEREF _Toc237016852 \h </w:instrText>
+              <w:instrText xml:space="preserve"> PAGEREF _Toc237017589 \h </w:instrText>
             </w:r>
             <w:r>
               <w:rPr>
@@ -4701,7 +4768,7 @@
               <w:rPr>
                 <w:noProof/>
               </w:rPr>
-              <w:t>28</w:t>
+              <w:t>29</w:t>
             </w:r>
             <w:r>
               <w:rPr>
@@ -4727,7 +4794,7 @@
               <w14:ligatures w14:val="standardContextual"/>
             </w:rPr>
           </w:pPr>
-          <w:hyperlink w:anchor="_Toc237016853" w:history="1">
+          <w:hyperlink w:anchor="_Toc237017590" w:history="1">
             <w:r>
               <w:rPr>
                 <w:rStyle w:val="Hyperlink"/>
@@ -4751,7 +4818,7 @@
               <w:rPr>
                 <w:noProof/>
               </w:rPr>
-              <w:instrText xml:space="preserve"> PAGEREF _Toc237016853 \h </w:instrText>
+              <w:instrText xml:space="preserve"> PAGEREF _Toc237017590 \h </w:instrText>
             </w:r>
             <w:r>
               <w:rPr>
@@ -4768,7 +4835,7 @@
               <w:rPr>
                 <w:noProof/>
               </w:rPr>
-              <w:t>29</w:t>
+              <w:t>30</w:t>
             </w:r>
             <w:r>
               <w:rPr>
@@ -4794,7 +4861,7 @@
               <w14:ligatures w14:val="standardContextual"/>
             </w:rPr>
           </w:pPr>
-          <w:hyperlink w:anchor="_Toc237016854" w:history="1">
+          <w:hyperlink w:anchor="_Toc237017591" w:history="1">
             <w:r>
               <w:rPr>
                 <w:rStyle w:val="Hyperlink"/>
@@ -4818,7 +4885,7 @@
               <w:rPr>
                 <w:noProof/>
               </w:rPr>
-              <w:instrText xml:space="preserve"> PAGEREF _Toc237016854 \h </w:instrText>
+              <w:instrText xml:space="preserve"> PAGEREF _Toc237017591 \h </w:instrText>
             </w:r>
             <w:r>
               <w:rPr>
@@ -4835,7 +4902,7 @@
               <w:rPr>
                 <w:noProof/>
               </w:rPr>
-              <w:t>29</w:t>
+              <w:t>30</w:t>
             </w:r>
             <w:r>
               <w:rPr>
@@ -4861,7 +4928,7 @@
               <w14:ligatures w14:val="standardContextual"/>
             </w:rPr>
           </w:pPr>
-          <w:hyperlink w:anchor="_Toc237016855" w:history="1">
+          <w:hyperlink w:anchor="_Toc237017592" w:history="1">
             <w:r>
               <w:rPr>
                 <w:rStyle w:val="Hyperlink"/>
@@ -4885,7 +4952,7 @@
               <w:rPr>
                 <w:noProof/>
               </w:rPr>
-              <w:instrText xml:space="preserve"> PAGEREF _Toc237016855 \h </w:instrText>
+              <w:instrText xml:space="preserve"> PAGEREF _Toc237017592 \h </w:instrText>
             </w:r>
             <w:r>
               <w:rPr>
@@ -4902,7 +4969,7 @@
               <w:rPr>
                 <w:noProof/>
               </w:rPr>
-              <w:t>29</w:t>
+              <w:t>30</w:t>
             </w:r>
             <w:r>
               <w:rPr>
@@ -4928,7 +4995,7 @@
               <w14:ligatures w14:val="standardContextual"/>
             </w:rPr>
           </w:pPr>
-          <w:hyperlink w:anchor="_Toc237016856" w:history="1">
+          <w:hyperlink w:anchor="_Toc237017593" w:history="1">
             <w:r>
               <w:rPr>
                 <w:rStyle w:val="Hyperlink"/>
@@ -4952,7 +5019,7 @@
               <w:rPr>
                 <w:noProof/>
               </w:rPr>
-              <w:instrText xml:space="preserve"> PAGEREF _Toc237016856 \h </w:instrText>
+              <w:instrText xml:space="preserve"> PAGEREF _Toc237017593 \h </w:instrText>
             </w:r>
             <w:r>
               <w:rPr>
@@ -4969,7 +5036,7 @@
               <w:rPr>
                 <w:noProof/>
               </w:rPr>
-              <w:t>31</w:t>
+              <w:t>32</w:t>
             </w:r>
             <w:r>
               <w:rPr>
@@ -4995,7 +5062,7 @@
               <w14:ligatures w14:val="standardContextual"/>
             </w:rPr>
           </w:pPr>
-          <w:hyperlink w:anchor="_Toc237016857" w:history="1">
+          <w:hyperlink w:anchor="_Toc237017594" w:history="1">
             <w:r>
               <w:rPr>
                 <w:rStyle w:val="Hyperlink"/>
@@ -5019,7 +5086,7 @@
               <w:rPr>
                 <w:noProof/>
               </w:rPr>
-              <w:instrText xml:space="preserve"> PAGEREF _Toc237016857 \h </w:instrText>
+              <w:instrText xml:space="preserve"> PAGEREF _Toc237017594 \h </w:instrText>
             </w:r>
             <w:r>
               <w:rPr>
@@ -5036,7 +5103,7 @@
               <w:rPr>
                 <w:noProof/>
               </w:rPr>
-              <w:t>31</w:t>
+              <w:t>32</w:t>
             </w:r>
             <w:r>
               <w:rPr>
@@ -5066,7 +5133,7 @@
         </w:pBdr>
         <w:spacing w:before="360" w:after="180"/>
       </w:pPr>
-      <w:bookmarkStart w:id="1" w:name="_Toc237016796"/>
+      <w:bookmarkStart w:id="1" w:name="_Toc237017532"/>
       <w:r>
         <w:t>1. Introducción</w:t>
       </w:r>
@@ -5085,7 +5152,7 @@
         <w:spacing w:after="120" w:line="276" w:lineRule="auto"/>
       </w:pPr>
       <w:r>
-        <w:t>Este trabajo parte de una pregunta muy concreta que me hice como estudiante y como usuario: ¿qué me gustaría construir con un Arduino que resolviera un problema real de mi propia casa? La respuesta fue SmartPower RD, un sistema de Internet de las Cosas que mide continuamente el voltaje y la corriente de la acometida eléctrica, decide por sí mismo cuándo transferir la carga al inversor, protege los equipos ante voltajes peligrosos y notifica al usuario en su teléfono, esté donde esté.</w:t>
+        <w:t>Este trabajo parte de una pregunta muy concreta: ¿qué se puede construir con un Arduino que resuelva un problema real de una vivienda dominicana? La respuesta elegida fue SmartPower RD, un sistema de Internet de las Cosas que mide continuamente el voltaje y la corriente de la acometida eléctrica, decide por sí mismo cuándo transferir la carga al inversor, protege los equipos ante voltajes peligrosos y notifica al usuario en su teléfono, esté donde esté.</w:t>
       </w:r>
     </w:p>
     <w:p>
@@ -5120,7 +5187,7 @@
         </w:pBdr>
         <w:spacing w:before="360" w:after="180"/>
       </w:pPr>
-      <w:bookmarkStart w:id="2" w:name="_Toc237016797"/>
+      <w:bookmarkStart w:id="2" w:name="_Toc237017533"/>
       <w:r>
         <w:t>2. Objetivos</w:t>
       </w:r>
@@ -5131,7 +5198,7 @@
         <w:pStyle w:val="Heading2"/>
         <w:spacing w:before="260" w:after="120"/>
       </w:pPr>
-      <w:bookmarkStart w:id="3" w:name="_Toc237016798"/>
+      <w:bookmarkStart w:id="3" w:name="_Toc237017534"/>
       <w:r>
         <w:t>2.1 Objetivo general</w:t>
       </w:r>
@@ -5150,7 +5217,7 @@
         <w:pStyle w:val="Heading2"/>
         <w:spacing w:before="260" w:after="120"/>
       </w:pPr>
-      <w:bookmarkStart w:id="4" w:name="_Toc237016799"/>
+      <w:bookmarkStart w:id="4" w:name="_Toc237017535"/>
       <w:r>
         <w:t>2.2 Objetivos específicos</w:t>
       </w:r>
@@ -5255,7 +5322,7 @@
         </w:pBdr>
         <w:spacing w:before="360" w:after="180"/>
       </w:pPr>
-      <w:bookmarkStart w:id="5" w:name="_Toc237016800"/>
+      <w:bookmarkStart w:id="5" w:name="_Toc237017536"/>
       <w:r>
         <w:t>3. Planteamiento del problema y justificación</w:t>
       </w:r>
@@ -5266,7 +5333,7 @@
         <w:pStyle w:val="Heading2"/>
         <w:spacing w:before="260" w:after="120"/>
       </w:pPr>
-      <w:bookmarkStart w:id="6" w:name="_Toc237016801"/>
+      <w:bookmarkStart w:id="6" w:name="_Toc237017537"/>
       <w:r>
         <w:t>3.1 El contexto dominicano</w:t>
       </w:r>
@@ -5345,7 +5412,7 @@
         <w:pStyle w:val="Heading2"/>
         <w:spacing w:before="260" w:after="120"/>
       </w:pPr>
-      <w:bookmarkStart w:id="7" w:name="_Toc237016802"/>
+      <w:bookmarkStart w:id="7" w:name="_Toc237017538"/>
       <w:r>
         <w:t>3.2 Por qué un microcontrolador y no una aplicación</w:t>
       </w:r>
@@ -5367,7 +5434,7 @@
         <w:pStyle w:val="Heading2"/>
         <w:spacing w:before="260" w:after="120"/>
       </w:pPr>
-      <w:bookmarkStart w:id="8" w:name="_Toc237016803"/>
+      <w:bookmarkStart w:id="8" w:name="_Toc237017539"/>
       <w:r>
         <w:t>3.3 Por qué el problema es de programación concurrente</w:t>
       </w:r>
@@ -5883,7 +5950,7 @@
         </w:pBdr>
         <w:spacing w:before="360" w:after="180"/>
       </w:pPr>
-      <w:bookmarkStart w:id="9" w:name="_Toc237016804"/>
+      <w:bookmarkStart w:id="9" w:name="_Toc237017540"/>
       <w:r>
         <w:t>4. Marco conceptual: programación en hilos y tareas</w:t>
       </w:r>
@@ -5902,7 +5969,7 @@
         <w:pStyle w:val="Heading2"/>
         <w:spacing w:before="260" w:after="120"/>
       </w:pPr>
-      <w:bookmarkStart w:id="10" w:name="_Toc237016805"/>
+      <w:bookmarkStart w:id="10" w:name="_Toc237017541"/>
       <w:r>
         <w:t>4.1 Proceso, hilo y tarea: tres cosas distintas</w:t>
       </w:r>
@@ -6462,7 +6529,7 @@
         <w:pStyle w:val="Heading2"/>
         <w:spacing w:before="260" w:after="120"/>
       </w:pPr>
-      <w:bookmarkStart w:id="11" w:name="_Toc237016806"/>
+      <w:bookmarkStart w:id="11" w:name="_Toc237017542"/>
       <w:r>
         <w:t>4.2 Concurrencia no es paralelismo</w:t>
       </w:r>
@@ -6538,7 +6605,7 @@
         <w:pStyle w:val="Heading2"/>
         <w:spacing w:before="260" w:after="120"/>
       </w:pPr>
-      <w:bookmarkStart w:id="12" w:name="_Toc237016807"/>
+      <w:bookmarkStart w:id="12" w:name="_Toc237017543"/>
       <w:r>
         <w:t>4.3 Programación distribuida</w:t>
       </w:r>
@@ -6604,7 +6671,7 @@
         <w:pStyle w:val="Heading2"/>
         <w:spacing w:before="260" w:after="120"/>
       </w:pPr>
-      <w:bookmarkStart w:id="13" w:name="_Toc237016808"/>
+      <w:bookmarkStart w:id="13" w:name="_Toc237017544"/>
       <w:r>
         <w:t>4.4 Mecanismos de sincronización</w:t>
       </w:r>
@@ -7177,7 +7244,7 @@
         <w:pStyle w:val="Heading2"/>
         <w:spacing w:before="260" w:after="120"/>
       </w:pPr>
-      <w:bookmarkStart w:id="14" w:name="_Toc237016809"/>
+      <w:bookmarkStart w:id="14" w:name="_Toc237017545"/>
       <w:r>
         <w:t>4.5 Los tres errores clásicos, y cómo se evitan aquí</w:t>
       </w:r>
@@ -7188,7 +7255,7 @@
         <w:pStyle w:val="Heading3"/>
         <w:spacing w:before="200" w:after="100"/>
       </w:pPr>
-      <w:bookmarkStart w:id="15" w:name="_Toc237016810"/>
+      <w:bookmarkStart w:id="15" w:name="_Toc237017546"/>
       <w:r>
         <w:t>Condición de carrera</w:t>
       </w:r>
@@ -7207,7 +7274,7 @@
         <w:pStyle w:val="Heading3"/>
         <w:spacing w:before="200" w:after="100"/>
       </w:pPr>
-      <w:bookmarkStart w:id="16" w:name="_Toc237016811"/>
+      <w:bookmarkStart w:id="16" w:name="_Toc237017547"/>
       <w:r>
         <w:t>Interbloqueo (deadlock)</w:t>
       </w:r>
@@ -7226,7 +7293,7 @@
         <w:pStyle w:val="Heading3"/>
         <w:spacing w:before="200" w:after="100"/>
       </w:pPr>
-      <w:bookmarkStart w:id="17" w:name="_Toc237016812"/>
+      <w:bookmarkStart w:id="17" w:name="_Toc237017548"/>
       <w:r>
         <w:t>Inversión de prioridad</w:t>
       </w:r>
@@ -7271,7 +7338,7 @@
         </w:pBdr>
         <w:spacing w:before="360" w:after="180"/>
       </w:pPr>
-      <w:bookmarkStart w:id="18" w:name="_Toc237016813"/>
+      <w:bookmarkStart w:id="18" w:name="_Toc237017549"/>
       <w:r>
         <w:t>5. Desarrollo del caso práctico: SmartPower RD</w:t>
       </w:r>
@@ -7282,7 +7349,7 @@
         <w:pStyle w:val="Heading2"/>
         <w:spacing w:before="260" w:after="120"/>
       </w:pPr>
-      <w:bookmarkStart w:id="19" w:name="_Toc237016814"/>
+      <w:bookmarkStart w:id="19" w:name="_Toc237017550"/>
       <w:r>
         <w:t>5.1 Descripción funcional</w:t>
       </w:r>
@@ -7353,7 +7420,7 @@
         <w:pStyle w:val="Heading2"/>
         <w:spacing w:before="260" w:after="120"/>
       </w:pPr>
-      <w:bookmarkStart w:id="20" w:name="_Toc237016815"/>
+      <w:bookmarkStart w:id="20" w:name="_Toc237017551"/>
       <w:r>
         <w:t>5.2 Arquitectura del sistema</w:t>
       </w:r>
@@ -7788,7 +7855,7 @@
         <w:pStyle w:val="Heading2"/>
         <w:spacing w:before="260" w:after="120"/>
       </w:pPr>
-      <w:bookmarkStart w:id="21" w:name="_Toc237016816"/>
+      <w:bookmarkStart w:id="21" w:name="_Toc237017552"/>
       <w:r>
         <w:t>5.3 Componentes de hardware y su función</w:t>
       </w:r>
@@ -8428,7 +8495,7 @@
         <w:pStyle w:val="Heading2"/>
         <w:spacing w:before="260" w:after="120"/>
       </w:pPr>
-      <w:bookmarkStart w:id="22" w:name="_Toc237016817"/>
+      <w:bookmarkStart w:id="22" w:name="_Toc237017553"/>
       <w:r>
         <w:t>5.4 Arquitectura de tareas: la decisión central del diseño</w:t>
       </w:r>
@@ -9303,7 +9370,7 @@
         <w:pStyle w:val="Heading2"/>
         <w:spacing w:before="260" w:after="120"/>
       </w:pPr>
-      <w:bookmarkStart w:id="23" w:name="_Toc237016818"/>
+      <w:bookmarkStart w:id="23" w:name="_Toc237017554"/>
       <w:r>
         <w:t>5.5 Flujo de datos y de sincronización</w:t>
       </w:r>
@@ -9661,7 +9728,7 @@
         <w:pStyle w:val="Heading2"/>
         <w:spacing w:before="260" w:after="120"/>
       </w:pPr>
-      <w:bookmarkStart w:id="24" w:name="_Toc237016819"/>
+      <w:bookmarkStart w:id="24" w:name="_Toc237017555"/>
       <w:r>
         <w:t>5.6 Fragmento representativo del código</w:t>
       </w:r>
@@ -10121,7 +10188,7 @@
         <w:pStyle w:val="Heading2"/>
         <w:spacing w:before="260" w:after="120"/>
       </w:pPr>
-      <w:bookmarkStart w:id="25" w:name="_Toc237016820"/>
+      <w:bookmarkStart w:id="25" w:name="_Toc237017556"/>
       <w:r>
         <w:t>5.7 Extensión con inteligencia artificial</w:t>
       </w:r>
@@ -10208,7 +10275,7 @@
         <w:pStyle w:val="Heading2"/>
         <w:spacing w:before="260" w:after="120"/>
       </w:pPr>
-      <w:bookmarkStart w:id="26" w:name="_Toc237016821"/>
+      <w:bookmarkStart w:id="26" w:name="_Toc237017557"/>
       <w:r>
         <w:t>5.8 Implementación en Arduino Cloud</w:t>
       </w:r>
@@ -10235,7 +10302,7 @@
         <w:pStyle w:val="Heading3"/>
         <w:spacing w:before="200" w:after="100"/>
       </w:pPr>
-      <w:bookmarkStart w:id="27" w:name="_Toc237016822"/>
+      <w:bookmarkStart w:id="27" w:name="_Toc237017558"/>
       <w:r>
         <w:t>El problema que plantea ArduinoCloud.update()</w:t>
       </w:r>
@@ -10262,7 +10329,7 @@
         <w:pStyle w:val="Heading3"/>
         <w:spacing w:before="200" w:after="100"/>
       </w:pPr>
-      <w:bookmarkStart w:id="28" w:name="_Toc237016823"/>
+      <w:bookmarkStart w:id="28" w:name="_Toc237017559"/>
       <w:r>
         <w:t>Seguridad entre hilos de las variables de nube</w:t>
       </w:r>
@@ -10284,7 +10351,7 @@
         <w:pStyle w:val="Heading3"/>
         <w:spacing w:before="200" w:after="100"/>
       </w:pPr>
-      <w:bookmarkStart w:id="29" w:name="_Toc237016824"/>
+      <w:bookmarkStart w:id="29" w:name="_Toc237017560"/>
       <w:r>
         <w:t>Variables de nube y tablero</w:t>
       </w:r>
@@ -11822,7 +11889,7 @@
         </w:pBdr>
         <w:spacing w:before="360" w:after="180"/>
       </w:pPr>
-      <w:bookmarkStart w:id="30" w:name="_Toc237016825"/>
+      <w:bookmarkStart w:id="30" w:name="_Toc237017561"/>
       <w:r>
         <w:t>6. Revisión del diseño a partir de la retroalimentación</w:t>
       </w:r>
@@ -11841,7 +11908,7 @@
         <w:pStyle w:val="Heading2"/>
         <w:spacing w:before="260" w:after="120"/>
       </w:pPr>
-      <w:bookmarkStart w:id="31" w:name="_Toc237016826"/>
+      <w:bookmarkStart w:id="31" w:name="_Toc237017562"/>
       <w:r>
         <w:t>6.1 ¿Una fase o dos fases?</w:t>
       </w:r>
@@ -11868,7 +11935,7 @@
         <w:pStyle w:val="Heading3"/>
         <w:spacing w:before="200" w:after="100"/>
       </w:pPr>
-      <w:bookmarkStart w:id="32" w:name="_Toc237016827"/>
+      <w:bookmarkStart w:id="32" w:name="_Toc237017563"/>
       <w:r>
         <w:t>Fase perdida</w:t>
       </w:r>
@@ -11887,7 +11954,7 @@
         <w:pStyle w:val="Heading3"/>
         <w:spacing w:before="200" w:after="100"/>
       </w:pPr>
-      <w:bookmarkStart w:id="33" w:name="_Toc237016828"/>
+      <w:bookmarkStart w:id="33" w:name="_Toc237017564"/>
       <w:r>
         <w:t>Neutro perdido</w:t>
       </w:r>
@@ -11925,7 +11992,7 @@
         <w:pStyle w:val="Heading2"/>
         <w:spacing w:before="260" w:after="120"/>
       </w:pPr>
-      <w:bookmarkStart w:id="34" w:name="_Toc237016829"/>
+      <w:bookmarkStart w:id="34" w:name="_Toc237017565"/>
       <w:r>
         <w:t>6.2 ¿Se protege el inversor o se protegen los electrodomésticos?</w:t>
       </w:r>
@@ -12343,7 +12410,7 @@
         <w:pStyle w:val="Heading2"/>
         <w:spacing w:before="260" w:after="120"/>
       </w:pPr>
-      <w:bookmarkStart w:id="35" w:name="_Toc237016830"/>
+      <w:bookmarkStart w:id="35" w:name="_Toc237017566"/>
       <w:r>
         <w:t>6.3 La alimentación del propio monitor</w:t>
       </w:r>
@@ -12715,7 +12782,7 @@
         </w:pBdr>
         <w:spacing w:before="360" w:after="180"/>
       </w:pPr>
-      <w:bookmarkStart w:id="36" w:name="_Toc237016831"/>
+      <w:bookmarkStart w:id="36" w:name="_Toc237017567"/>
       <w:r>
         <w:t>7. Evidencias demostrables de programación concurrente</w:t>
       </w:r>
@@ -13539,7 +13606,7 @@
         <w:pStyle w:val="Heading2"/>
         <w:spacing w:before="260" w:after="120"/>
       </w:pPr>
-      <w:bookmarkStart w:id="37" w:name="_Toc237016832"/>
+      <w:bookmarkStart w:id="37" w:name="_Toc237017568"/>
       <w:r>
         <w:t>7.1 Ejemplo 1 — El problema: programación secuencial bloqueante</w:t>
       </w:r>
@@ -13566,7 +13633,7 @@
         <w:pStyle w:val="Heading2"/>
         <w:spacing w:before="260" w:after="120"/>
       </w:pPr>
-      <w:bookmarkStart w:id="38" w:name="_Toc237016833"/>
+      <w:bookmarkStart w:id="38" w:name="_Toc237017569"/>
       <w:r>
         <w:t>7.2 Ejemplo 2 — Multitarea cooperativa con millis()</w:t>
       </w:r>
@@ -13601,7 +13668,7 @@
         <w:pStyle w:val="Heading2"/>
         <w:spacing w:before="260" w:after="120"/>
       </w:pPr>
-      <w:bookmarkStart w:id="39" w:name="_Toc237016834"/>
+      <w:bookmarkStart w:id="39" w:name="_Toc237017570"/>
       <w:r>
         <w:t>7.3 Ejemplo 3 — Hilos reales, expulsión y dos núcleos</w:t>
       </w:r>
@@ -13631,7 +13698,7 @@
         <w:pStyle w:val="Heading2"/>
         <w:spacing w:before="260" w:after="120"/>
       </w:pPr>
-      <w:bookmarkStart w:id="40" w:name="_Toc237016835"/>
+      <w:bookmarkStart w:id="40" w:name="_Toc237017571"/>
       <w:r>
         <w:t>7.4 Ejemplo 4 — La condición de carrera y su cura</w:t>
       </w:r>
@@ -13666,7 +13733,7 @@
         <w:pStyle w:val="Heading2"/>
         <w:spacing w:before="260" w:after="120"/>
       </w:pPr>
-      <w:bookmarkStart w:id="41" w:name="_Toc237016836"/>
+      <w:bookmarkStart w:id="41" w:name="_Toc237017572"/>
       <w:r>
         <w:t>7.5 Ejemplo 5 — Programación distribuida con MQTT</w:t>
       </w:r>
@@ -13701,7 +13768,7 @@
         <w:pStyle w:val="Heading2"/>
         <w:spacing w:before="260" w:after="120"/>
       </w:pPr>
-      <w:bookmarkStart w:id="42" w:name="_Toc237016837"/>
+      <w:bookmarkStart w:id="42" w:name="_Toc237017573"/>
       <w:r>
         <w:t>7.6 Ejemplo 6 — Concurrencia y paralelismo, medidos con cronómetro</w:t>
       </w:r>
@@ -14454,7 +14521,7 @@
         </w:pBdr>
         <w:spacing w:before="360" w:after="180"/>
       </w:pPr>
-      <w:bookmarkStart w:id="43" w:name="_Toc237016838"/>
+      <w:bookmarkStart w:id="43" w:name="_Toc237017574"/>
       <w:r>
         <w:t>8. Presupuesto y cotización</w:t>
       </w:r>
@@ -14488,7 +14555,7 @@
         <w:pStyle w:val="Heading2"/>
         <w:spacing w:before="260" w:after="120"/>
       </w:pPr>
-      <w:bookmarkStart w:id="44" w:name="_Toc237016839"/>
+      <w:bookmarkStart w:id="44" w:name="_Toc237017575"/>
       <w:r>
         <w:t>8.1 Escenario A — Prototipo académico simulado</w:t>
       </w:r>
@@ -15419,7 +15486,7 @@
         <w:pStyle w:val="Heading2"/>
         <w:spacing w:before="260" w:after="120"/>
       </w:pPr>
-      <w:bookmarkStart w:id="45" w:name="_Toc237016840"/>
+      <w:bookmarkStart w:id="45" w:name="_Toc237017576"/>
       <w:r>
         <w:t>8.2 Escenario B — Implementación física en una vivienda</w:t>
       </w:r>
@@ -15430,7 +15497,7 @@
         <w:pStyle w:val="Heading3"/>
         <w:spacing w:before="200" w:after="100"/>
       </w:pPr>
-      <w:bookmarkStart w:id="46" w:name="_Toc237016841"/>
+      <w:bookmarkStart w:id="46" w:name="_Toc237017577"/>
       <w:r>
         <w:t>8.2.1 Materiales y componentes</w:t>
       </w:r>
@@ -17595,7 +17662,7 @@
         <w:pStyle w:val="Heading3"/>
         <w:spacing w:before="200" w:after="100"/>
       </w:pPr>
-      <w:bookmarkStart w:id="47" w:name="_Toc237016842"/>
+      <w:bookmarkStart w:id="47" w:name="_Toc237017578"/>
       <w:r>
         <w:t>8.2.2 Logística, impuestos y servicios</w:t>
       </w:r>
@@ -18851,7 +18918,7 @@
         <w:pStyle w:val="Heading3"/>
         <w:spacing w:before="200" w:after="100"/>
       </w:pPr>
-      <w:bookmarkStart w:id="48" w:name="_Toc237016843"/>
+      <w:bookmarkStart w:id="48" w:name="_Toc237017579"/>
       <w:r>
         <w:t>8.2.3 Costos recurrentes</w:t>
       </w:r>
@@ -19562,7 +19629,7 @@
         <w:pStyle w:val="Heading2"/>
         <w:spacing w:before="260" w:after="120"/>
       </w:pPr>
-      <w:bookmarkStart w:id="49" w:name="_Toc237016844"/>
+      <w:bookmarkStart w:id="49" w:name="_Toc237017580"/>
       <w:r>
         <w:t>8.3 Análisis de retorno de la inversión</w:t>
       </w:r>
@@ -20220,7 +20287,7 @@
         </w:pBdr>
         <w:spacing w:before="360" w:after="180"/>
       </w:pPr>
-      <w:bookmarkStart w:id="50" w:name="_Toc237016845"/>
+      <w:bookmarkStart w:id="50" w:name="_Toc237017581"/>
       <w:r>
         <w:t>9. Cronograma de implementación</w:t>
       </w:r>
@@ -21259,7 +21326,7 @@
         </w:pBdr>
         <w:spacing w:before="360" w:after="180"/>
       </w:pPr>
-      <w:bookmarkStart w:id="51" w:name="_Toc237016846"/>
+      <w:bookmarkStart w:id="51" w:name="_Toc237017582"/>
       <w:r>
         <w:t>10. Conclusión</w:t>
       </w:r>
@@ -21294,10 +21361,7 @@
         <w:spacing w:after="120" w:line="276" w:lineRule="auto"/>
       </w:pPr>
       <w:r>
-        <w:t>La tercera conclusión, y la que más me sorprendió al desarrollar el trabajo, tiene que ver con la naturaleza de los errores de concurrencia. Cuando el programa del Ejemplo 6 perdió el 74.9 % de sus operaciones, no se cayó, no lanzó ninguna excepción y no emitió ni una advertencia: simplemente devolvió un número equivocado con absoluta serenidad. En un sistema que factura energía, ese silencio es el peor comportamiento posible. Los defectos de concurrencia no se descubren probando; se evitan protegiendo el d</w:t>
-      </w:r>
-      <w:r>
-        <w:t>ato desde el diseño.</w:t>
+        <w:t>La tercera conclusión, y quizá la menos intuitiva, tiene que ver con la naturaleza de los errores de concurrencia. Cuando el programa del Ejemplo 6 perdió el 74.9 % de sus operaciones, no se cayó, no lanzó ninguna excepción y no emitió ni una advertencia: simplemente devolvió un número equivocado con absoluta serenidad. En un sistema que factura energía, ese silencio es el peor comportamiento posible. Los defectos de concurrencia no se descubren probando; se evitan protegiendo el dato desde el diseño.</w:t>
       </w:r>
     </w:p>
     <w:p>
@@ -21332,7 +21396,7 @@
         <w:pStyle w:val="Heading2"/>
         <w:spacing w:before="260" w:after="120"/>
       </w:pPr>
-      <w:bookmarkStart w:id="52" w:name="_Toc237016847"/>
+      <w:bookmarkStart w:id="52" w:name="_Toc237017583"/>
       <w:r>
         <w:t>10.1 Recomendaciones</w:t>
       </w:r>
@@ -21416,22 +21480,195 @@
         </w:pBdr>
         <w:spacing w:before="360" w:after="180"/>
       </w:pPr>
-      <w:bookmarkStart w:id="53" w:name="_Toc237016848"/>
-      <w:r>
-        <w:t>11. Fuentes de investigación y bibliografía</w:t>
+      <w:bookmarkStart w:id="53" w:name="_Toc237017584"/>
+      <w:r>
+        <w:t>11. Declaración de originalidad y uso de herramientas</w:t>
       </w:r>
       <w:bookmarkEnd w:id="53"/>
+    </w:p>
+    <w:p>
+      <w:pPr>
+        <w:spacing w:after="120" w:line="276" w:lineRule="auto"/>
+      </w:pPr>
+      <w:r>
+        <w:t>Se deja constancia expresa del origen de cada componente de este trabajo, con el fin de que el facilitador pueda valorarlo con información completa.</w:t>
+      </w:r>
+    </w:p>
+    <w:p>
+      <w:pPr>
+        <w:pStyle w:val="ListParagraph"/>
+        <w:numPr>
+          <w:ilvl w:val="0"/>
+          <w:numId w:val="2"/>
+        </w:numPr>
+        <w:spacing w:after="80" w:line="276" w:lineRule="auto"/>
+      </w:pPr>
+      <w:r>
+        <w:rPr>
+          <w:b/>
+          <w:bCs/>
+        </w:rPr>
+        <w:t xml:space="preserve">Planteamiento y decisiones de diseño. </w:t>
+      </w:r>
+      <w:r>
+        <w:t>La elección del caso práctico, la delimitación del problema en el contexto dominicano y las decisiones de arquitectura —la separación en cinco tareas, la asignación de prioridades y núcleos, el uso de cola, mutex y semáforo, la interpretación de los rangos solapados y la corrección hacia fase partida con respaldo de batería— son propias y el autor las sustenta.</w:t>
+      </w:r>
+    </w:p>
+    <w:p>
+      <w:pPr>
+        <w:pStyle w:val="ListParagraph"/>
+        <w:numPr>
+          <w:ilvl w:val="0"/>
+          <w:numId w:val="2"/>
+        </w:numPr>
+        <w:spacing w:after="80" w:line="276" w:lineRule="auto"/>
+      </w:pPr>
+      <w:r>
+        <w:rPr>
+          <w:b/>
+          <w:bCs/>
+        </w:rPr>
+        <w:t xml:space="preserve">Redacción y codificación. </w:t>
+      </w:r>
+      <w:r>
+        <w:t>La redacción de este documento y la escritura del código se realizaron con asistencia de un modelo de lenguaje (Claude, de Anthropic), empleado como herramienta de apoyo bajo revisión del autor. Todo el contenido fue leído, comprendido y verificado antes de su entrega.</w:t>
+      </w:r>
+    </w:p>
+    <w:p>
+      <w:pPr>
+        <w:pStyle w:val="ListParagraph"/>
+        <w:numPr>
+          <w:ilvl w:val="0"/>
+          <w:numId w:val="2"/>
+        </w:numPr>
+        <w:spacing w:after="80" w:line="276" w:lineRule="auto"/>
+      </w:pPr>
+      <w:r>
+        <w:rPr>
+          <w:b/>
+          <w:bCs/>
+        </w:rPr>
+        <w:t xml:space="preserve">Datos experimentales. </w:t>
+      </w:r>
+      <w:r>
+        <w:t>Las mediciones citadas en la sección 7.6 (aceleración de 7.87× con hilos, 0.99× en trabajo de CPU y 74.9 % de operaciones perdidas sin candado) provienen de la ejecución real del programa concurrencia_comparada.py en el equipo del autor. La salida completa se adjunta en el archivo salida_de_la_corrida.txt del repositorio.</w:t>
+      </w:r>
+    </w:p>
+    <w:p>
+      <w:pPr>
+        <w:pStyle w:val="ListParagraph"/>
+        <w:numPr>
+          <w:ilvl w:val="0"/>
+          <w:numId w:val="2"/>
+        </w:numPr>
+        <w:spacing w:after="80" w:line="276" w:lineRule="auto"/>
+      </w:pPr>
+      <w:r>
+        <w:rPr>
+          <w:b/>
+          <w:bCs/>
+        </w:rPr>
+        <w:t xml:space="preserve">Material de terceros. </w:t>
+      </w:r>
+      <w:r>
+        <w:t>Los videos del Anexo A.2 son obra de sus respectivos autores y canales, y se citan únicamente como apoyo conceptual, tal como admite el enunciado de la asignación. Ningún fragmento de código procede de ellos.</w:t>
+      </w:r>
+    </w:p>
+    <w:p>
+      <w:pPr>
+        <w:pStyle w:val="ListParagraph"/>
+        <w:numPr>
+          <w:ilvl w:val="0"/>
+          <w:numId w:val="2"/>
+        </w:numPr>
+        <w:spacing w:after="80" w:line="276" w:lineRule="auto"/>
+      </w:pPr>
+      <w:r>
+        <w:rPr>
+          <w:b/>
+          <w:bCs/>
+        </w:rPr>
+        <w:t xml:space="preserve">Fuentes bibliográficas. </w:t>
+      </w:r>
+      <w:r>
+        <w:t>Las obras y documentos técnicos de la sección 12 se citan con su autoría y año. Las cifras económicas proceden del Banco Central de la República Dominicana en la fecha indicada.</w:t>
+      </w:r>
+    </w:p>
+    <w:p>
+      <w:pPr>
+        <w:spacing w:after="120" w:line="276" w:lineRule="auto"/>
+      </w:pPr>
+      <w:r>
+        <w:t>El autor declara que no ha reproducido texto de terceros sin atribución y que se encuentra en condiciones de explicar y defender cada decisión técnica contenida en este informe.</w:t>
+      </w:r>
+    </w:p>
+    <w:p>
+      <w:pPr>
+        <w:pBdr>
+          <w:top w:val="single" w:sz="6" w:space="8" w:color="808080"/>
+        </w:pBdr>
+        <w:spacing w:before="500" w:after="60"/>
+        <w:jc w:val="center"/>
+      </w:pPr>
+    </w:p>
+    <w:p>
+      <w:pPr>
+        <w:spacing w:after="40" w:line="276" w:lineRule="auto"/>
+        <w:jc w:val="center"/>
+      </w:pPr>
+      <w:r>
+        <w:rPr>
+          <w:sz w:val="21"/>
+          <w:szCs w:val="21"/>
+        </w:rPr>
+        <w:t>Cristian Carrera  ·  Matrícula 2024-1932</w:t>
+      </w:r>
+    </w:p>
+    <w:p>
+      <w:pPr>
+        <w:spacing w:after="120" w:line="276" w:lineRule="auto"/>
+        <w:jc w:val="center"/>
+      </w:pPr>
+      <w:r>
+        <w:rPr>
+          <w:i/>
+          <w:iCs/>
+          <w:color w:val="666666"/>
+          <w:sz w:val="19"/>
+          <w:szCs w:val="19"/>
+        </w:rPr>
+        <w:t>Santo Domingo, República Dominicana</w:t>
+      </w:r>
+    </w:p>
+    <w:p>
+      <w:r>
+        <w:br w:type="page"/>
+      </w:r>
+    </w:p>
+    <w:p>
+      <w:pPr>
+        <w:pStyle w:val="Heading1"/>
+        <w:pBdr>
+          <w:bottom w:val="single" w:sz="8" w:space="4" w:color="1F3864"/>
+        </w:pBdr>
+        <w:spacing w:before="360" w:after="180"/>
+      </w:pPr>
+      <w:bookmarkStart w:id="54" w:name="_Toc237017585"/>
+      <w:r>
+        <w:t>12. Fuentes de investigación y bibliografía</w:t>
+      </w:r>
+      <w:bookmarkEnd w:id="54"/>
     </w:p>
     <w:p>
       <w:pPr>
         <w:pStyle w:val="Heading2"/>
         <w:spacing w:before="260" w:after="120"/>
       </w:pPr>
-      <w:bookmarkStart w:id="54" w:name="_Toc237016849"/>
-      <w:r>
-        <w:t>11.1 Libros y artículos académicos</w:t>
-      </w:r>
-      <w:bookmarkEnd w:id="54"/>
+      <w:bookmarkStart w:id="55" w:name="_Toc237017586"/>
+      <w:r>
+        <w:t>12.1 Libros y artículos académicos</w:t>
+      </w:r>
+      <w:bookmarkEnd w:id="55"/>
     </w:p>
     <w:p>
       <w:pPr>
@@ -21503,11 +21740,11 @@
         <w:pStyle w:val="Heading2"/>
         <w:spacing w:before="260" w:after="120"/>
       </w:pPr>
-      <w:bookmarkStart w:id="55" w:name="_Toc237016850"/>
-      <w:r>
-        <w:t>11.2 Documentación técnica y normas</w:t>
-      </w:r>
-      <w:bookmarkEnd w:id="55"/>
+      <w:bookmarkStart w:id="56" w:name="_Toc237017587"/>
+      <w:r>
+        <w:t>12.2 Documentación técnica y normas</w:t>
+      </w:r>
+      <w:bookmarkEnd w:id="56"/>
     </w:p>
     <w:p>
       <w:pPr>
@@ -21658,11 +21895,11 @@
         <w:pStyle w:val="Heading2"/>
         <w:spacing w:before="260" w:after="120"/>
       </w:pPr>
-      <w:bookmarkStart w:id="56" w:name="_Toc237016851"/>
-      <w:r>
-        <w:t>11.3 Conferencias y recursos en línea</w:t>
-      </w:r>
-      <w:bookmarkEnd w:id="56"/>
+      <w:bookmarkStart w:id="57" w:name="_Toc237017588"/>
+      <w:r>
+        <w:t>12.3 Conferencias y recursos en línea</w:t>
+      </w:r>
+      <w:bookmarkEnd w:id="57"/>
     </w:p>
     <w:p>
       <w:pPr>
@@ -21730,11 +21967,11 @@
         <w:pStyle w:val="Heading2"/>
         <w:spacing w:before="260" w:after="120"/>
       </w:pPr>
-      <w:bookmarkStart w:id="57" w:name="_Toc237016852"/>
-      <w:r>
-        <w:t>11.4 Fuentes de datos económicos</w:t>
-      </w:r>
-      <w:bookmarkEnd w:id="57"/>
+      <w:bookmarkStart w:id="58" w:name="_Toc237017589"/>
+      <w:r>
+        <w:t>12.4 Fuentes de datos económicos</w:t>
+      </w:r>
+      <w:bookmarkEnd w:id="58"/>
     </w:p>
     <w:p>
       <w:pPr>
@@ -21773,11 +22010,11 @@
         </w:pBdr>
         <w:spacing w:before="360" w:after="180"/>
       </w:pPr>
-      <w:bookmarkStart w:id="58" w:name="_Toc237016853"/>
+      <w:bookmarkStart w:id="59" w:name="_Toc237017590"/>
       <w:r>
         <w:t>Anexo A. Enlaces de acceso al código y a los videos</w:t>
       </w:r>
-      <w:bookmarkEnd w:id="58"/>
+      <w:bookmarkEnd w:id="59"/>
     </w:p>
     <w:p>
       <w:pPr>
@@ -21792,11 +22029,11 @@
         <w:pStyle w:val="Heading2"/>
         <w:spacing w:before="260" w:after="120"/>
       </w:pPr>
-      <w:bookmarkStart w:id="59" w:name="_Toc237016854"/>
+      <w:bookmarkStart w:id="60" w:name="_Toc237017591"/>
       <w:r>
         <w:t>A.1 Código fuente</w:t>
       </w:r>
-      <w:bookmarkEnd w:id="59"/>
+      <w:bookmarkEnd w:id="60"/>
     </w:p>
     <w:p>
       <w:pPr>
@@ -22262,11 +22499,11 @@
         <w:pStyle w:val="Heading2"/>
         <w:spacing w:before="260" w:after="120"/>
       </w:pPr>
-      <w:bookmarkStart w:id="60" w:name="_Toc237016855"/>
+      <w:bookmarkStart w:id="61" w:name="_Toc237017592"/>
       <w:r>
         <w:t>A.2 Material audiovisual de referencia</w:t>
       </w:r>
-      <w:bookmarkEnd w:id="60"/>
+      <w:bookmarkEnd w:id="61"/>
     </w:p>
     <w:p>
       <w:pPr>
@@ -24747,11 +24984,11 @@
         <w:pStyle w:val="Heading2"/>
         <w:spacing w:before="260" w:after="120"/>
       </w:pPr>
-      <w:bookmarkStart w:id="61" w:name="_Toc237016856"/>
+      <w:bookmarkStart w:id="62" w:name="_Toc237017593"/>
       <w:r>
         <w:t>A.3 Qué se entrega</w:t>
       </w:r>
-      <w:bookmarkEnd w:id="61"/>
+      <w:bookmarkEnd w:id="62"/>
     </w:p>
     <w:p>
       <w:pPr>
@@ -24814,11 +25051,11 @@
         <w:pStyle w:val="Heading2"/>
         <w:spacing w:before="260" w:after="120"/>
       </w:pPr>
-      <w:bookmarkStart w:id="62" w:name="_Toc237016857"/>
+      <w:bookmarkStart w:id="63" w:name="_Toc237017594"/>
       <w:r>
         <w:t>Cómo reproducir cada demostración</w:t>
       </w:r>
-      <w:bookmarkEnd w:id="62"/>
+      <w:bookmarkEnd w:id="63"/>
     </w:p>
     <w:p>
       <w:pPr>
@@ -25013,96 +25250,10 @@
 <file path=word/numbering.xml><?xml version="1.0" encoding="utf-8"?>
 <w:numbering xmlns:wpc="http://schemas.microsoft.com/office/word/2010/wordprocessingCanvas" xmlns:cx="http://schemas.microsoft.com/office/drawing/2014/chartex" xmlns:cx1="http://schemas.microsoft.com/office/drawing/2015/9/8/chartex" xmlns:cx2="http://schemas.microsoft.com/office/drawing/2015/10/21/chartex" xmlns:cx3="http://schemas.microsoft.com/office/drawing/2016/5/9/chartex" xmlns:cx4="http://schemas.microsoft.com/office/drawing/2016/5/10/chartex" xmlns:cx5="http://schemas.microsoft.com/office/drawing/2016/5/11/chartex" xmlns:cx6="http://schemas.microsoft.com/office/drawing/2016/5/12/chartex" xmlns:cx7="http://schemas.microsoft.com/office/drawing/2016/5/13/chartex" xmlns:cx8="http://schemas.microsoft.com/office/drawing/2016/5/14/chartex" xmlns:mc="http://schemas.openxmlformats.org/markup-compatibility/2006" xmlns:aink="http://schemas.microsoft.com/office/drawing/2016/ink" xmlns:am3d="http://schemas.microsoft.com/office/drawing/2017/model3d" xmlns:o="urn:schemas-microsoft-com:office:office" xmlns:oel="http://schemas.microsoft.com/office/2019/extlst" xmlns:r="http://schemas.openxmlformats.org/officeDocument/2006/relationships" xmlns:m="http://schemas.openxmlformats.org/officeDocument/2006/math" xmlns:v="urn:schemas-microsoft-com:vml" xmlns:wp14="http://schemas.microsoft.com/office/word/2010/wordprocessingDrawing" xmlns:wp="http://schemas.openxmlformats.org/drawingml/2006/wordprocessingDrawing" xmlns:w10="urn:schemas-microsoft-com:office:word" xmlns:w="http://schemas.openxmlformats.org/wordprocessingml/2006/main" xmlns:w14="http://schemas.microsoft.com/office/word/2010/wordml" xmlns:w15="http://schemas.microsoft.com/office/word/2012/wordml" xmlns:w16cei="http://schemas.microsoft.com/office/word/2026/wordml/cei" xmlns:w16cex="http://schemas.microsoft.com/office/word/2018/wordml/cex" xmlns:w16cid="http://schemas.microsoft.com/office/word/2016/wordml/cid" xmlns:w16="http://schemas.microsoft.com/office/word/2018/wordml" xmlns:w16du="http://schemas.microsoft.com/office/word/2023/wordml/word16du" xmlns:w16sdtdh="http://schemas.microsoft.com/office/word/2020/wordml/sdtdatahash" xmlns:w16sdtfl="http://schemas.microsoft.com/office/word/2024/wordml/sdtformatlock" xmlns:w16se="http://schemas.microsoft.com/office/word/2015/wordml/symex" xmlns:wpg="http://schemas.microsoft.com/office/word/2010/wordprocessingGroup" xmlns:wpi="http://schemas.microsoft.com/office/word/2010/wordprocessingInk" xmlns:wne="http://schemas.microsoft.com/office/word/2006/wordml" xmlns:wps="http://schemas.microsoft.com/office/word/2010/wordprocessingShape" mc:Ignorable="w14 w15 w16se w16cid w16 w16cex w16sdtdh w16sdtfl w16du wp14">
   <w:abstractNum w:abstractNumId="0" w15:restartNumberingAfterBreak="0">
-    <w:nsid w:val="71A801DB"/>
+    <w:nsid w:val="06006EAC"/>
     <w:multiLevelType w:val="hybridMultilevel"/>
-    <w:tmpl w:val="331E850A"/>
-    <w:lvl w:ilvl="0" w:tplc="6C7A236E">
-      <w:start w:val="1"/>
-      <w:numFmt w:val="bullet"/>
-      <w:lvlText w:val="●"/>
-      <w:lvlJc w:val="left"/>
-      <w:pPr>
-        <w:ind w:left="720" w:hanging="360"/>
-      </w:pPr>
-    </w:lvl>
-    <w:lvl w:ilvl="1" w:tplc="BE7C5492">
-      <w:start w:val="1"/>
-      <w:numFmt w:val="bullet"/>
-      <w:lvlText w:val="○"/>
-      <w:lvlJc w:val="left"/>
-      <w:pPr>
-        <w:ind w:left="1440" w:hanging="360"/>
-      </w:pPr>
-    </w:lvl>
-    <w:lvl w:ilvl="2" w:tplc="DE283D5E">
-      <w:start w:val="1"/>
-      <w:numFmt w:val="bullet"/>
-      <w:lvlText w:val="■"/>
-      <w:lvlJc w:val="left"/>
-      <w:pPr>
-        <w:ind w:left="2160" w:hanging="360"/>
-      </w:pPr>
-    </w:lvl>
-    <w:lvl w:ilvl="3" w:tplc="B2EC753E">
-      <w:start w:val="1"/>
-      <w:numFmt w:val="bullet"/>
-      <w:lvlText w:val="●"/>
-      <w:lvlJc w:val="left"/>
-      <w:pPr>
-        <w:ind w:left="2880" w:hanging="360"/>
-      </w:pPr>
-    </w:lvl>
-    <w:lvl w:ilvl="4" w:tplc="438EFABA">
-      <w:start w:val="1"/>
-      <w:numFmt w:val="bullet"/>
-      <w:lvlText w:val="○"/>
-      <w:lvlJc w:val="left"/>
-      <w:pPr>
-        <w:ind w:left="3600" w:hanging="360"/>
-      </w:pPr>
-    </w:lvl>
-    <w:lvl w:ilvl="5" w:tplc="4DE80BB0">
-      <w:start w:val="1"/>
-      <w:numFmt w:val="bullet"/>
-      <w:lvlText w:val="■"/>
-      <w:lvlJc w:val="left"/>
-      <w:pPr>
-        <w:ind w:left="4320" w:hanging="360"/>
-      </w:pPr>
-    </w:lvl>
-    <w:lvl w:ilvl="6" w:tplc="CA189838">
-      <w:start w:val="1"/>
-      <w:numFmt w:val="bullet"/>
-      <w:lvlText w:val="●"/>
-      <w:lvlJc w:val="left"/>
-      <w:pPr>
-        <w:ind w:left="5040" w:hanging="360"/>
-      </w:pPr>
-    </w:lvl>
-    <w:lvl w:ilvl="7" w:tplc="2CCA8D28">
-      <w:start w:val="1"/>
-      <w:numFmt w:val="bullet"/>
-      <w:lvlText w:val="●"/>
-      <w:lvlJc w:val="left"/>
-      <w:pPr>
-        <w:ind w:left="5760" w:hanging="360"/>
-      </w:pPr>
-    </w:lvl>
-    <w:lvl w:ilvl="8" w:tplc="9AEE06F2">
-      <w:start w:val="1"/>
-      <w:numFmt w:val="bullet"/>
-      <w:lvlText w:val="●"/>
-      <w:lvlJc w:val="left"/>
-      <w:pPr>
-        <w:ind w:left="6480" w:hanging="360"/>
-      </w:pPr>
-    </w:lvl>
-  </w:abstractNum>
-  <w:abstractNum w:abstractNumId="1" w15:restartNumberingAfterBreak="0">
-    <w:nsid w:val="7744461D"/>
-    <w:multiLevelType w:val="hybridMultilevel"/>
-    <w:tmpl w:val="F9DE5862"/>
-    <w:lvl w:ilvl="0" w:tplc="2F787614">
+    <w:tmpl w:val="FF3403D6"/>
+    <w:lvl w:ilvl="0" w:tplc="628E65DE">
       <w:start w:val="1"/>
       <w:numFmt w:val="bullet"/>
       <w:lvlText w:val="●"/>
@@ -25116,7 +25267,7 @@
         <w:szCs w:val="16"/>
       </w:rPr>
     </w:lvl>
-    <w:lvl w:ilvl="1" w:tplc="721AD930">
+    <w:lvl w:ilvl="1" w:tplc="52980DCE">
       <w:start w:val="1"/>
       <w:numFmt w:val="bullet"/>
       <w:lvlText w:val="○"/>
@@ -25125,50 +25276,136 @@
         <w:ind w:left="920" w:hanging="260"/>
       </w:pPr>
     </w:lvl>
-    <w:lvl w:ilvl="2" w:tplc="8E049758">
+    <w:lvl w:ilvl="2" w:tplc="E1620244">
       <w:numFmt w:val="decimal"/>
       <w:lvlText w:val=""/>
       <w:lvlJc w:val="left"/>
     </w:lvl>
-    <w:lvl w:ilvl="3" w:tplc="BAE2FAEC">
+    <w:lvl w:ilvl="3" w:tplc="2762512C">
       <w:numFmt w:val="decimal"/>
       <w:lvlText w:val=""/>
       <w:lvlJc w:val="left"/>
     </w:lvl>
-    <w:lvl w:ilvl="4" w:tplc="E19464D6">
+    <w:lvl w:ilvl="4" w:tplc="915A93DE">
       <w:numFmt w:val="decimal"/>
       <w:lvlText w:val=""/>
       <w:lvlJc w:val="left"/>
     </w:lvl>
-    <w:lvl w:ilvl="5" w:tplc="BBFC4712">
+    <w:lvl w:ilvl="5" w:tplc="46861A8C">
       <w:numFmt w:val="decimal"/>
       <w:lvlText w:val=""/>
       <w:lvlJc w:val="left"/>
     </w:lvl>
-    <w:lvl w:ilvl="6" w:tplc="ECB6B102">
+    <w:lvl w:ilvl="6" w:tplc="E9EA4532">
       <w:numFmt w:val="decimal"/>
       <w:lvlText w:val=""/>
       <w:lvlJc w:val="left"/>
     </w:lvl>
-    <w:lvl w:ilvl="7" w:tplc="2FB69FE2">
+    <w:lvl w:ilvl="7" w:tplc="118C7A8A">
       <w:numFmt w:val="decimal"/>
       <w:lvlText w:val=""/>
       <w:lvlJc w:val="left"/>
     </w:lvl>
-    <w:lvl w:ilvl="8" w:tplc="51C08A12">
+    <w:lvl w:ilvl="8" w:tplc="77927E6A">
       <w:numFmt w:val="decimal"/>
       <w:lvlText w:val=""/>
       <w:lvlJc w:val="left"/>
     </w:lvl>
   </w:abstractNum>
-  <w:num w:numId="1" w16cid:durableId="60949598">
-    <w:abstractNumId w:val="0"/>
+  <w:abstractNum w:abstractNumId="1" w15:restartNumberingAfterBreak="0">
+    <w:nsid w:val="32BF0CEC"/>
+    <w:multiLevelType w:val="hybridMultilevel"/>
+    <w:tmpl w:val="47C2423A"/>
+    <w:lvl w:ilvl="0" w:tplc="20E6880C">
+      <w:start w:val="1"/>
+      <w:numFmt w:val="bullet"/>
+      <w:lvlText w:val="●"/>
+      <w:lvlJc w:val="left"/>
+      <w:pPr>
+        <w:ind w:left="720" w:hanging="360"/>
+      </w:pPr>
+    </w:lvl>
+    <w:lvl w:ilvl="1" w:tplc="DC08B284">
+      <w:start w:val="1"/>
+      <w:numFmt w:val="bullet"/>
+      <w:lvlText w:val="○"/>
+      <w:lvlJc w:val="left"/>
+      <w:pPr>
+        <w:ind w:left="1440" w:hanging="360"/>
+      </w:pPr>
+    </w:lvl>
+    <w:lvl w:ilvl="2" w:tplc="221016F2">
+      <w:start w:val="1"/>
+      <w:numFmt w:val="bullet"/>
+      <w:lvlText w:val="■"/>
+      <w:lvlJc w:val="left"/>
+      <w:pPr>
+        <w:ind w:left="2160" w:hanging="360"/>
+      </w:pPr>
+    </w:lvl>
+    <w:lvl w:ilvl="3" w:tplc="9E70CD86">
+      <w:start w:val="1"/>
+      <w:numFmt w:val="bullet"/>
+      <w:lvlText w:val="●"/>
+      <w:lvlJc w:val="left"/>
+      <w:pPr>
+        <w:ind w:left="2880" w:hanging="360"/>
+      </w:pPr>
+    </w:lvl>
+    <w:lvl w:ilvl="4" w:tplc="153C1EB8">
+      <w:start w:val="1"/>
+      <w:numFmt w:val="bullet"/>
+      <w:lvlText w:val="○"/>
+      <w:lvlJc w:val="left"/>
+      <w:pPr>
+        <w:ind w:left="3600" w:hanging="360"/>
+      </w:pPr>
+    </w:lvl>
+    <w:lvl w:ilvl="5" w:tplc="E690A97E">
+      <w:start w:val="1"/>
+      <w:numFmt w:val="bullet"/>
+      <w:lvlText w:val="■"/>
+      <w:lvlJc w:val="left"/>
+      <w:pPr>
+        <w:ind w:left="4320" w:hanging="360"/>
+      </w:pPr>
+    </w:lvl>
+    <w:lvl w:ilvl="6" w:tplc="D742ADEA">
+      <w:start w:val="1"/>
+      <w:numFmt w:val="bullet"/>
+      <w:lvlText w:val="●"/>
+      <w:lvlJc w:val="left"/>
+      <w:pPr>
+        <w:ind w:left="5040" w:hanging="360"/>
+      </w:pPr>
+    </w:lvl>
+    <w:lvl w:ilvl="7" w:tplc="88083ECA">
+      <w:start w:val="1"/>
+      <w:numFmt w:val="bullet"/>
+      <w:lvlText w:val="●"/>
+      <w:lvlJc w:val="left"/>
+      <w:pPr>
+        <w:ind w:left="5760" w:hanging="360"/>
+      </w:pPr>
+    </w:lvl>
+    <w:lvl w:ilvl="8" w:tplc="4AA2A476">
+      <w:start w:val="1"/>
+      <w:numFmt w:val="bullet"/>
+      <w:lvlText w:val="●"/>
+      <w:lvlJc w:val="left"/>
+      <w:pPr>
+        <w:ind w:left="6480" w:hanging="360"/>
+      </w:pPr>
+    </w:lvl>
+  </w:abstractNum>
+  <w:num w:numId="1" w16cid:durableId="1498350317">
+    <w:abstractNumId w:val="1"/>
     <w:lvlOverride w:ilvl="0">
       <w:startOverride w:val="1"/>
     </w:lvlOverride>
   </w:num>
-  <w:num w:numId="2" w16cid:durableId="1763792411">
-    <w:abstractNumId w:val="1"/>
+  <w:num w:numId="2" w16cid:durableId="1920670653">
+    <w:abstractNumId w:val="0"/>
     <w:lvlOverride w:ilvl="0">
       <w:startOverride w:val="1"/>
     </w:lvlOverride>
@@ -25784,7 +26021,7 @@
     <w:autoRedefine/>
     <w:uiPriority w:val="39"/>
     <w:unhideWhenUsed/>
-    <w:rsid w:val="00F802D4"/>
+    <w:rsid w:val="0034318D"/>
     <w:pPr>
       <w:spacing w:after="100"/>
     </w:pPr>
@@ -25796,7 +26033,7 @@
     <w:autoRedefine/>
     <w:uiPriority w:val="39"/>
     <w:unhideWhenUsed/>
-    <w:rsid w:val="00F802D4"/>
+    <w:rsid w:val="0034318D"/>
     <w:pPr>
       <w:spacing w:after="100"/>
       <w:ind w:left="220"/>
@@ -25809,7 +26046,7 @@
     <w:autoRedefine/>
     <w:uiPriority w:val="39"/>
     <w:unhideWhenUsed/>
-    <w:rsid w:val="00F802D4"/>
+    <w:rsid w:val="0034318D"/>
     <w:pPr>
       <w:spacing w:after="100"/>
       <w:ind w:left="440"/>

</xml_diff>